<commit_message>
Tighten pro forma sheet to two pages; simplify OC chart labels
Drop the perfect-venue tiles, fix market graphic label overlap, add
thin dividers in top-line projections, bold key words in expenses.

Co-Authored-By: Claude Fable 5.1 <noreply@anthropic.com>
Claude-Session: https://claude.ai/code/session_01H1o2hAHLKnaHhCBRW9ndXv
</commit_message>
<xml_diff>
--- a/docs/proforma-cheatsheet/Pro Forma Sheet.docx
+++ b/docs/proforma-cheatsheet/Pro Forma Sheet.docx
@@ -15,8 +15,8 @@
           <w:i w:val="false"/>
           <w:iCs w:val="false"/>
           <w:color w:val="0B0B0B"/>
-          <w:sz w:val="52"/>
-          <w:szCs w:val="52"/>
+          <w:sz w:val="40"/>
+          <w:szCs w:val="40"/>
         </w:rPr>
         <w:t xml:space="preserve">Pro Forma Sheet</w:t>
       </w:r>
@@ -39,12 +39,6 @@
         </w:rPr>
         <w:t xml:space="preserve">Walters Hospitality</w:t>
       </w:r>
-    </w:p>
-    <w:p>
-      <w:pPr>
-        <w:spacing w:after="120" w:before="0" w:line="264"/>
-        <w:jc w:val="left"/>
-      </w:pPr>
       <w:r>
         <w:rPr>
           <w:rFonts w:ascii="Calibri" w:cs="Calibri" w:eastAsia="Calibri" w:hAnsi="Calibri"/>
@@ -53,10 +47,10 @@
           <w:i w:val="false"/>
           <w:iCs w:val="false"/>
           <w:color w:val="52514E"/>
-          <w:sz w:val="26"/>
-          <w:szCs w:val="26"/>
-        </w:rPr>
-        <w:t xml:space="preserve">Part 1: Pre-LOI</w:t>
+          <w:sz w:val="22"/>
+          <w:szCs w:val="22"/>
+        </w:rPr>
+        <w:t xml:space="preserve">   |   Part 1: Pre-LOI</w:t>
       </w:r>
     </w:p>
     <w:p>
@@ -65,7 +59,7 @@
         <w:pBdr>
           <w:bottom w:val="single" w:color="1A939B" w:sz="12" w:space="4"/>
         </w:pBdr>
-        <w:spacing w:after="100" w:before="240"/>
+        <w:spacing w:after="70" w:before="140"/>
       </w:pPr>
       <w:r>
         <w:rPr>
@@ -111,9 +105,9 @@
             </w:tcBorders>
             <w:shd w:fill="EFF6F9" w:color="auto" w:val="clear"/>
             <w:tcMar>
-              <w:top w:type="dxa" w:w="120"/>
+              <w:top w:type="dxa" w:w="100"/>
               <w:left w:type="dxa" w:w="140"/>
-              <w:bottom w:type="dxa" w:w="120"/>
+              <w:bottom w:type="dxa" w:w="100"/>
               <w:right w:type="dxa" w:w="140"/>
             </w:tcMar>
           </w:tcPr>
@@ -186,9 +180,9 @@
             </w:tcBorders>
             <w:shd w:fill="EFF6F9" w:color="auto" w:val="clear"/>
             <w:tcMar>
-              <w:top w:type="dxa" w:w="120"/>
+              <w:top w:type="dxa" w:w="100"/>
               <w:left w:type="dxa" w:w="140"/>
-              <w:bottom w:type="dxa" w:w="120"/>
+              <w:bottom w:type="dxa" w:w="100"/>
               <w:right w:type="dxa" w:w="140"/>
             </w:tcMar>
           </w:tcPr>
@@ -227,7 +221,7 @@
                 <w:sz w:val="18"/>
                 <w:szCs w:val="18"/>
               </w:rPr>
-              <w:t xml:space="preserve">Already doing well</w:t>
+              <w:t xml:space="preserve">Established, strong performer</w:t>
             </w:r>
           </w:p>
           <w:p>
@@ -246,7 +240,7 @@
                 <w:sz w:val="18"/>
                 <w:szCs w:val="18"/>
               </w:rPr>
-              <w:t xml:space="preserve">Growth opportunity</w:t>
+              <w:t xml:space="preserve">Upside we can unlock</w:t>
             </w:r>
           </w:p>
         </w:tc>
@@ -261,9 +255,9 @@
             </w:tcBorders>
             <w:shd w:fill="EFF6F9" w:color="auto" w:val="clear"/>
             <w:tcMar>
-              <w:top w:type="dxa" w:w="120"/>
+              <w:top w:type="dxa" w:w="100"/>
               <w:left w:type="dxa" w:w="140"/>
-              <w:bottom w:type="dxa" w:w="120"/>
+              <w:bottom w:type="dxa" w:w="100"/>
               <w:right w:type="dxa" w:w="140"/>
             </w:tcMar>
           </w:tcPr>
@@ -302,7 +296,7 @@
                 <w:sz w:val="18"/>
                 <w:szCs w:val="18"/>
               </w:rPr>
-              <w:t xml:space="preserve">What they do today vs. what we implement, and how fast</w:t>
+              <w:t xml:space="preserve">What they offer today vs. what we bring, and how fast</w:t>
             </w:r>
           </w:p>
           <w:p>
@@ -321,7 +315,7 @@
                 <w:sz w:val="18"/>
                 <w:szCs w:val="18"/>
               </w:rPr>
-              <w:t xml:space="preserve">Our marketing to fill events</w:t>
+              <w:t xml:space="preserve">Our marketing to drive bookings</w:t>
             </w:r>
           </w:p>
         </w:tc>
@@ -336,9 +330,9 @@
             </w:tcBorders>
             <w:shd w:fill="EFF6F9" w:color="auto" w:val="clear"/>
             <w:tcMar>
-              <w:top w:type="dxa" w:w="120"/>
+              <w:top w:type="dxa" w:w="100"/>
               <w:left w:type="dxa" w:w="140"/>
-              <w:bottom w:type="dxa" w:w="120"/>
+              <w:bottom w:type="dxa" w:w="100"/>
               <w:right w:type="dxa" w:w="140"/>
             </w:tcMar>
           </w:tcPr>
@@ -396,7 +390,7 @@
                 <w:sz w:val="18"/>
                 <w:szCs w:val="18"/>
               </w:rPr>
-              <w:t xml:space="preserve">Owner involved or hands-off?</w:t>
+              <w:t xml:space="preserve">Owner hands-on or hands-off?</w:t>
             </w:r>
           </w:p>
         </w:tc>
@@ -408,7 +402,7 @@
         <w:pBdr>
           <w:bottom w:val="single" w:color="1A939B" w:sz="12" w:space="4"/>
         </w:pBdr>
-        <w:spacing w:after="100" w:before="240"/>
+        <w:spacing w:after="70" w:before="140"/>
       </w:pPr>
       <w:r>
         <w:rPr>
@@ -426,13 +420,13 @@
     </w:p>
     <w:p>
       <w:pPr>
-        <w:spacing w:after="60" w:before="60"/>
+        <w:spacing w:after="30" w:before="30"/>
         <w:jc w:val="center"/>
       </w:pPr>
       <w:r>
         <w:drawing>
           <wp:inline distT="0" distB="0" distL="0" distR="0">
-            <wp:extent cx="5848350" cy="2371725"/>
+            <wp:extent cx="4019550" cy="1457325"/>
             <wp:effectExtent t="0" r="0" b="0" l="0"/>
             <wp:docPr id="1" name="" descr="" title=""/>
             <wp:cNvGraphicFramePr>
@@ -457,7 +451,7 @@
                   <pic:spPr bwMode="auto">
                     <a:xfrm>
                       <a:off x="0" y="0"/>
-                      <a:ext cx="5848350" cy="2371725"/>
+                      <a:ext cx="4019550" cy="1457325"/>
                     </a:xfrm>
                     <a:prstGeom prst="rect">
                       <a:avLst/>
@@ -498,9 +492,9 @@
             </w:tcBorders>
             <w:shd w:fill="EFF6F9" w:color="auto" w:val="clear"/>
             <w:tcMar>
-              <w:top w:type="dxa" w:w="80"/>
+              <w:top w:type="dxa" w:w="60"/>
               <w:left w:type="dxa" w:w="140"/>
-              <w:bottom w:type="dxa" w:w="80"/>
+              <w:bottom w:type="dxa" w:w="60"/>
               <w:right w:type="dxa" w:w="140"/>
             </w:tcMar>
           </w:tcPr>
@@ -535,9 +529,9 @@
             </w:tcBorders>
             <w:shd w:fill="F7F7F5" w:color="auto" w:val="clear"/>
             <w:tcMar>
-              <w:top w:type="dxa" w:w="80"/>
+              <w:top w:type="dxa" w:w="60"/>
               <w:left w:type="dxa" w:w="140"/>
-              <w:bottom w:type="dxa" w:w="80"/>
+              <w:bottom w:type="dxa" w:w="60"/>
               <w:right w:type="dxa" w:w="140"/>
             </w:tcMar>
           </w:tcPr>
@@ -574,9 +568,9 @@
             </w:tcBorders>
             <w:shd w:fill="EFF6F9" w:color="auto" w:val="clear"/>
             <w:tcMar>
-              <w:top w:type="dxa" w:w="80"/>
+              <w:top w:type="dxa" w:w="60"/>
               <w:left w:type="dxa" w:w="140"/>
-              <w:bottom w:type="dxa" w:w="80"/>
+              <w:bottom w:type="dxa" w:w="60"/>
               <w:right w:type="dxa" w:w="140"/>
             </w:tcMar>
           </w:tcPr>
@@ -611,9 +605,9 @@
             </w:tcBorders>
             <w:shd w:fill="F7F7F5" w:color="auto" w:val="clear"/>
             <w:tcMar>
-              <w:top w:type="dxa" w:w="80"/>
+              <w:top w:type="dxa" w:w="60"/>
               <w:left w:type="dxa" w:w="140"/>
-              <w:bottom w:type="dxa" w:w="80"/>
+              <w:bottom w:type="dxa" w:w="60"/>
               <w:right w:type="dxa" w:w="140"/>
             </w:tcMar>
           </w:tcPr>
@@ -633,7 +627,7 @@
                 <w:sz w:val="20"/>
                 <w:szCs w:val="20"/>
               </w:rPr>
-              <w:t xml:space="preserve">Original Contract events; booked before close. Mostly Year 1, some Year 2, rarely Year 3. We want a healthy number; a year only holds so many.</w:t>
+              <w:t xml:space="preserve">Original Contract events; booked before we close. We want a healthy count; a year only holds so many.</w:t>
             </w:r>
           </w:p>
         </w:tc>
@@ -650,9 +644,9 @@
             </w:tcBorders>
             <w:shd w:fill="EFF6F9" w:color="auto" w:val="clear"/>
             <w:tcMar>
-              <w:top w:type="dxa" w:w="80"/>
+              <w:top w:type="dxa" w:w="60"/>
               <w:left w:type="dxa" w:w="140"/>
-              <w:bottom w:type="dxa" w:w="80"/>
+              <w:bottom w:type="dxa" w:w="60"/>
               <w:right w:type="dxa" w:w="140"/>
             </w:tcMar>
           </w:tcPr>
@@ -687,9 +681,9 @@
             </w:tcBorders>
             <w:shd w:fill="F7F7F5" w:color="auto" w:val="clear"/>
             <w:tcMar>
-              <w:top w:type="dxa" w:w="80"/>
+              <w:top w:type="dxa" w:w="60"/>
               <w:left w:type="dxa" w:w="140"/>
-              <w:bottom w:type="dxa" w:w="80"/>
+              <w:bottom w:type="dxa" w:w="60"/>
               <w:right w:type="dxa" w:w="140"/>
             </w:tcMar>
           </w:tcPr>
@@ -709,24 +703,19 @@
                 <w:sz w:val="20"/>
                 <w:szCs w:val="20"/>
               </w:rPr>
-              <w:t xml:space="preserve">Events we assume will book after close; they can land in Year 1, 2 or 3.</w:t>
+              <w:t xml:space="preserve">Events we assume will book after close; they can fall in Year 1, 2 or 3.</w:t>
             </w:r>
           </w:p>
         </w:tc>
       </w:tr>
     </w:tbl>
-    <w:p>
-      <w:r>
-        <w:br w:type="page"/>
-      </w:r>
-    </w:p>
     <w:p>
       <w:pPr>
         <w:pStyle w:val="Heading1"/>
         <w:pBdr>
           <w:bottom w:val="single" w:color="1A939B" w:sz="12" w:space="4"/>
         </w:pBdr>
-        <w:spacing w:after="100" w:before="240"/>
+        <w:spacing w:after="70" w:before="140"/>
       </w:pPr>
       <w:r>
         <w:rPr>
@@ -744,13 +733,13 @@
     </w:p>
     <w:p>
       <w:pPr>
-        <w:spacing w:after="60" w:before="60"/>
+        <w:spacing w:after="30" w:before="30"/>
         <w:jc w:val="center"/>
       </w:pPr>
       <w:r>
         <w:drawing>
           <wp:inline distT="0" distB="0" distL="0" distR="0">
-            <wp:extent cx="5124450" cy="2543175"/>
+            <wp:extent cx="3752850" cy="1819275"/>
             <wp:effectExtent t="0" r="0" b="0" l="0"/>
             <wp:docPr id="1" name="" descr="" title=""/>
             <wp:cNvGraphicFramePr>
@@ -775,7 +764,7 @@
                   <pic:spPr bwMode="auto">
                     <a:xfrm>
                       <a:off x="0" y="0"/>
-                      <a:ext cx="5124450" cy="2543175"/>
+                      <a:ext cx="3752850" cy="1819275"/>
                     </a:xfrm>
                     <a:prstGeom prst="rect">
                       <a:avLst/>
@@ -816,9 +805,9 @@
             </w:tcBorders>
             <w:shd w:fill="EFF6F9" w:color="auto" w:val="clear"/>
             <w:tcMar>
-              <w:top w:type="dxa" w:w="80"/>
+              <w:top w:type="dxa" w:w="60"/>
               <w:left w:type="dxa" w:w="140"/>
-              <w:bottom w:type="dxa" w:w="80"/>
+              <w:bottom w:type="dxa" w:w="60"/>
               <w:right w:type="dxa" w:w="140"/>
             </w:tcMar>
           </w:tcPr>
@@ -853,9 +842,9 @@
             </w:tcBorders>
             <w:shd w:fill="F7F7F5" w:color="auto" w:val="clear"/>
             <w:tcMar>
-              <w:top w:type="dxa" w:w="80"/>
+              <w:top w:type="dxa" w:w="60"/>
               <w:left w:type="dxa" w:w="140"/>
-              <w:bottom w:type="dxa" w:w="80"/>
+              <w:bottom w:type="dxa" w:w="60"/>
               <w:right w:type="dxa" w:w="140"/>
             </w:tcMar>
           </w:tcPr>
@@ -911,9 +900,9 @@
             </w:tcBorders>
             <w:shd w:fill="EFF6F9" w:color="auto" w:val="clear"/>
             <w:tcMar>
-              <w:top w:type="dxa" w:w="80"/>
+              <w:top w:type="dxa" w:w="60"/>
               <w:left w:type="dxa" w:w="140"/>
-              <w:bottom w:type="dxa" w:w="80"/>
+              <w:bottom w:type="dxa" w:w="60"/>
               <w:right w:type="dxa" w:w="140"/>
             </w:tcMar>
           </w:tcPr>
@@ -948,9 +937,9 @@
             </w:tcBorders>
             <w:shd w:fill="F7F7F5" w:color="auto" w:val="clear"/>
             <w:tcMar>
-              <w:top w:type="dxa" w:w="80"/>
+              <w:top w:type="dxa" w:w="60"/>
               <w:left w:type="dxa" w:w="140"/>
-              <w:bottom w:type="dxa" w:w="80"/>
+              <w:bottom w:type="dxa" w:w="60"/>
               <w:right w:type="dxa" w:w="140"/>
             </w:tcMar>
           </w:tcPr>
@@ -970,7 +959,7 @@
                 <w:sz w:val="20"/>
                 <w:szCs w:val="20"/>
               </w:rPr>
-              <w:t xml:space="preserve">In the broader region; likely grouped operationally with it.</w:t>
+              <w:t xml:space="preserve">Part of the broader region; likely grouped operationally with it.</w:t>
             </w:r>
           </w:p>
           <w:p>
@@ -1008,7 +997,7 @@
                 <w:sz w:val="20"/>
                 <w:szCs w:val="20"/>
               </w:rPr>
-              <w:t xml:space="preserve">Question: do we grow that direction and open hubs that can service it?</w:t>
+              <w:t xml:space="preserve">Open question: do we grow that direction and add hubs to serve it?</w:t>
             </w:r>
           </w:p>
         </w:tc>
@@ -1025,9 +1014,9 @@
             </w:tcBorders>
             <w:shd w:fill="EFF6F9" w:color="auto" w:val="clear"/>
             <w:tcMar>
-              <w:top w:type="dxa" w:w="80"/>
+              <w:top w:type="dxa" w:w="60"/>
               <w:left w:type="dxa" w:w="140"/>
-              <w:bottom w:type="dxa" w:w="80"/>
+              <w:bottom w:type="dxa" w:w="60"/>
               <w:right w:type="dxa" w:w="140"/>
             </w:tcMar>
           </w:tcPr>
@@ -1062,9 +1051,9 @@
             </w:tcBorders>
             <w:shd w:fill="F7F7F5" w:color="auto" w:val="clear"/>
             <w:tcMar>
-              <w:top w:type="dxa" w:w="80"/>
+              <w:top w:type="dxa" w:w="60"/>
               <w:left w:type="dxa" w:w="140"/>
-              <w:bottom w:type="dxa" w:w="80"/>
+              <w:bottom w:type="dxa" w:w="60"/>
               <w:right w:type="dxa" w:w="140"/>
             </w:tcMar>
           </w:tcPr>
@@ -1084,7 +1073,7 @@
                 <w:sz w:val="20"/>
                 <w:szCs w:val="20"/>
               </w:rPr>
-              <w:t xml:space="preserve">Venue must stand on its own.</w:t>
+              <w:t xml:space="preserve">The venue has to carry itself.</w:t>
             </w:r>
           </w:p>
           <w:p>
@@ -1111,7 +1100,239 @@
     </w:tbl>
     <w:p>
       <w:pPr>
-        <w:spacing w:after="80" w:before="0"/>
+        <w:pStyle w:val="Heading1"/>
+        <w:pBdr>
+          <w:bottom w:val="single" w:color="1A939B" w:sz="12" w:space="4"/>
+        </w:pBdr>
+        <w:spacing w:after="70" w:before="140"/>
+      </w:pPr>
+      <w:r>
+        <w:rPr>
+          <w:rFonts w:ascii="Calibri" w:cs="Calibri" w:eastAsia="Calibri" w:hAnsi="Calibri"/>
+          <w:b/>
+          <w:bCs/>
+          <w:i w:val="false"/>
+          <w:iCs w:val="false"/>
+          <w:color w:val="1A939B"/>
+          <w:sz w:val="30"/>
+          <w:szCs w:val="30"/>
+        </w:rPr>
+        <w:t xml:space="preserve">4. Top-Line Projections</w:t>
+      </w:r>
+    </w:p>
+    <w:p>
+      <w:pPr>
+        <w:spacing w:after="40" w:before="60" w:line="264"/>
+        <w:jc w:val="left"/>
+      </w:pPr>
+      <w:r>
+        <w:rPr>
+          <w:rFonts w:ascii="Calibri" w:cs="Calibri" w:eastAsia="Calibri" w:hAnsi="Calibri"/>
+          <w:b/>
+          <w:bCs/>
+          <w:i w:val="false"/>
+          <w:iCs w:val="false"/>
+          <w:color w:val="1A939B"/>
+          <w:sz w:val="23"/>
+          <w:szCs w:val="23"/>
+        </w:rPr>
+        <w:t xml:space="preserve">Events</w:t>
+      </w:r>
+    </w:p>
+    <w:p>
+      <w:pPr>
+        <w:pStyle w:val="ListParagraph"/>
+        <w:numPr>
+          <w:ilvl w:val="0"/>
+          <w:numId w:val="2"/>
+        </w:numPr>
+        <w:spacing w:after="30" w:before="0" w:line="248"/>
+      </w:pPr>
+      <w:r>
+        <w:rPr>
+          <w:rFonts w:ascii="Calibri" w:cs="Calibri" w:eastAsia="Calibri" w:hAnsi="Calibri"/>
+          <w:b w:val="false"/>
+          <w:bCs w:val="false"/>
+          <w:i w:val="false"/>
+          <w:iCs w:val="false"/>
+          <w:color w:val="0B0B0B"/>
+          <w:sz w:val="19"/>
+          <w:szCs w:val="19"/>
+        </w:rPr>
+        <w:t xml:space="preserve">Historical average per year</w:t>
+      </w:r>
+    </w:p>
+    <w:p>
+      <w:pPr>
+        <w:pStyle w:val="ListParagraph"/>
+        <w:numPr>
+          <w:ilvl w:val="0"/>
+          <w:numId w:val="2"/>
+        </w:numPr>
+        <w:spacing w:after="30" w:before="0" w:line="248"/>
+      </w:pPr>
+      <w:r>
+        <w:rPr>
+          <w:rFonts w:ascii="Calibri" w:cs="Calibri" w:eastAsia="Calibri" w:hAnsi="Calibri"/>
+          <w:b w:val="false"/>
+          <w:bCs w:val="false"/>
+          <w:i w:val="false"/>
+          <w:iCs w:val="false"/>
+          <w:color w:val="0B0B0B"/>
+          <w:sz w:val="19"/>
+          <w:szCs w:val="19"/>
+        </w:rPr>
+        <w:t xml:space="preserve">Last 12 months</w:t>
+      </w:r>
+    </w:p>
+    <w:p>
+      <w:pPr>
+        <w:pStyle w:val="ListParagraph"/>
+        <w:numPr>
+          <w:ilvl w:val="0"/>
+          <w:numId w:val="2"/>
+        </w:numPr>
+        <w:spacing w:after="30" w:before="0" w:line="248"/>
+      </w:pPr>
+      <w:r>
+        <w:rPr>
+          <w:rFonts w:ascii="Calibri" w:cs="Calibri" w:eastAsia="Calibri" w:hAnsi="Calibri"/>
+          <w:b w:val="false"/>
+          <w:bCs w:val="false"/>
+          <w:i w:val="false"/>
+          <w:iCs w:val="false"/>
+          <w:color w:val="0B0B0B"/>
+          <w:sz w:val="19"/>
+          <w:szCs w:val="19"/>
+        </w:rPr>
+        <w:t xml:space="preserve">Booked for the next 12 months</w:t>
+      </w:r>
+    </w:p>
+    <w:p>
+      <w:pPr>
+        <w:pBdr>
+          <w:bottom w:val="single" w:color="B7DCDF" w:sz="4" w:space="1"/>
+        </w:pBdr>
+        <w:spacing w:after="40" w:before="30"/>
+      </w:pPr>
+    </w:p>
+    <w:p>
+      <w:pPr>
+        <w:spacing w:after="40" w:before="60" w:line="264"/>
+        <w:jc w:val="left"/>
+      </w:pPr>
+      <w:r>
+        <w:rPr>
+          <w:rFonts w:ascii="Calibri" w:cs="Calibri" w:eastAsia="Calibri" w:hAnsi="Calibri"/>
+          <w:b/>
+          <w:bCs/>
+          <w:i w:val="false"/>
+          <w:iCs w:val="false"/>
+          <w:color w:val="1A939B"/>
+          <w:sz w:val="23"/>
+          <w:szCs w:val="23"/>
+        </w:rPr>
+        <w:t xml:space="preserve">Revenue / Vendor Services</w:t>
+      </w:r>
+    </w:p>
+    <w:p>
+      <w:pPr>
+        <w:pStyle w:val="ListParagraph"/>
+        <w:numPr>
+          <w:ilvl w:val="0"/>
+          <w:numId w:val="2"/>
+        </w:numPr>
+        <w:spacing w:after="30" w:before="0" w:line="248"/>
+      </w:pPr>
+      <w:r>
+        <w:rPr>
+          <w:rFonts w:ascii="Calibri" w:cs="Calibri" w:eastAsia="Calibri" w:hAnsi="Calibri"/>
+          <w:b w:val="false"/>
+          <w:bCs w:val="false"/>
+          <w:i w:val="false"/>
+          <w:iCs w:val="false"/>
+          <w:color w:val="0B0B0B"/>
+          <w:sz w:val="19"/>
+          <w:szCs w:val="19"/>
+        </w:rPr>
+        <w:t xml:space="preserve">Photography / DJ / Stationery: quick to implement</w:t>
+      </w:r>
+    </w:p>
+    <w:p>
+      <w:pPr>
+        <w:pStyle w:val="ListParagraph"/>
+        <w:numPr>
+          <w:ilvl w:val="0"/>
+          <w:numId w:val="2"/>
+        </w:numPr>
+        <w:spacing w:after="30" w:before="0" w:line="248"/>
+      </w:pPr>
+      <w:r>
+        <w:rPr>
+          <w:rFonts w:ascii="Calibri" w:cs="Calibri" w:eastAsia="Calibri" w:hAnsi="Calibri"/>
+          <w:b w:val="false"/>
+          <w:bCs w:val="false"/>
+          <w:i w:val="false"/>
+          <w:iCs w:val="false"/>
+          <w:color w:val="0B0B0B"/>
+          <w:sz w:val="19"/>
+          <w:szCs w:val="19"/>
+        </w:rPr>
+        <w:t xml:space="preserve">Bar: on/off switch once we hold the liquor license</w:t>
+      </w:r>
+    </w:p>
+    <w:p>
+      <w:pPr>
+        <w:pStyle w:val="ListParagraph"/>
+        <w:numPr>
+          <w:ilvl w:val="0"/>
+          <w:numId w:val="2"/>
+        </w:numPr>
+        <w:spacing w:after="30" w:before="0" w:line="248"/>
+      </w:pPr>
+      <w:r>
+        <w:rPr>
+          <w:rFonts w:ascii="Calibri" w:cs="Calibri" w:eastAsia="Calibri" w:hAnsi="Calibri"/>
+          <w:b w:val="false"/>
+          <w:bCs w:val="false"/>
+          <w:i w:val="false"/>
+          <w:iCs w:val="false"/>
+          <w:color w:val="0B0B0B"/>
+          <w:sz w:val="19"/>
+          <w:szCs w:val="19"/>
+        </w:rPr>
+        <w:t xml:space="preserve">Catering: attach gradually; test it</w:t>
+      </w:r>
+    </w:p>
+    <w:p>
+      <w:pPr>
+        <w:pStyle w:val="ListParagraph"/>
+        <w:numPr>
+          <w:ilvl w:val="0"/>
+          <w:numId w:val="2"/>
+        </w:numPr>
+        <w:spacing w:after="30" w:before="0" w:line="248"/>
+      </w:pPr>
+      <w:r>
+        <w:rPr>
+          <w:rFonts w:ascii="Calibri" w:cs="Calibri" w:eastAsia="Calibri" w:hAnsi="Calibri"/>
+          <w:b w:val="false"/>
+          <w:bCs w:val="false"/>
+          <w:i w:val="false"/>
+          <w:iCs w:val="false"/>
+          <w:color w:val="0B0B0B"/>
+          <w:sz w:val="19"/>
+          <w:szCs w:val="19"/>
+        </w:rPr>
+        <w:t xml:space="preserve">Floral / Bakery: depends on hub distance</w:t>
+      </w:r>
+    </w:p>
+    <w:p>
+      <w:pPr>
+        <w:pBdr>
+          <w:bottom w:val="single" w:color="B7DCDF" w:sz="4" w:space="1"/>
+        </w:pBdr>
+        <w:spacing w:after="40" w:before="30"/>
       </w:pPr>
     </w:p>
     <w:p>
@@ -1130,7 +1351,240 @@
           <w:sz w:val="20"/>
           <w:szCs w:val="20"/>
         </w:rPr>
-        <w:t xml:space="preserve">The perfect new-market venue</w:t>
+        <w:t xml:space="preserve">Attachment ramp-up</w:t>
+      </w:r>
+    </w:p>
+    <w:p>
+      <w:pPr>
+        <w:spacing w:after="40" w:before="0" w:line="264"/>
+        <w:jc w:val="left"/>
+      </w:pPr>
+      <w:r>
+        <w:rPr>
+          <w:rFonts w:ascii="Calibri" w:cs="Calibri" w:eastAsia="Calibri" w:hAnsi="Calibri"/>
+          <w:b w:val="false"/>
+          <w:bCs w:val="false"/>
+          <w:i w:val="false"/>
+          <w:iCs w:val="false"/>
+          <w:color w:val="52514E"/>
+          <w:sz w:val="19"/>
+          <w:szCs w:val="19"/>
+        </w:rPr>
+        <w:t xml:space="preserve">Our typical assumption: ramp to the Walters average attachment by Year 3, adjusted for the venue.</w:t>
+      </w:r>
+    </w:p>
+    <w:p>
+      <w:pPr>
+        <w:spacing w:after="30" w:before="30"/>
+        <w:jc w:val="center"/>
+      </w:pPr>
+      <w:r>
+        <w:drawing>
+          <wp:inline distT="0" distB="0" distL="0" distR="0">
+            <wp:extent cx="4848225" cy="2076450"/>
+            <wp:effectExtent t="0" r="0" b="0" l="0"/>
+            <wp:docPr id="1" name="" descr="" title=""/>
+            <wp:cNvGraphicFramePr>
+              <a:graphicFrameLocks xmlns:a="http://schemas.openxmlformats.org/drawingml/2006/main" noChangeAspect="1"/>
+            </wp:cNvGraphicFramePr>
+            <a:graphic xmlns:a="http://schemas.openxmlformats.org/drawingml/2006/main">
+              <a:graphicData uri="http://schemas.openxmlformats.org/drawingml/2006/picture">
+                <pic:pic xmlns:pic="http://schemas.openxmlformats.org/drawingml/2006/picture">
+                  <pic:nvPicPr>
+                    <pic:cNvPr id="0" name="" descr=""/>
+                    <pic:cNvPicPr>
+                      <a:picLocks noChangeAspect="1" noChangeArrowheads="1"/>
+                    </pic:cNvPicPr>
+                  </pic:nvPicPr>
+                  <pic:blipFill>
+                    <a:blip r:embed="rId9" cstate="none"/>
+                    <a:srcRect/>
+                    <a:stretch>
+                      <a:fillRect/>
+                    </a:stretch>
+                  </pic:blipFill>
+                  <pic:spPr bwMode="auto">
+                    <a:xfrm>
+                      <a:off x="0" y="0"/>
+                      <a:ext cx="4848225" cy="2076450"/>
+                    </a:xfrm>
+                    <a:prstGeom prst="rect">
+                      <a:avLst/>
+                    </a:prstGeom>
+                  </pic:spPr>
+                </pic:pic>
+              </a:graphicData>
+            </a:graphic>
+          </wp:inline>
+        </w:drawing>
+      </w:r>
+    </w:p>
+    <w:p>
+      <w:pPr>
+        <w:pBdr>
+          <w:bottom w:val="single" w:color="B7DCDF" w:sz="4" w:space="1"/>
+        </w:pBdr>
+        <w:spacing w:after="40" w:before="30"/>
+      </w:pPr>
+    </w:p>
+    <w:p>
+      <w:pPr>
+        <w:spacing w:after="30" w:before="80" w:line="264"/>
+        <w:jc w:val="left"/>
+      </w:pPr>
+      <w:r>
+        <w:rPr>
+          <w:rFonts w:ascii="Calibri" w:cs="Calibri" w:eastAsia="Calibri" w:hAnsi="Calibri"/>
+          <w:b/>
+          <w:bCs/>
+          <w:i w:val="false"/>
+          <w:iCs w:val="false"/>
+          <w:color w:val="0B0B0B"/>
+          <w:sz w:val="20"/>
+          <w:szCs w:val="20"/>
+        </w:rPr>
+        <w:t xml:space="preserve">$ per vendor service</w:t>
+      </w:r>
+    </w:p>
+    <w:p>
+      <w:pPr>
+        <w:pStyle w:val="ListParagraph"/>
+        <w:numPr>
+          <w:ilvl w:val="0"/>
+          <w:numId w:val="2"/>
+        </w:numPr>
+        <w:spacing w:after="30" w:before="0" w:line="248"/>
+      </w:pPr>
+      <w:r>
+        <w:rPr>
+          <w:rFonts w:ascii="Calibri" w:cs="Calibri" w:eastAsia="Calibri" w:hAnsi="Calibri"/>
+          <w:b w:val="false"/>
+          <w:bCs w:val="false"/>
+          <w:i w:val="false"/>
+          <w:iCs w:val="false"/>
+          <w:color w:val="0B0B0B"/>
+          <w:sz w:val="19"/>
+          <w:szCs w:val="19"/>
+        </w:rPr>
+        <w:t xml:space="preserve">Walters average $ per event for that service</w:t>
+      </w:r>
+    </w:p>
+    <w:p>
+      <w:pPr>
+        <w:pStyle w:val="ListParagraph"/>
+        <w:numPr>
+          <w:ilvl w:val="0"/>
+          <w:numId w:val="2"/>
+        </w:numPr>
+        <w:spacing w:after="30" w:before="0" w:line="248"/>
+      </w:pPr>
+      <w:r>
+        <w:rPr>
+          <w:rFonts w:ascii="Calibri" w:cs="Calibri" w:eastAsia="Calibri" w:hAnsi="Calibri"/>
+          <w:b w:val="false"/>
+          <w:bCs w:val="false"/>
+          <w:i w:val="false"/>
+          <w:iCs w:val="false"/>
+          <w:color w:val="0B0B0B"/>
+          <w:sz w:val="19"/>
+          <w:szCs w:val="19"/>
+        </w:rPr>
+        <w:t xml:space="preserve">Smaller venue: adjust down; almost never adjust up</w:t>
+      </w:r>
+    </w:p>
+    <w:p>
+      <w:pPr>
+        <w:pStyle w:val="ListParagraph"/>
+        <w:numPr>
+          <w:ilvl w:val="0"/>
+          <w:numId w:val="2"/>
+        </w:numPr>
+        <w:spacing w:after="30" w:before="0" w:line="248"/>
+      </w:pPr>
+      <w:r>
+        <w:rPr>
+          <w:rFonts w:ascii="Calibri" w:cs="Calibri" w:eastAsia="Calibri" w:hAnsi="Calibri"/>
+          <w:b w:val="false"/>
+          <w:bCs w:val="false"/>
+          <w:i w:val="false"/>
+          <w:iCs w:val="false"/>
+          <w:color w:val="0B0B0B"/>
+          <w:sz w:val="19"/>
+          <w:szCs w:val="19"/>
+        </w:rPr>
+        <w:t xml:space="preserve">Sanity-check against what couples at that venue actually spend</w:t>
+      </w:r>
+    </w:p>
+    <w:p>
+      <w:pPr>
+        <w:pBdr>
+          <w:bottom w:val="single" w:color="B7DCDF" w:sz="4" w:space="1"/>
+        </w:pBdr>
+        <w:spacing w:after="40" w:before="30"/>
+      </w:pPr>
+    </w:p>
+    <w:p>
+      <w:pPr>
+        <w:spacing w:after="30" w:before="80" w:line="264"/>
+        <w:jc w:val="left"/>
+      </w:pPr>
+      <w:r>
+        <w:rPr>
+          <w:rFonts w:ascii="Calibri" w:cs="Calibri" w:eastAsia="Calibri" w:hAnsi="Calibri"/>
+          <w:b/>
+          <w:bCs/>
+          <w:i w:val="false"/>
+          <w:iCs w:val="false"/>
+          <w:color w:val="0B0B0B"/>
+          <w:sz w:val="20"/>
+          <w:szCs w:val="20"/>
+        </w:rPr>
+        <w:t xml:space="preserve">Don't "Walterize" too fast</w:t>
+      </w:r>
+    </w:p>
+    <w:p>
+      <w:pPr>
+        <w:pStyle w:val="ListParagraph"/>
+        <w:numPr>
+          <w:ilvl w:val="0"/>
+          <w:numId w:val="2"/>
+        </w:numPr>
+        <w:spacing w:after="30" w:before="0" w:line="248"/>
+      </w:pPr>
+      <w:r>
+        <w:rPr>
+          <w:rFonts w:ascii="Calibri" w:cs="Calibri" w:eastAsia="Calibri" w:hAnsi="Calibri"/>
+          <w:b w:val="false"/>
+          <w:bCs w:val="false"/>
+          <w:i w:val="false"/>
+          <w:iCs w:val="false"/>
+          <w:color w:val="0B0B0B"/>
+          <w:sz w:val="19"/>
+          <w:szCs w:val="19"/>
+        </w:rPr>
+        <w:t xml:space="preserve">Test and attach gradually; catering is not 100% on day one</w:t>
+      </w:r>
+    </w:p>
+    <w:p>
+      <w:pPr>
+        <w:pStyle w:val="Heading1"/>
+        <w:pBdr>
+          <w:bottom w:val="single" w:color="1A939B" w:sz="12" w:space="4"/>
+        </w:pBdr>
+        <w:spacing w:after="70" w:before="140"/>
+      </w:pPr>
+      <w:r>
+        <w:rPr>
+          <w:rFonts w:ascii="Calibri" w:cs="Calibri" w:eastAsia="Calibri" w:hAnsi="Calibri"/>
+          <w:b/>
+          <w:bCs/>
+          <w:i w:val="false"/>
+          <w:iCs w:val="false"/>
+          <w:color w:val="1A939B"/>
+          <w:sz w:val="30"/>
+          <w:szCs w:val="30"/>
+        </w:rPr>
+        <w:t xml:space="preserve">5. Expenses</w:t>
       </w:r>
     </w:p>
     <w:tbl>
@@ -1162,9 +1616,9 @@
             </w:tcBorders>
             <w:shd w:fill="EFF6F9" w:color="auto" w:val="clear"/>
             <w:tcMar>
-              <w:top w:type="dxa" w:w="120"/>
+              <w:top w:type="dxa" w:w="100"/>
               <w:left w:type="dxa" w:w="140"/>
-              <w:bottom w:type="dxa" w:w="120"/>
+              <w:bottom w:type="dxa" w:w="100"/>
               <w:right w:type="dxa" w:w="140"/>
             </w:tcMar>
           </w:tcPr>
@@ -1181,29 +1635,170 @@
                 <w:i w:val="false"/>
                 <w:iCs w:val="false"/>
                 <w:color w:val="1A939B"/>
-                <w:sz w:val="21"/>
-                <w:szCs w:val="21"/>
-              </w:rPr>
-              <w:t xml:space="preserve">~100 events / year</w:t>
-            </w:r>
-          </w:p>
-          <w:p>
-            <w:pPr>
-              <w:spacing w:after="30" w:before="0" w:line="240"/>
-              <w:jc w:val="left"/>
-            </w:pPr>
-            <w:r>
-              <w:rPr>
-                <w:rFonts w:ascii="Calibri" w:cs="Calibri" w:eastAsia="Calibri" w:hAnsi="Calibri"/>
-                <w:b w:val="false"/>
-                <w:bCs w:val="false"/>
-                <w:i w:val="false"/>
-                <w:iCs w:val="false"/>
-                <w:color w:val="52514E"/>
-                <w:sz w:val="18"/>
-                <w:szCs w:val="18"/>
-              </w:rPr>
-              <w:t xml:space="preserve">Real volume from day one</w:t>
+                <w:sz w:val="22"/>
+                <w:szCs w:val="22"/>
+              </w:rPr>
+              <w:t xml:space="preserve">COGS</w:t>
+            </w:r>
+          </w:p>
+          <w:p>
+            <w:pPr>
+              <w:pStyle w:val="ListParagraph"/>
+              <w:numPr>
+                <w:ilvl w:val="0"/>
+                <w:numId w:val="2"/>
+              </w:numPr>
+              <w:spacing w:after="20" w:before="0" w:line="248"/>
+            </w:pPr>
+            <w:r>
+              <w:rPr>
+                <w:rFonts w:ascii="Calibri" w:cs="Calibri" w:eastAsia="Calibri" w:hAnsi="Calibri"/>
+                <w:b w:val="false"/>
+                <w:bCs w:val="false"/>
+                <w:i w:val="false"/>
+                <w:iCs w:val="false"/>
+                <w:color w:val="0B0B0B"/>
+                <w:sz w:val="18"/>
+                <w:szCs w:val="18"/>
+              </w:rPr>
+              <w:t xml:space="preserve">Driven by their </w:t>
+            </w:r>
+            <w:r>
+              <w:rPr>
+                <w:rFonts w:ascii="Calibri" w:cs="Calibri" w:eastAsia="Calibri" w:hAnsi="Calibri"/>
+                <w:b/>
+                <w:bCs/>
+                <w:i w:val="false"/>
+                <w:iCs w:val="false"/>
+                <w:color w:val="0B0B0B"/>
+                <w:sz w:val="18"/>
+                <w:szCs w:val="18"/>
+              </w:rPr>
+              <w:t xml:space="preserve">vendor services</w:t>
+            </w:r>
+            <w:r>
+              <w:rPr>
+                <w:rFonts w:ascii="Calibri" w:cs="Calibri" w:eastAsia="Calibri" w:hAnsi="Calibri"/>
+                <w:b w:val="false"/>
+                <w:bCs w:val="false"/>
+                <w:i w:val="false"/>
+                <w:iCs w:val="false"/>
+                <w:color w:val="0B0B0B"/>
+                <w:sz w:val="18"/>
+                <w:szCs w:val="18"/>
+              </w:rPr>
+              <w:t xml:space="preserve"> and other offerings</w:t>
+            </w:r>
+          </w:p>
+          <w:p>
+            <w:pPr>
+              <w:pStyle w:val="ListParagraph"/>
+              <w:numPr>
+                <w:ilvl w:val="0"/>
+                <w:numId w:val="2"/>
+              </w:numPr>
+              <w:spacing w:after="20" w:before="0" w:line="248"/>
+            </w:pPr>
+            <w:r>
+              <w:rPr>
+                <w:rFonts w:ascii="Calibri" w:cs="Calibri" w:eastAsia="Calibri" w:hAnsi="Calibri"/>
+                <w:b w:val="false"/>
+                <w:bCs w:val="false"/>
+                <w:i w:val="false"/>
+                <w:iCs w:val="false"/>
+                <w:color w:val="0B0B0B"/>
+                <w:sz w:val="18"/>
+                <w:szCs w:val="18"/>
+              </w:rPr>
+              <w:t xml:space="preserve">Keep </w:t>
+            </w:r>
+            <w:r>
+              <w:rPr>
+                <w:rFonts w:ascii="Calibri" w:cs="Calibri" w:eastAsia="Calibri" w:hAnsi="Calibri"/>
+                <w:b/>
+                <w:bCs/>
+                <w:i w:val="false"/>
+                <w:iCs w:val="false"/>
+                <w:color w:val="0B0B0B"/>
+                <w:sz w:val="18"/>
+                <w:szCs w:val="18"/>
+              </w:rPr>
+              <w:t xml:space="preserve">their existing costs</w:t>
+            </w:r>
+            <w:r>
+              <w:rPr>
+                <w:rFonts w:ascii="Calibri" w:cs="Calibri" w:eastAsia="Calibri" w:hAnsi="Calibri"/>
+                <w:b w:val="false"/>
+                <w:bCs w:val="false"/>
+                <w:i w:val="false"/>
+                <w:iCs w:val="false"/>
+                <w:color w:val="0B0B0B"/>
+                <w:sz w:val="18"/>
+                <w:szCs w:val="18"/>
+              </w:rPr>
+              <w:t xml:space="preserve"> in mind (e.g. a required caterer's per-head cost on OC events)</w:t>
+            </w:r>
+          </w:p>
+          <w:p>
+            <w:pPr>
+              <w:pStyle w:val="ListParagraph"/>
+              <w:numPr>
+                <w:ilvl w:val="0"/>
+                <w:numId w:val="2"/>
+              </w:numPr>
+              <w:spacing w:after="20" w:before="0" w:line="248"/>
+            </w:pPr>
+            <w:r>
+              <w:rPr>
+                <w:rFonts w:ascii="Calibri" w:cs="Calibri" w:eastAsia="Calibri" w:hAnsi="Calibri"/>
+                <w:b w:val="false"/>
+                <w:bCs w:val="false"/>
+                <w:i w:val="false"/>
+                <w:iCs w:val="false"/>
+                <w:color w:val="0B0B0B"/>
+                <w:sz w:val="18"/>
+                <w:szCs w:val="18"/>
+              </w:rPr>
+              <w:t xml:space="preserve">Often </w:t>
+            </w:r>
+            <w:r>
+              <w:rPr>
+                <w:rFonts w:ascii="Calibri" w:cs="Calibri" w:eastAsia="Calibri" w:hAnsi="Calibri"/>
+                <w:b/>
+                <w:bCs/>
+                <w:i w:val="false"/>
+                <w:iCs w:val="false"/>
+                <w:color w:val="0B0B0B"/>
+                <w:sz w:val="18"/>
+                <w:szCs w:val="18"/>
+              </w:rPr>
+              <w:t xml:space="preserve">little or no COGS today</w:t>
+            </w:r>
+            <w:r>
+              <w:rPr>
+                <w:rFonts w:ascii="Calibri" w:cs="Calibri" w:eastAsia="Calibri" w:hAnsi="Calibri"/>
+                <w:b w:val="false"/>
+                <w:bCs w:val="false"/>
+                <w:i w:val="false"/>
+                <w:iCs w:val="false"/>
+                <w:color w:val="0B0B0B"/>
+                <w:sz w:val="18"/>
+                <w:szCs w:val="18"/>
+              </w:rPr>
+              <w:t xml:space="preserve">; we build on </w:t>
+            </w:r>
+            <w:r>
+              <w:rPr>
+                <w:rFonts w:ascii="Calibri" w:cs="Calibri" w:eastAsia="Calibri" w:hAnsi="Calibri"/>
+                <w:b/>
+                <w:bCs/>
+                <w:i w:val="false"/>
+                <w:iCs w:val="false"/>
+                <w:color w:val="0B0B0B"/>
+                <w:sz w:val="18"/>
+                <w:szCs w:val="18"/>
+              </w:rPr>
+              <w:t xml:space="preserve">our ramp and margins</w:t>
             </w:r>
           </w:p>
         </w:tc>
@@ -1218,9 +1813,9 @@
             </w:tcBorders>
             <w:shd w:fill="EFF6F9" w:color="auto" w:val="clear"/>
             <w:tcMar>
-              <w:top w:type="dxa" w:w="120"/>
+              <w:top w:type="dxa" w:w="100"/>
               <w:left w:type="dxa" w:w="140"/>
-              <w:bottom w:type="dxa" w:w="120"/>
+              <w:bottom w:type="dxa" w:w="100"/>
               <w:right w:type="dxa" w:w="140"/>
             </w:tcMar>
           </w:tcPr>
@@ -1237,29 +1832,118 @@
                 <w:i w:val="false"/>
                 <w:iCs w:val="false"/>
                 <w:color w:val="1A939B"/>
-                <w:sz w:val="21"/>
-                <w:szCs w:val="21"/>
-              </w:rPr>
-              <w:t xml:space="preserve">All-inclusive package</w:t>
-            </w:r>
-          </w:p>
-          <w:p>
-            <w:pPr>
-              <w:spacing w:after="30" w:before="0" w:line="240"/>
-              <w:jc w:val="left"/>
-            </w:pPr>
-            <w:r>
-              <w:rPr>
-                <w:rFonts w:ascii="Calibri" w:cs="Calibri" w:eastAsia="Calibri" w:hAnsi="Calibri"/>
-                <w:b w:val="false"/>
-                <w:bCs w:val="false"/>
-                <w:i w:val="false"/>
-                <w:iCs w:val="false"/>
-                <w:color w:val="52514E"/>
-                <w:sz w:val="18"/>
-                <w:szCs w:val="18"/>
-              </w:rPr>
-              <w:t xml:space="preserve">Partnering with outside vendors, or some in-house</w:t>
+                <w:sz w:val="22"/>
+                <w:szCs w:val="22"/>
+              </w:rPr>
+              <w:t xml:space="preserve">Payroll</w:t>
+            </w:r>
+          </w:p>
+          <w:p>
+            <w:pPr>
+              <w:pStyle w:val="ListParagraph"/>
+              <w:numPr>
+                <w:ilvl w:val="0"/>
+                <w:numId w:val="2"/>
+              </w:numPr>
+              <w:spacing w:after="20" w:before="0" w:line="248"/>
+            </w:pPr>
+            <w:r>
+              <w:rPr>
+                <w:rFonts w:ascii="Calibri" w:cs="Calibri" w:eastAsia="Calibri" w:hAnsi="Calibri"/>
+                <w:b/>
+                <w:bCs/>
+                <w:i w:val="false"/>
+                <w:iCs w:val="false"/>
+                <w:color w:val="0B0B0B"/>
+                <w:sz w:val="18"/>
+                <w:szCs w:val="18"/>
+              </w:rPr>
+              <w:t xml:space="preserve">Current staff</w:t>
+            </w:r>
+            <w:r>
+              <w:rPr>
+                <w:rFonts w:ascii="Calibri" w:cs="Calibri" w:eastAsia="Calibri" w:hAnsi="Calibri"/>
+                <w:b w:val="false"/>
+                <w:bCs w:val="false"/>
+                <w:i w:val="false"/>
+                <w:iCs w:val="false"/>
+                <w:color w:val="0B0B0B"/>
+                <w:sz w:val="18"/>
+                <w:szCs w:val="18"/>
+              </w:rPr>
+              <w:t xml:space="preserve"> and roles</w:t>
+            </w:r>
+          </w:p>
+          <w:p>
+            <w:pPr>
+              <w:pStyle w:val="ListParagraph"/>
+              <w:numPr>
+                <w:ilvl w:val="0"/>
+                <w:numId w:val="2"/>
+              </w:numPr>
+              <w:spacing w:after="20" w:before="0" w:line="248"/>
+            </w:pPr>
+            <w:r>
+              <w:rPr>
+                <w:rFonts w:ascii="Calibri" w:cs="Calibri" w:eastAsia="Calibri" w:hAnsi="Calibri"/>
+                <w:b/>
+                <w:bCs/>
+                <w:i w:val="false"/>
+                <w:iCs w:val="false"/>
+                <w:color w:val="0B0B0B"/>
+                <w:sz w:val="18"/>
+                <w:szCs w:val="18"/>
+              </w:rPr>
+              <w:t xml:space="preserve">Current or new market</w:t>
+            </w:r>
+          </w:p>
+          <w:p>
+            <w:pPr>
+              <w:pStyle w:val="ListParagraph"/>
+              <w:numPr>
+                <w:ilvl w:val="0"/>
+                <w:numId w:val="2"/>
+              </w:numPr>
+              <w:spacing w:after="20" w:before="0" w:line="248"/>
+            </w:pPr>
+            <w:r>
+              <w:rPr>
+                <w:rFonts w:ascii="Calibri" w:cs="Calibri" w:eastAsia="Calibri" w:hAnsi="Calibri"/>
+                <w:b/>
+                <w:bCs/>
+                <w:i w:val="false"/>
+                <w:iCs w:val="false"/>
+                <w:color w:val="0B0B0B"/>
+                <w:sz w:val="18"/>
+                <w:szCs w:val="18"/>
+              </w:rPr>
+              <w:t xml:space="preserve">Owner involvement</w:t>
+            </w:r>
+            <w:r>
+              <w:rPr>
+                <w:rFonts w:ascii="Calibri" w:cs="Calibri" w:eastAsia="Calibri" w:hAnsi="Calibri"/>
+                <w:b w:val="false"/>
+                <w:bCs w:val="false"/>
+                <w:i w:val="false"/>
+                <w:iCs w:val="false"/>
+                <w:color w:val="0B0B0B"/>
+                <w:sz w:val="18"/>
+                <w:szCs w:val="18"/>
+              </w:rPr>
+              <w:t xml:space="preserve">: what they pay themselves; </w:t>
+            </w:r>
+            <w:r>
+              <w:rPr>
+                <w:rFonts w:ascii="Calibri" w:cs="Calibri" w:eastAsia="Calibri" w:hAnsi="Calibri"/>
+                <w:b/>
+                <w:bCs/>
+                <w:i w:val="false"/>
+                <w:iCs w:val="false"/>
+                <w:color w:val="0B0B0B"/>
+                <w:sz w:val="18"/>
+                <w:szCs w:val="18"/>
+              </w:rPr>
+              <w:t xml:space="preserve">replacement cost</w:t>
             </w:r>
           </w:p>
         </w:tc>
@@ -1274,9 +1958,9 @@
             </w:tcBorders>
             <w:shd w:fill="EFF6F9" w:color="auto" w:val="clear"/>
             <w:tcMar>
-              <w:top w:type="dxa" w:w="120"/>
+              <w:top w:type="dxa" w:w="100"/>
               <w:left w:type="dxa" w:w="140"/>
-              <w:bottom w:type="dxa" w:w="120"/>
+              <w:bottom w:type="dxa" w:w="100"/>
               <w:right w:type="dxa" w:w="140"/>
             </w:tcMar>
           </w:tcPr>
@@ -1293,548 +1977,10 @@
                 <w:i w:val="false"/>
                 <w:iCs w:val="false"/>
                 <w:color w:val="1A939B"/>
-                <w:sz w:val="21"/>
-                <w:szCs w:val="21"/>
-              </w:rPr>
-              <w:t xml:space="preserve">Owner not involved</w:t>
-            </w:r>
-          </w:p>
-          <w:p>
-            <w:pPr>
-              <w:spacing w:after="30" w:before="0" w:line="240"/>
-              <w:jc w:val="left"/>
-            </w:pPr>
-            <w:r>
-              <w:rPr>
-                <w:rFonts w:ascii="Calibri" w:cs="Calibri" w:eastAsia="Calibri" w:hAnsi="Calibri"/>
-                <w:b w:val="false"/>
-                <w:bCs w:val="false"/>
-                <w:i w:val="false"/>
-                <w:iCs w:val="false"/>
-                <w:color w:val="52514E"/>
-                <w:sz w:val="18"/>
-                <w:szCs w:val="18"/>
-              </w:rPr>
-              <w:t xml:space="preserve">Runs without them</w:t>
-            </w:r>
-          </w:p>
-        </w:tc>
-      </w:tr>
-    </w:tbl>
-    <w:p>
-      <w:r>
-        <w:br w:type="page"/>
-      </w:r>
-    </w:p>
-    <w:p>
-      <w:pPr>
-        <w:pStyle w:val="Heading1"/>
-        <w:pBdr>
-          <w:bottom w:val="single" w:color="1A939B" w:sz="12" w:space="4"/>
-        </w:pBdr>
-        <w:spacing w:after="100" w:before="240"/>
-      </w:pPr>
-      <w:r>
-        <w:rPr>
-          <w:rFonts w:ascii="Calibri" w:cs="Calibri" w:eastAsia="Calibri" w:hAnsi="Calibri"/>
-          <w:b/>
-          <w:bCs/>
-          <w:i w:val="false"/>
-          <w:iCs w:val="false"/>
-          <w:color w:val="1A939B"/>
-          <w:sz w:val="30"/>
-          <w:szCs w:val="30"/>
-        </w:rPr>
-        <w:t xml:space="preserve">4. Top-Line Projections</w:t>
-      </w:r>
-    </w:p>
-    <w:p>
-      <w:pPr>
-        <w:spacing w:after="40" w:before="140" w:line="264"/>
-        <w:jc w:val="left"/>
-      </w:pPr>
-      <w:r>
-        <w:rPr>
-          <w:rFonts w:ascii="Calibri" w:cs="Calibri" w:eastAsia="Calibri" w:hAnsi="Calibri"/>
-          <w:b/>
-          <w:bCs/>
-          <w:i w:val="false"/>
-          <w:iCs w:val="false"/>
-          <w:color w:val="1A939B"/>
-          <w:sz w:val="23"/>
-          <w:szCs w:val="23"/>
-        </w:rPr>
-        <w:t xml:space="preserve">Events</w:t>
-      </w:r>
-    </w:p>
-    <w:p>
-      <w:pPr>
-        <w:pStyle w:val="ListParagraph"/>
-        <w:numPr>
-          <w:ilvl w:val="0"/>
-          <w:numId w:val="2"/>
-        </w:numPr>
-        <w:spacing w:after="30" w:before="0" w:line="248"/>
-      </w:pPr>
-      <w:r>
-        <w:rPr>
-          <w:rFonts w:ascii="Calibri" w:cs="Calibri" w:eastAsia="Calibri" w:hAnsi="Calibri"/>
-          <w:b w:val="false"/>
-          <w:bCs w:val="false"/>
-          <w:i w:val="false"/>
-          <w:iCs w:val="false"/>
-          <w:color w:val="0B0B0B"/>
-          <w:sz w:val="19"/>
-          <w:szCs w:val="19"/>
-        </w:rPr>
-        <w:t xml:space="preserve">Historical average per year</w:t>
-      </w:r>
-    </w:p>
-    <w:p>
-      <w:pPr>
-        <w:pStyle w:val="ListParagraph"/>
-        <w:numPr>
-          <w:ilvl w:val="0"/>
-          <w:numId w:val="2"/>
-        </w:numPr>
-        <w:spacing w:after="30" w:before="0" w:line="248"/>
-      </w:pPr>
-      <w:r>
-        <w:rPr>
-          <w:rFonts w:ascii="Calibri" w:cs="Calibri" w:eastAsia="Calibri" w:hAnsi="Calibri"/>
-          <w:b w:val="false"/>
-          <w:bCs w:val="false"/>
-          <w:i w:val="false"/>
-          <w:iCs w:val="false"/>
-          <w:color w:val="0B0B0B"/>
-          <w:sz w:val="19"/>
-          <w:szCs w:val="19"/>
-        </w:rPr>
-        <w:t xml:space="preserve">Last 12 months</w:t>
-      </w:r>
-    </w:p>
-    <w:p>
-      <w:pPr>
-        <w:pStyle w:val="ListParagraph"/>
-        <w:numPr>
-          <w:ilvl w:val="0"/>
-          <w:numId w:val="2"/>
-        </w:numPr>
-        <w:spacing w:after="30" w:before="0" w:line="248"/>
-      </w:pPr>
-      <w:r>
-        <w:rPr>
-          <w:rFonts w:ascii="Calibri" w:cs="Calibri" w:eastAsia="Calibri" w:hAnsi="Calibri"/>
-          <w:b w:val="false"/>
-          <w:bCs w:val="false"/>
-          <w:i w:val="false"/>
-          <w:iCs w:val="false"/>
-          <w:color w:val="0B0B0B"/>
-          <w:sz w:val="19"/>
-          <w:szCs w:val="19"/>
-        </w:rPr>
-        <w:t xml:space="preserve">Booked for the next 12 months</w:t>
-      </w:r>
-    </w:p>
-    <w:p>
-      <w:pPr>
-        <w:spacing w:after="40" w:before="140" w:line="264"/>
-        <w:jc w:val="left"/>
-      </w:pPr>
-      <w:r>
-        <w:rPr>
-          <w:rFonts w:ascii="Calibri" w:cs="Calibri" w:eastAsia="Calibri" w:hAnsi="Calibri"/>
-          <w:b/>
-          <w:bCs/>
-          <w:i w:val="false"/>
-          <w:iCs w:val="false"/>
-          <w:color w:val="1A939B"/>
-          <w:sz w:val="23"/>
-          <w:szCs w:val="23"/>
-        </w:rPr>
-        <w:t xml:space="preserve">Revenue / Vendor Services</w:t>
-      </w:r>
-    </w:p>
-    <w:p>
-      <w:pPr>
-        <w:pStyle w:val="ListParagraph"/>
-        <w:numPr>
-          <w:ilvl w:val="0"/>
-          <w:numId w:val="2"/>
-        </w:numPr>
-        <w:spacing w:after="30" w:before="0" w:line="248"/>
-      </w:pPr>
-      <w:r>
-        <w:rPr>
-          <w:rFonts w:ascii="Calibri" w:cs="Calibri" w:eastAsia="Calibri" w:hAnsi="Calibri"/>
-          <w:b w:val="false"/>
-          <w:bCs w:val="false"/>
-          <w:i w:val="false"/>
-          <w:iCs w:val="false"/>
-          <w:color w:val="0B0B0B"/>
-          <w:sz w:val="19"/>
-          <w:szCs w:val="19"/>
-        </w:rPr>
-        <w:t xml:space="preserve">Photography / DJ / Stationery: quick to implement</w:t>
-      </w:r>
-    </w:p>
-    <w:p>
-      <w:pPr>
-        <w:pStyle w:val="ListParagraph"/>
-        <w:numPr>
-          <w:ilvl w:val="0"/>
-          <w:numId w:val="2"/>
-        </w:numPr>
-        <w:spacing w:after="30" w:before="0" w:line="248"/>
-      </w:pPr>
-      <w:r>
-        <w:rPr>
-          <w:rFonts w:ascii="Calibri" w:cs="Calibri" w:eastAsia="Calibri" w:hAnsi="Calibri"/>
-          <w:b w:val="false"/>
-          <w:bCs w:val="false"/>
-          <w:i w:val="false"/>
-          <w:iCs w:val="false"/>
-          <w:color w:val="0B0B0B"/>
-          <w:sz w:val="19"/>
-          <w:szCs w:val="19"/>
-        </w:rPr>
-        <w:t xml:space="preserve">Bar: on/off switch once we hold the liquor license</w:t>
-      </w:r>
-    </w:p>
-    <w:p>
-      <w:pPr>
-        <w:pStyle w:val="ListParagraph"/>
-        <w:numPr>
-          <w:ilvl w:val="0"/>
-          <w:numId w:val="2"/>
-        </w:numPr>
-        <w:spacing w:after="30" w:before="0" w:line="248"/>
-      </w:pPr>
-      <w:r>
-        <w:rPr>
-          <w:rFonts w:ascii="Calibri" w:cs="Calibri" w:eastAsia="Calibri" w:hAnsi="Calibri"/>
-          <w:b w:val="false"/>
-          <w:bCs w:val="false"/>
-          <w:i w:val="false"/>
-          <w:iCs w:val="false"/>
-          <w:color w:val="0B0B0B"/>
-          <w:sz w:val="19"/>
-          <w:szCs w:val="19"/>
-        </w:rPr>
-        <w:t xml:space="preserve">Catering: attach slowly; test it</w:t>
-      </w:r>
-    </w:p>
-    <w:p>
-      <w:pPr>
-        <w:pStyle w:val="ListParagraph"/>
-        <w:numPr>
-          <w:ilvl w:val="0"/>
-          <w:numId w:val="2"/>
-        </w:numPr>
-        <w:spacing w:after="30" w:before="0" w:line="248"/>
-      </w:pPr>
-      <w:r>
-        <w:rPr>
-          <w:rFonts w:ascii="Calibri" w:cs="Calibri" w:eastAsia="Calibri" w:hAnsi="Calibri"/>
-          <w:b w:val="false"/>
-          <w:bCs w:val="false"/>
-          <w:i w:val="false"/>
-          <w:iCs w:val="false"/>
-          <w:color w:val="0B0B0B"/>
-          <w:sz w:val="19"/>
-          <w:szCs w:val="19"/>
-        </w:rPr>
-        <w:t xml:space="preserve">Floral / Bakery: depends on hub distance</w:t>
-      </w:r>
-    </w:p>
-    <w:p>
-      <w:pPr>
-        <w:spacing w:after="30" w:before="80" w:line="264"/>
-        <w:jc w:val="left"/>
-      </w:pPr>
-      <w:r>
-        <w:rPr>
-          <w:rFonts w:ascii="Calibri" w:cs="Calibri" w:eastAsia="Calibri" w:hAnsi="Calibri"/>
-          <w:b/>
-          <w:bCs/>
-          <w:i w:val="false"/>
-          <w:iCs w:val="false"/>
-          <w:color w:val="0B0B0B"/>
-          <w:sz w:val="20"/>
-          <w:szCs w:val="20"/>
-        </w:rPr>
-        <w:t xml:space="preserve">Attachment ramp-up</w:t>
-      </w:r>
-    </w:p>
-    <w:p>
-      <w:pPr>
-        <w:spacing w:after="40" w:before="0" w:line="264"/>
-        <w:jc w:val="left"/>
-      </w:pPr>
-      <w:r>
-        <w:rPr>
-          <w:rFonts w:ascii="Calibri" w:cs="Calibri" w:eastAsia="Calibri" w:hAnsi="Calibri"/>
-          <w:b w:val="false"/>
-          <w:bCs w:val="false"/>
-          <w:i w:val="false"/>
-          <w:iCs w:val="false"/>
-          <w:color w:val="52514E"/>
-          <w:sz w:val="19"/>
-          <w:szCs w:val="19"/>
-        </w:rPr>
-        <w:t xml:space="preserve">Our typical assumption: ramp to the Walters average attachment by Year 3, tweaked for the venue.</w:t>
-      </w:r>
-    </w:p>
-    <w:p>
-      <w:pPr>
-        <w:spacing w:after="60" w:before="60"/>
-        <w:jc w:val="center"/>
-      </w:pPr>
-      <w:r>
-        <w:drawing>
-          <wp:inline distT="0" distB="0" distL="0" distR="0">
-            <wp:extent cx="5486400" cy="2352675"/>
-            <wp:effectExtent t="0" r="0" b="0" l="0"/>
-            <wp:docPr id="1" name="" descr="" title=""/>
-            <wp:cNvGraphicFramePr>
-              <a:graphicFrameLocks xmlns:a="http://schemas.openxmlformats.org/drawingml/2006/main" noChangeAspect="1"/>
-            </wp:cNvGraphicFramePr>
-            <a:graphic xmlns:a="http://schemas.openxmlformats.org/drawingml/2006/main">
-              <a:graphicData uri="http://schemas.openxmlformats.org/drawingml/2006/picture">
-                <pic:pic xmlns:pic="http://schemas.openxmlformats.org/drawingml/2006/picture">
-                  <pic:nvPicPr>
-                    <pic:cNvPr id="0" name="" descr=""/>
-                    <pic:cNvPicPr>
-                      <a:picLocks noChangeAspect="1" noChangeArrowheads="1"/>
-                    </pic:cNvPicPr>
-                  </pic:nvPicPr>
-                  <pic:blipFill>
-                    <a:blip r:embed="rId9" cstate="none"/>
-                    <a:srcRect/>
-                    <a:stretch>
-                      <a:fillRect/>
-                    </a:stretch>
-                  </pic:blipFill>
-                  <pic:spPr bwMode="auto">
-                    <a:xfrm>
-                      <a:off x="0" y="0"/>
-                      <a:ext cx="5486400" cy="2352675"/>
-                    </a:xfrm>
-                    <a:prstGeom prst="rect">
-                      <a:avLst/>
-                    </a:prstGeom>
-                  </pic:spPr>
-                </pic:pic>
-              </a:graphicData>
-            </a:graphic>
-          </wp:inline>
-        </w:drawing>
-      </w:r>
-    </w:p>
-    <w:p>
-      <w:pPr>
-        <w:spacing w:after="30" w:before="80" w:line="264"/>
-        <w:jc w:val="left"/>
-      </w:pPr>
-      <w:r>
-        <w:rPr>
-          <w:rFonts w:ascii="Calibri" w:cs="Calibri" w:eastAsia="Calibri" w:hAnsi="Calibri"/>
-          <w:b/>
-          <w:bCs/>
-          <w:i w:val="false"/>
-          <w:iCs w:val="false"/>
-          <w:color w:val="0B0B0B"/>
-          <w:sz w:val="20"/>
-          <w:szCs w:val="20"/>
-        </w:rPr>
-        <w:t xml:space="preserve">$ per vendor service</w:t>
-      </w:r>
-    </w:p>
-    <w:p>
-      <w:pPr>
-        <w:pStyle w:val="ListParagraph"/>
-        <w:numPr>
-          <w:ilvl w:val="0"/>
-          <w:numId w:val="2"/>
-        </w:numPr>
-        <w:spacing w:after="30" w:before="0" w:line="248"/>
-      </w:pPr>
-      <w:r>
-        <w:rPr>
-          <w:rFonts w:ascii="Calibri" w:cs="Calibri" w:eastAsia="Calibri" w:hAnsi="Calibri"/>
-          <w:b w:val="false"/>
-          <w:bCs w:val="false"/>
-          <w:i w:val="false"/>
-          <w:iCs w:val="false"/>
-          <w:color w:val="0B0B0B"/>
-          <w:sz w:val="19"/>
-          <w:szCs w:val="19"/>
-        </w:rPr>
-        <w:t xml:space="preserve">Walters average $ per event for that service</w:t>
-      </w:r>
-    </w:p>
-    <w:p>
-      <w:pPr>
-        <w:pStyle w:val="ListParagraph"/>
-        <w:numPr>
-          <w:ilvl w:val="0"/>
-          <w:numId w:val="2"/>
-        </w:numPr>
-        <w:spacing w:after="30" w:before="0" w:line="248"/>
-      </w:pPr>
-      <w:r>
-        <w:rPr>
-          <w:rFonts w:ascii="Calibri" w:cs="Calibri" w:eastAsia="Calibri" w:hAnsi="Calibri"/>
-          <w:b w:val="false"/>
-          <w:bCs w:val="false"/>
-          <w:i w:val="false"/>
-          <w:iCs w:val="false"/>
-          <w:color w:val="0B0B0B"/>
-          <w:sz w:val="19"/>
-          <w:szCs w:val="19"/>
-        </w:rPr>
-        <w:t xml:space="preserve">Small venue: tweak down; almost never tweak up</w:t>
-      </w:r>
-    </w:p>
-    <w:p>
-      <w:pPr>
-        <w:pStyle w:val="ListParagraph"/>
-        <w:numPr>
-          <w:ilvl w:val="0"/>
-          <w:numId w:val="2"/>
-        </w:numPr>
-        <w:spacing w:after="30" w:before="0" w:line="248"/>
-      </w:pPr>
-      <w:r>
-        <w:rPr>
-          <w:rFonts w:ascii="Calibri" w:cs="Calibri" w:eastAsia="Calibri" w:hAnsi="Calibri"/>
-          <w:b w:val="false"/>
-          <w:bCs w:val="false"/>
-          <w:i w:val="false"/>
-          <w:iCs w:val="false"/>
-          <w:color w:val="0B0B0B"/>
-          <w:sz w:val="19"/>
-          <w:szCs w:val="19"/>
-        </w:rPr>
-        <w:t xml:space="preserve">Sanity-check against what brides at that venue actually spend</w:t>
-      </w:r>
-    </w:p>
-    <w:p>
-      <w:pPr>
-        <w:spacing w:after="30" w:before="80" w:line="264"/>
-        <w:jc w:val="left"/>
-      </w:pPr>
-      <w:r>
-        <w:rPr>
-          <w:rFonts w:ascii="Calibri" w:cs="Calibri" w:eastAsia="Calibri" w:hAnsi="Calibri"/>
-          <w:b/>
-          <w:bCs/>
-          <w:i w:val="false"/>
-          <w:iCs w:val="false"/>
-          <w:color w:val="0B0B0B"/>
-          <w:sz w:val="20"/>
-          <w:szCs w:val="20"/>
-        </w:rPr>
-        <w:t xml:space="preserve">Don't "Walterize" too fast</w:t>
-      </w:r>
-    </w:p>
-    <w:p>
-      <w:pPr>
-        <w:pStyle w:val="ListParagraph"/>
-        <w:numPr>
-          <w:ilvl w:val="0"/>
-          <w:numId w:val="2"/>
-        </w:numPr>
-        <w:spacing w:after="30" w:before="0" w:line="248"/>
-      </w:pPr>
-      <w:r>
-        <w:rPr>
-          <w:rFonts w:ascii="Calibri" w:cs="Calibri" w:eastAsia="Calibri" w:hAnsi="Calibri"/>
-          <w:b w:val="false"/>
-          <w:bCs w:val="false"/>
-          <w:i w:val="false"/>
-          <w:iCs w:val="false"/>
-          <w:color w:val="0B0B0B"/>
-          <w:sz w:val="19"/>
-          <w:szCs w:val="19"/>
-        </w:rPr>
-        <w:t xml:space="preserve">Test and attach slowly; catering is not 100% on day one</w:t>
-      </w:r>
-    </w:p>
-    <w:p>
-      <w:pPr>
-        <w:pStyle w:val="Heading1"/>
-        <w:pBdr>
-          <w:bottom w:val="single" w:color="1A939B" w:sz="12" w:space="4"/>
-        </w:pBdr>
-        <w:spacing w:after="100" w:before="240"/>
-      </w:pPr>
-      <w:r>
-        <w:rPr>
-          <w:rFonts w:ascii="Calibri" w:cs="Calibri" w:eastAsia="Calibri" w:hAnsi="Calibri"/>
-          <w:b/>
-          <w:bCs/>
-          <w:i w:val="false"/>
-          <w:iCs w:val="false"/>
-          <w:color w:val="1A939B"/>
-          <w:sz w:val="30"/>
-          <w:szCs w:val="30"/>
-        </w:rPr>
-        <w:t xml:space="preserve">5. Expenses</w:t>
-      </w:r>
-    </w:p>
-    <w:tbl>
-      <w:tblPr>
-        <w:tblW w:type="dxa" w:w="10512"/>
-        <w:tblBorders>
-          <w:top w:val="none" w:color="FFFFFF" w:sz="0"/>
-          <w:left w:val="none" w:color="FFFFFF" w:sz="0"/>
-          <w:bottom w:val="none" w:color="FFFFFF" w:sz="0"/>
-          <w:right w:val="none" w:color="FFFFFF" w:sz="0"/>
-          <w:insideH w:val="single" w:color="auto" w:sz="4"/>
-          <w:insideV w:val="single" w:color="auto" w:sz="4"/>
-        </w:tblBorders>
-      </w:tblPr>
-      <w:tblGrid>
-        <w:gridCol w:w="3504"/>
-        <w:gridCol w:w="3504"/>
-        <w:gridCol w:w="3504"/>
-      </w:tblGrid>
-      <w:tr>
-        <w:tc>
-          <w:tcPr>
-            <w:tcW w:type="dxa" w:w="3504"/>
-            <w:tcBorders>
-              <w:top w:val="single" w:color="FFFFFF" w:sz="24"/>
-              <w:left w:val="single" w:color="FFFFFF" w:sz="24"/>
-              <w:bottom w:val="single" w:color="FFFFFF" w:sz="24"/>
-              <w:right w:val="single" w:color="FFFFFF" w:sz="24"/>
-            </w:tcBorders>
-            <w:shd w:fill="EFF6F9" w:color="auto" w:val="clear"/>
-            <w:tcMar>
-              <w:top w:type="dxa" w:w="120"/>
-              <w:left w:type="dxa" w:w="140"/>
-              <w:bottom w:type="dxa" w:w="120"/>
-              <w:right w:type="dxa" w:w="140"/>
-            </w:tcMar>
-          </w:tcPr>
-          <w:p>
-            <w:pPr>
-              <w:spacing w:after="60" w:before="0" w:line="264"/>
-              <w:jc w:val="left"/>
-            </w:pPr>
-            <w:r>
-              <w:rPr>
-                <w:rFonts w:ascii="Calibri" w:cs="Calibri" w:eastAsia="Calibri" w:hAnsi="Calibri"/>
-                <w:b/>
-                <w:bCs/>
-                <w:i w:val="false"/>
-                <w:iCs w:val="false"/>
-                <w:color w:val="1A939B"/>
                 <w:sz w:val="22"/>
                 <w:szCs w:val="22"/>
               </w:rPr>
-              <w:t xml:space="preserve">COGS</w:t>
+              <w:t xml:space="preserve">Operating expenses</w:t>
             </w:r>
           </w:p>
           <w:p>
@@ -1857,7 +2003,33 @@
                 <w:sz w:val="18"/>
                 <w:szCs w:val="18"/>
               </w:rPr>
-              <w:t xml:space="preserve">Depends on their vendor services and other offerings</w:t>
+              <w:t xml:space="preserve">Switch to </w:t>
+            </w:r>
+            <w:r>
+              <w:rPr>
+                <w:rFonts w:ascii="Calibri" w:cs="Calibri" w:eastAsia="Calibri" w:hAnsi="Calibri"/>
+                <w:b/>
+                <w:bCs/>
+                <w:i w:val="false"/>
+                <w:iCs w:val="false"/>
+                <w:color w:val="0B0B0B"/>
+                <w:sz w:val="18"/>
+                <w:szCs w:val="18"/>
+              </w:rPr>
+              <w:t xml:space="preserve">our marketing</w:t>
+            </w:r>
+            <w:r>
+              <w:rPr>
+                <w:rFonts w:ascii="Calibri" w:cs="Calibri" w:eastAsia="Calibri" w:hAnsi="Calibri"/>
+                <w:b w:val="false"/>
+                <w:bCs w:val="false"/>
+                <w:i w:val="false"/>
+                <w:iCs w:val="false"/>
+                <w:color w:val="0B0B0B"/>
+                <w:sz w:val="18"/>
+                <w:szCs w:val="18"/>
+              </w:rPr>
+              <w:t xml:space="preserve">; almost always higher</w:t>
             </w:r>
           </w:p>
           <w:p>
@@ -1880,7 +2052,33 @@
                 <w:sz w:val="18"/>
                 <w:szCs w:val="18"/>
               </w:rPr>
-              <w:t xml:space="preserve">Keep theirs in mind (e.g. a required caterer's per-head cost on OC events)</w:t>
+              <w:t xml:space="preserve">Their </w:t>
+            </w:r>
+            <w:r>
+              <w:rPr>
+                <w:rFonts w:ascii="Calibri" w:cs="Calibri" w:eastAsia="Calibri" w:hAnsi="Calibri"/>
+                <w:b/>
+                <w:bCs/>
+                <w:i w:val="false"/>
+                <w:iCs w:val="false"/>
+                <w:color w:val="0B0B0B"/>
+                <w:sz w:val="18"/>
+                <w:szCs w:val="18"/>
+              </w:rPr>
+              <w:t xml:space="preserve">utilities and maintenance</w:t>
+            </w:r>
+            <w:r>
+              <w:rPr>
+                <w:rFonts w:ascii="Calibri" w:cs="Calibri" w:eastAsia="Calibri" w:hAnsi="Calibri"/>
+                <w:b w:val="false"/>
+                <w:bCs w:val="false"/>
+                <w:i w:val="false"/>
+                <w:iCs w:val="false"/>
+                <w:color w:val="0B0B0B"/>
+                <w:sz w:val="18"/>
+                <w:szCs w:val="18"/>
+              </w:rPr>
+              <w:t xml:space="preserve"> per event</w:t>
             </w:r>
           </w:p>
           <w:p>
@@ -1903,32 +2101,8 @@
                 <w:sz w:val="18"/>
                 <w:szCs w:val="18"/>
               </w:rPr>
-              <w:t xml:space="preserve">Often they have little or no COGS; we implement on our ramp and margins</w:t>
-            </w:r>
-          </w:p>
-        </w:tc>
-        <w:tc>
-          <w:tcPr>
-            <w:tcW w:type="dxa" w:w="3504"/>
-            <w:tcBorders>
-              <w:top w:val="single" w:color="FFFFFF" w:sz="24"/>
-              <w:left w:val="single" w:color="FFFFFF" w:sz="24"/>
-              <w:bottom w:val="single" w:color="FFFFFF" w:sz="24"/>
-              <w:right w:val="single" w:color="FFFFFF" w:sz="24"/>
-            </w:tcBorders>
-            <w:shd w:fill="EFF6F9" w:color="auto" w:val="clear"/>
-            <w:tcMar>
-              <w:top w:type="dxa" w:w="120"/>
-              <w:left w:type="dxa" w:w="140"/>
-              <w:bottom w:type="dxa" w:w="120"/>
-              <w:right w:type="dxa" w:w="140"/>
-            </w:tcMar>
-          </w:tcPr>
-          <w:p>
-            <w:pPr>
-              <w:spacing w:after="60" w:before="0" w:line="264"/>
-              <w:jc w:val="left"/>
-            </w:pPr>
+              <w:t xml:space="preserve">Our </w:t>
+            </w:r>
             <w:r>
               <w:rPr>
                 <w:rFonts w:ascii="Calibri" w:cs="Calibri" w:eastAsia="Calibri" w:hAnsi="Calibri"/>
@@ -1936,186 +2110,11 @@
                 <w:bCs/>
                 <w:i w:val="false"/>
                 <w:iCs w:val="false"/>
-                <w:color w:val="1A939B"/>
-                <w:sz w:val="22"/>
-                <w:szCs w:val="22"/>
-              </w:rPr>
-              <w:t xml:space="preserve">Payroll</w:t>
-            </w:r>
-          </w:p>
-          <w:p>
-            <w:pPr>
-              <w:pStyle w:val="ListParagraph"/>
-              <w:numPr>
-                <w:ilvl w:val="0"/>
-                <w:numId w:val="2"/>
-              </w:numPr>
-              <w:spacing w:after="20" w:before="0" w:line="248"/>
-            </w:pPr>
-            <w:r>
-              <w:rPr>
-                <w:rFonts w:ascii="Calibri" w:cs="Calibri" w:eastAsia="Calibri" w:hAnsi="Calibri"/>
-                <w:b w:val="false"/>
-                <w:bCs w:val="false"/>
-                <w:i w:val="false"/>
-                <w:iCs w:val="false"/>
-                <w:color w:val="0B0B0B"/>
-                <w:sz w:val="18"/>
-                <w:szCs w:val="18"/>
-              </w:rPr>
-              <w:t xml:space="preserve">Who they employ today</w:t>
-            </w:r>
-          </w:p>
-          <w:p>
-            <w:pPr>
-              <w:pStyle w:val="ListParagraph"/>
-              <w:numPr>
-                <w:ilvl w:val="0"/>
-                <w:numId w:val="2"/>
-              </w:numPr>
-              <w:spacing w:after="20" w:before="0" w:line="248"/>
-            </w:pPr>
-            <w:r>
-              <w:rPr>
-                <w:rFonts w:ascii="Calibri" w:cs="Calibri" w:eastAsia="Calibri" w:hAnsi="Calibri"/>
-                <w:b w:val="false"/>
-                <w:bCs w:val="false"/>
-                <w:i w:val="false"/>
-                <w:iCs w:val="false"/>
-                <w:color w:val="0B0B0B"/>
-                <w:sz w:val="18"/>
-                <w:szCs w:val="18"/>
-              </w:rPr>
-              <w:t xml:space="preserve">Current or new market</w:t>
-            </w:r>
-          </w:p>
-          <w:p>
-            <w:pPr>
-              <w:pStyle w:val="ListParagraph"/>
-              <w:numPr>
-                <w:ilvl w:val="0"/>
-                <w:numId w:val="2"/>
-              </w:numPr>
-              <w:spacing w:after="20" w:before="0" w:line="248"/>
-            </w:pPr>
-            <w:r>
-              <w:rPr>
-                <w:rFonts w:ascii="Calibri" w:cs="Calibri" w:eastAsia="Calibri" w:hAnsi="Calibri"/>
-                <w:b w:val="false"/>
-                <w:bCs w:val="false"/>
-                <w:i w:val="false"/>
-                <w:iCs w:val="false"/>
-                <w:color w:val="0B0B0B"/>
-                <w:sz w:val="18"/>
-                <w:szCs w:val="18"/>
-              </w:rPr>
-              <w:t xml:space="preserve">How involved the owners are; what they pay themselves; replacement cost</w:t>
-            </w:r>
-          </w:p>
-        </w:tc>
-        <w:tc>
-          <w:tcPr>
-            <w:tcW w:type="dxa" w:w="3504"/>
-            <w:tcBorders>
-              <w:top w:val="single" w:color="FFFFFF" w:sz="24"/>
-              <w:left w:val="single" w:color="FFFFFF" w:sz="24"/>
-              <w:bottom w:val="single" w:color="FFFFFF" w:sz="24"/>
-              <w:right w:val="single" w:color="FFFFFF" w:sz="24"/>
-            </w:tcBorders>
-            <w:shd w:fill="EFF6F9" w:color="auto" w:val="clear"/>
-            <w:tcMar>
-              <w:top w:type="dxa" w:w="120"/>
-              <w:left w:type="dxa" w:w="140"/>
-              <w:bottom w:type="dxa" w:w="120"/>
-              <w:right w:type="dxa" w:w="140"/>
-            </w:tcMar>
-          </w:tcPr>
-          <w:p>
-            <w:pPr>
-              <w:spacing w:after="60" w:before="0" w:line="264"/>
-              <w:jc w:val="left"/>
-            </w:pPr>
-            <w:r>
-              <w:rPr>
-                <w:rFonts w:ascii="Calibri" w:cs="Calibri" w:eastAsia="Calibri" w:hAnsi="Calibri"/>
-                <w:b/>
-                <w:bCs/>
-                <w:i w:val="false"/>
-                <w:iCs w:val="false"/>
-                <w:color w:val="1A939B"/>
-                <w:sz w:val="22"/>
-                <w:szCs w:val="22"/>
-              </w:rPr>
-              <w:t xml:space="preserve">Operating expenses</w:t>
-            </w:r>
-          </w:p>
-          <w:p>
-            <w:pPr>
-              <w:pStyle w:val="ListParagraph"/>
-              <w:numPr>
-                <w:ilvl w:val="0"/>
-                <w:numId w:val="2"/>
-              </w:numPr>
-              <w:spacing w:after="20" w:before="0" w:line="248"/>
-            </w:pPr>
-            <w:r>
-              <w:rPr>
-                <w:rFonts w:ascii="Calibri" w:cs="Calibri" w:eastAsia="Calibri" w:hAnsi="Calibri"/>
-                <w:b w:val="false"/>
-                <w:bCs w:val="false"/>
-                <w:i w:val="false"/>
-                <w:iCs w:val="false"/>
-                <w:color w:val="0B0B0B"/>
-                <w:sz w:val="18"/>
-                <w:szCs w:val="18"/>
-              </w:rPr>
-              <w:t xml:space="preserve">Switch to our marketing; almost always higher</w:t>
-            </w:r>
-          </w:p>
-          <w:p>
-            <w:pPr>
-              <w:pStyle w:val="ListParagraph"/>
-              <w:numPr>
-                <w:ilvl w:val="0"/>
-                <w:numId w:val="2"/>
-              </w:numPr>
-              <w:spacing w:after="20" w:before="0" w:line="248"/>
-            </w:pPr>
-            <w:r>
-              <w:rPr>
-                <w:rFonts w:ascii="Calibri" w:cs="Calibri" w:eastAsia="Calibri" w:hAnsi="Calibri"/>
-                <w:b w:val="false"/>
-                <w:bCs w:val="false"/>
-                <w:i w:val="false"/>
-                <w:iCs w:val="false"/>
-                <w:color w:val="0B0B0B"/>
-                <w:sz w:val="18"/>
-                <w:szCs w:val="18"/>
-              </w:rPr>
-              <w:t xml:space="preserve">Their utilities and maintenance per event</w:t>
-            </w:r>
-          </w:p>
-          <w:p>
-            <w:pPr>
-              <w:pStyle w:val="ListParagraph"/>
-              <w:numPr>
-                <w:ilvl w:val="0"/>
-                <w:numId w:val="2"/>
-              </w:numPr>
-              <w:spacing w:after="20" w:before="0" w:line="248"/>
-            </w:pPr>
-            <w:r>
-              <w:rPr>
-                <w:rFonts w:ascii="Calibri" w:cs="Calibri" w:eastAsia="Calibri" w:hAnsi="Calibri"/>
-                <w:b w:val="false"/>
-                <w:bCs w:val="false"/>
-                <w:i w:val="false"/>
-                <w:iCs w:val="false"/>
-                <w:color w:val="0B0B0B"/>
-                <w:sz w:val="18"/>
-                <w:szCs w:val="18"/>
-              </w:rPr>
-              <w:t xml:space="preserve">Our insurance, finance expenses, professional services</w:t>
+                <w:color w:val="0B0B0B"/>
+                <w:sz w:val="18"/>
+                <w:szCs w:val="18"/>
+              </w:rPr>
+              <w:t xml:space="preserve">insurance, finance expenses, professional services</w:t>
             </w:r>
           </w:p>
         </w:tc>

</xml_diff>

<commit_message>
Pro forma sheet: apply CEO edits, three-driver tiles, vendor service table
Co-Authored-By: Claude Fable 5.1 <noreply@anthropic.com>
Claude-Session: https://claude.ai/code/session_01H1o2hAHLKnaHhCBRW9ndXv
</commit_message>
<xml_diff>
--- a/docs/proforma-cheatsheet/Pro Forma Sheet.docx
+++ b/docs/proforma-cheatsheet/Pro Forma Sheet.docx
@@ -151,6 +151,25 @@
           </w:p>
           <w:p>
             <w:pPr>
+              <w:spacing w:after="10" w:before="0" w:line="220"/>
+              <w:jc w:val="left"/>
+            </w:pPr>
+            <w:r>
+              <w:rPr>
+                <w:rFonts w:ascii="Calibri" w:cs="Calibri" w:eastAsia="Calibri" w:hAnsi="Calibri"/>
+                <w:b w:val="false"/>
+                <w:bCs w:val="false"/>
+                <w:i/>
+                <w:iCs/>
+                <w:color w:val="1A939B"/>
+                <w:sz w:val="16"/>
+                <w:szCs w:val="16"/>
+              </w:rPr>
+              <w:t xml:space="preserve">vs.</w:t>
+            </w:r>
+          </w:p>
+          <w:p>
+            <w:pPr>
               <w:spacing w:after="30" w:before="0" w:line="240"/>
               <w:jc w:val="left"/>
             </w:pPr>
@@ -226,6 +245,25 @@
           </w:p>
           <w:p>
             <w:pPr>
+              <w:spacing w:after="10" w:before="0" w:line="220"/>
+              <w:jc w:val="left"/>
+            </w:pPr>
+            <w:r>
+              <w:rPr>
+                <w:rFonts w:ascii="Calibri" w:cs="Calibri" w:eastAsia="Calibri" w:hAnsi="Calibri"/>
+                <w:b w:val="false"/>
+                <w:bCs w:val="false"/>
+                <w:i/>
+                <w:iCs/>
+                <w:color w:val="1A939B"/>
+                <w:sz w:val="16"/>
+                <w:szCs w:val="16"/>
+              </w:rPr>
+              <w:t xml:space="preserve">vs.</w:t>
+            </w:r>
+          </w:p>
+          <w:p>
+            <w:pPr>
               <w:spacing w:after="30" w:before="0" w:line="240"/>
               <w:jc w:val="left"/>
             </w:pPr>
@@ -296,7 +334,26 @@
                 <w:sz w:val="18"/>
                 <w:szCs w:val="18"/>
               </w:rPr>
-              <w:t xml:space="preserve">What they offer today vs. what we bring, and how fast</w:t>
+              <w:t xml:space="preserve">What they offer today</w:t>
+            </w:r>
+          </w:p>
+          <w:p>
+            <w:pPr>
+              <w:spacing w:after="10" w:before="0" w:line="220"/>
+              <w:jc w:val="left"/>
+            </w:pPr>
+            <w:r>
+              <w:rPr>
+                <w:rFonts w:ascii="Calibri" w:cs="Calibri" w:eastAsia="Calibri" w:hAnsi="Calibri"/>
+                <w:b w:val="false"/>
+                <w:bCs w:val="false"/>
+                <w:i/>
+                <w:iCs/>
+                <w:color w:val="1A939B"/>
+                <w:sz w:val="16"/>
+                <w:szCs w:val="16"/>
+              </w:rPr>
+              <w:t xml:space="preserve">vs.</w:t>
             </w:r>
           </w:p>
           <w:p>
@@ -315,7 +372,7 @@
                 <w:sz w:val="18"/>
                 <w:szCs w:val="18"/>
               </w:rPr>
-              <w:t xml:space="preserve">Our marketing to drive bookings</w:t>
+              <w:t xml:space="preserve">What we bring</w:t>
             </w:r>
           </w:p>
         </w:tc>
@@ -371,7 +428,7 @@
                 <w:sz w:val="18"/>
                 <w:szCs w:val="18"/>
               </w:rPr>
-              <w:t xml:space="preserve">Overstaffed or understaffed?</w:t>
+              <w:t xml:space="preserve">Overstaffed vs. understaffed</w:t>
             </w:r>
           </w:p>
           <w:p>
@@ -390,7 +447,7 @@
                 <w:sz w:val="18"/>
                 <w:szCs w:val="18"/>
               </w:rPr>
-              <w:t xml:space="preserve">Owner hands-on or hands-off?</w:t>
+              <w:t xml:space="preserve">Owner hands-on vs. hands-off</w:t>
             </w:r>
           </w:p>
         </w:tc>
@@ -426,7 +483,7 @@
       <w:r>
         <w:drawing>
           <wp:inline distT="0" distB="0" distL="0" distR="0">
-            <wp:extent cx="4019550" cy="1457325"/>
+            <wp:extent cx="3752850" cy="1362075"/>
             <wp:effectExtent t="0" r="0" b="0" l="0"/>
             <wp:docPr id="1" name="" descr="" title=""/>
             <wp:cNvGraphicFramePr>
@@ -451,7 +508,7 @@
                   <pic:spPr bwMode="auto">
                     <a:xfrm>
                       <a:off x="0" y="0"/>
-                      <a:ext cx="4019550" cy="1457325"/>
+                      <a:ext cx="3752850" cy="1362075"/>
                     </a:xfrm>
                     <a:prstGeom prst="rect">
                       <a:avLst/>
@@ -514,7 +571,7 @@
                 <w:sz w:val="20"/>
                 <w:szCs w:val="20"/>
               </w:rPr>
-              <w:t xml:space="preserve">Year 1 / 2 / 3</w:t>
+              <w:t xml:space="preserve">Pro Forma Year 1 / 2 / 3</w:t>
             </w:r>
           </w:p>
         </w:tc>
@@ -551,7 +608,7 @@
                 <w:sz w:val="20"/>
                 <w:szCs w:val="20"/>
               </w:rPr>
-              <w:t xml:space="preserve">Pro forma years. Year 1 starts the day we close.</w:t>
+              <w:t xml:space="preserve">Year 1 starts the day we close.</w:t>
             </w:r>
           </w:p>
         </w:tc>
@@ -627,7 +684,7 @@
                 <w:sz w:val="20"/>
                 <w:szCs w:val="20"/>
               </w:rPr>
-              <w:t xml:space="preserve">Original Contract events; booked before we close. We want a healthy count; a year only holds so many.</w:t>
+              <w:t xml:space="preserve">“Original Contract” events; booked prior to close by the sellers to occur post-close. We honor OC events as booked, even if not our model or packaging.</w:t>
             </w:r>
           </w:p>
         </w:tc>
@@ -666,7 +723,7 @@
                 <w:sz w:val="20"/>
                 <w:szCs w:val="20"/>
               </w:rPr>
-              <w:t xml:space="preserve">New contracts</w:t>
+              <w:t xml:space="preserve">“Event” vs. “Contract”</w:t>
             </w:r>
           </w:p>
         </w:tc>
@@ -703,7 +760,7 @@
                 <w:sz w:val="20"/>
                 <w:szCs w:val="20"/>
               </w:rPr>
-              <w:t xml:space="preserve">Events we assume will book after close; they can fall in Year 1, 2 or 3.</w:t>
+              <w:t xml:space="preserve">“Events” in Year 1 occur in Year 1, regardless of when booked. “Contracts” in Year 1 are booked in Year 1, regardless of when they occur. Pre-LOI we only project Events.</w:t>
             </w:r>
           </w:p>
         </w:tc>
@@ -739,7 +796,7 @@
       <w:r>
         <w:drawing>
           <wp:inline distT="0" distB="0" distL="0" distR="0">
-            <wp:extent cx="3752850" cy="1819275"/>
+            <wp:extent cx="3476625" cy="1685925"/>
             <wp:effectExtent t="0" r="0" b="0" l="0"/>
             <wp:docPr id="1" name="" descr="" title=""/>
             <wp:cNvGraphicFramePr>
@@ -764,7 +821,7 @@
                   <pic:spPr bwMode="auto">
                     <a:xfrm>
                       <a:off x="0" y="0"/>
-                      <a:ext cx="3752850" cy="1819275"/>
+                      <a:ext cx="3476625" cy="1685925"/>
                     </a:xfrm>
                     <a:prstGeom prst="rect">
                       <a:avLst/>
@@ -850,7 +907,7 @@
           </w:tcPr>
           <w:p>
             <w:pPr>
-              <w:spacing w:after="20" w:before="0" w:line="240"/>
+              <w:spacing w:after="0" w:before="0" w:line="264"/>
               <w:jc w:val="left"/>
             </w:pPr>
             <w:r>
@@ -864,26 +921,7 @@
                 <w:sz w:val="20"/>
                 <w:szCs w:val="20"/>
               </w:rPr>
-              <w:t xml:space="preserve">Within 90 minutes of our hubs.</w:t>
-            </w:r>
-          </w:p>
-          <w:p>
-            <w:pPr>
-              <w:spacing w:after="0" w:before="0" w:line="240"/>
-              <w:jc w:val="left"/>
-            </w:pPr>
-            <w:r>
-              <w:rPr>
-                <w:rFonts w:ascii="Calibri" w:cs="Calibri" w:eastAsia="Calibri" w:hAnsi="Calibri"/>
-                <w:b w:val="false"/>
-                <w:bCs w:val="false"/>
-                <w:i w:val="false"/>
-                <w:iCs w:val="false"/>
-                <w:color w:val="0B0B0B"/>
-                <w:sz w:val="20"/>
-                <w:szCs w:val="20"/>
-              </w:rPr>
-              <w:t xml:space="preserve">Vendor services modeled in Years 1 to 3 on our ramp.</w:t>
+              <w:t xml:space="preserve">Under a 90-minute drive from each hub (Catering / Floral / Bakery).</w:t>
             </w:r>
           </w:p>
         </w:tc>
@@ -959,12 +997,12 @@
                 <w:sz w:val="20"/>
                 <w:szCs w:val="20"/>
               </w:rPr>
-              <w:t xml:space="preserve">Part of the broader region; likely grouped operationally with it.</w:t>
-            </w:r>
-          </w:p>
-          <w:p>
-            <w:pPr>
-              <w:spacing w:after="20" w:before="0" w:line="240"/>
+              <w:t xml:space="preserve">Part of the broader region, geographically and operationally.</w:t>
+            </w:r>
+          </w:p>
+          <w:p>
+            <w:pPr>
+              <w:spacing w:after="0" w:before="0" w:line="240"/>
               <w:jc w:val="left"/>
             </w:pPr>
             <w:r>
@@ -978,26 +1016,7 @@
                 <w:sz w:val="20"/>
                 <w:szCs w:val="20"/>
               </w:rPr>
-              <w:t xml:space="preserve">Too far to use our hubs, so hub services start at $0.</w:t>
-            </w:r>
-          </w:p>
-          <w:p>
-            <w:pPr>
-              <w:spacing w:after="0" w:before="0" w:line="240"/>
-              <w:jc w:val="left"/>
-            </w:pPr>
-            <w:r>
-              <w:rPr>
-                <w:rFonts w:ascii="Calibri" w:cs="Calibri" w:eastAsia="Calibri" w:hAnsi="Calibri"/>
-                <w:b w:val="false"/>
-                <w:bCs w:val="false"/>
-                <w:i w:val="false"/>
-                <w:iCs w:val="false"/>
-                <w:color w:val="0B0B0B"/>
-                <w:sz w:val="20"/>
-                <w:szCs w:val="20"/>
-              </w:rPr>
-              <w:t xml:space="preserve">Open question: do we grow that direction and add hubs to serve it?</w:t>
+              <w:t xml:space="preserve">Too far to use our hubs.</w:t>
             </w:r>
           </w:p>
         </w:tc>
@@ -1059,7 +1078,7 @@
           </w:tcPr>
           <w:p>
             <w:pPr>
-              <w:spacing w:after="20" w:before="0" w:line="240"/>
+              <w:spacing w:after="0" w:before="0" w:line="264"/>
               <w:jc w:val="left"/>
             </w:pPr>
             <w:r>
@@ -1073,26 +1092,7 @@
                 <w:sz w:val="20"/>
                 <w:szCs w:val="20"/>
               </w:rPr>
-              <w:t xml:space="preserve">The venue has to carry itself.</w:t>
-            </w:r>
-          </w:p>
-          <w:p>
-            <w:pPr>
-              <w:spacing w:after="0" w:before="0" w:line="240"/>
-              <w:jc w:val="left"/>
-            </w:pPr>
-            <w:r>
-              <w:rPr>
-                <w:rFonts w:ascii="Calibri" w:cs="Calibri" w:eastAsia="Calibri" w:hAnsi="Calibri"/>
-                <w:b w:val="false"/>
-                <w:bCs w:val="false"/>
-                <w:i w:val="false"/>
-                <w:iCs w:val="false"/>
-                <w:color w:val="0B0B0B"/>
-                <w:sz w:val="20"/>
-                <w:szCs w:val="20"/>
-              </w:rPr>
-              <w:t xml:space="preserve">Vendor services may be a couple of years out, once volume exists.</w:t>
+              <w:t xml:space="preserve">A full new market for Walters.</w:t>
             </w:r>
           </w:p>
         </w:tc>
@@ -1120,213 +1120,558 @@
         <w:t xml:space="preserve">4. Top-Line Projections</w:t>
       </w:r>
     </w:p>
+    <w:tbl>
+      <w:tblPr>
+        <w:tblW w:type="dxa" w:w="10512"/>
+        <w:tblBorders>
+          <w:top w:val="none" w:color="FFFFFF" w:sz="0"/>
+          <w:left w:val="none" w:color="FFFFFF" w:sz="0"/>
+          <w:bottom w:val="none" w:color="FFFFFF" w:sz="0"/>
+          <w:right w:val="none" w:color="FFFFFF" w:sz="0"/>
+          <w:insideH w:val="single" w:color="auto" w:sz="4"/>
+          <w:insideV w:val="single" w:color="auto" w:sz="4"/>
+        </w:tblBorders>
+      </w:tblPr>
+      <w:tblGrid>
+        <w:gridCol w:w="3504"/>
+        <w:gridCol w:w="3504"/>
+        <w:gridCol w:w="3504"/>
+      </w:tblGrid>
+      <w:tr>
+        <w:tc>
+          <w:tcPr>
+            <w:tcW w:type="dxa" w:w="3504"/>
+            <w:tcBorders>
+              <w:top w:val="single" w:color="FFFFFF" w:sz="24"/>
+              <w:left w:val="single" w:color="FFFFFF" w:sz="24"/>
+              <w:bottom w:val="single" w:color="FFFFFF" w:sz="24"/>
+              <w:right w:val="single" w:color="FFFFFF" w:sz="24"/>
+            </w:tcBorders>
+            <w:shd w:fill="EFF6F9" w:color="auto" w:val="clear"/>
+            <w:tcMar>
+              <w:top w:type="dxa" w:w="100"/>
+              <w:left w:type="dxa" w:w="140"/>
+              <w:bottom w:type="dxa" w:w="100"/>
+              <w:right w:type="dxa" w:w="140"/>
+            </w:tcMar>
+          </w:tcPr>
+          <w:p>
+            <w:pPr>
+              <w:spacing w:after="60" w:before="0" w:line="264"/>
+              <w:jc w:val="left"/>
+            </w:pPr>
+            <w:r>
+              <w:rPr>
+                <w:rFonts w:ascii="Calibri" w:cs="Calibri" w:eastAsia="Calibri" w:hAnsi="Calibri"/>
+                <w:b/>
+                <w:bCs/>
+                <w:i w:val="false"/>
+                <w:iCs w:val="false"/>
+                <w:color w:val="1A939B"/>
+                <w:sz w:val="21"/>
+                <w:szCs w:val="21"/>
+              </w:rPr>
+              <w:t xml:space="preserve"># of Events</w:t>
+            </w:r>
+          </w:p>
+          <w:p>
+            <w:pPr>
+              <w:spacing w:after="30" w:before="0" w:line="240"/>
+              <w:jc w:val="left"/>
+            </w:pPr>
+            <w:r>
+              <w:rPr>
+                <w:rFonts w:ascii="Calibri" w:cs="Calibri" w:eastAsia="Calibri" w:hAnsi="Calibri"/>
+                <w:b w:val="false"/>
+                <w:bCs w:val="false"/>
+                <w:i w:val="false"/>
+                <w:iCs w:val="false"/>
+                <w:color w:val="52514E"/>
+                <w:sz w:val="18"/>
+                <w:szCs w:val="18"/>
+              </w:rPr>
+              <w:t xml:space="preserve">Historical average</w:t>
+            </w:r>
+          </w:p>
+          <w:p>
+            <w:pPr>
+              <w:spacing w:after="30" w:before="0" w:line="240"/>
+              <w:jc w:val="left"/>
+            </w:pPr>
+            <w:r>
+              <w:rPr>
+                <w:rFonts w:ascii="Calibri" w:cs="Calibri" w:eastAsia="Calibri" w:hAnsi="Calibri"/>
+                <w:b w:val="false"/>
+                <w:bCs w:val="false"/>
+                <w:i w:val="false"/>
+                <w:iCs w:val="false"/>
+                <w:color w:val="52514E"/>
+                <w:sz w:val="18"/>
+                <w:szCs w:val="18"/>
+              </w:rPr>
+              <w:t xml:space="preserve">Last 12 months</w:t>
+            </w:r>
+          </w:p>
+          <w:p>
+            <w:pPr>
+              <w:spacing w:after="30" w:before="0" w:line="240"/>
+              <w:jc w:val="left"/>
+            </w:pPr>
+            <w:r>
+              <w:rPr>
+                <w:rFonts w:ascii="Calibri" w:cs="Calibri" w:eastAsia="Calibri" w:hAnsi="Calibri"/>
+                <w:b w:val="false"/>
+                <w:bCs w:val="false"/>
+                <w:i w:val="false"/>
+                <w:iCs w:val="false"/>
+                <w:color w:val="52514E"/>
+                <w:sz w:val="18"/>
+                <w:szCs w:val="18"/>
+              </w:rPr>
+              <w:t xml:space="preserve">Booked next 12 months</w:t>
+            </w:r>
+          </w:p>
+        </w:tc>
+        <w:tc>
+          <w:tcPr>
+            <w:tcW w:type="dxa" w:w="3504"/>
+            <w:tcBorders>
+              <w:top w:val="single" w:color="FFFFFF" w:sz="24"/>
+              <w:left w:val="single" w:color="FFFFFF" w:sz="24"/>
+              <w:bottom w:val="single" w:color="FFFFFF" w:sz="24"/>
+              <w:right w:val="single" w:color="FFFFFF" w:sz="24"/>
+            </w:tcBorders>
+            <w:shd w:fill="EFF6F9" w:color="auto" w:val="clear"/>
+            <w:tcMar>
+              <w:top w:type="dxa" w:w="100"/>
+              <w:left w:type="dxa" w:w="140"/>
+              <w:bottom w:type="dxa" w:w="100"/>
+              <w:right w:type="dxa" w:w="140"/>
+            </w:tcMar>
+          </w:tcPr>
+          <w:p>
+            <w:pPr>
+              <w:spacing w:after="60" w:before="0" w:line="264"/>
+              <w:jc w:val="left"/>
+            </w:pPr>
+            <w:r>
+              <w:rPr>
+                <w:rFonts w:ascii="Calibri" w:cs="Calibri" w:eastAsia="Calibri" w:hAnsi="Calibri"/>
+                <w:b/>
+                <w:bCs/>
+                <w:i w:val="false"/>
+                <w:iCs w:val="false"/>
+                <w:color w:val="1A939B"/>
+                <w:sz w:val="21"/>
+                <w:szCs w:val="21"/>
+              </w:rPr>
+              <w:t xml:space="preserve">% Attachment</w:t>
+            </w:r>
+          </w:p>
+          <w:p>
+            <w:pPr>
+              <w:spacing w:after="30" w:before="0" w:line="240"/>
+              <w:jc w:val="left"/>
+            </w:pPr>
+            <w:r>
+              <w:rPr>
+                <w:rFonts w:ascii="Calibri" w:cs="Calibri" w:eastAsia="Calibri" w:hAnsi="Calibri"/>
+                <w:b w:val="false"/>
+                <w:bCs w:val="false"/>
+                <w:i w:val="false"/>
+                <w:iCs w:val="false"/>
+                <w:color w:val="52514E"/>
+                <w:sz w:val="18"/>
+                <w:szCs w:val="18"/>
+              </w:rPr>
+              <w:t xml:space="preserve">Share of events that add each vendor service</w:t>
+            </w:r>
+          </w:p>
+        </w:tc>
+        <w:tc>
+          <w:tcPr>
+            <w:tcW w:type="dxa" w:w="3504"/>
+            <w:tcBorders>
+              <w:top w:val="single" w:color="FFFFFF" w:sz="24"/>
+              <w:left w:val="single" w:color="FFFFFF" w:sz="24"/>
+              <w:bottom w:val="single" w:color="FFFFFF" w:sz="24"/>
+              <w:right w:val="single" w:color="FFFFFF" w:sz="24"/>
+            </w:tcBorders>
+            <w:shd w:fill="EFF6F9" w:color="auto" w:val="clear"/>
+            <w:tcMar>
+              <w:top w:type="dxa" w:w="100"/>
+              <w:left w:type="dxa" w:w="140"/>
+              <w:bottom w:type="dxa" w:w="100"/>
+              <w:right w:type="dxa" w:w="140"/>
+            </w:tcMar>
+          </w:tcPr>
+          <w:p>
+            <w:pPr>
+              <w:spacing w:after="60" w:before="0" w:line="264"/>
+              <w:jc w:val="left"/>
+            </w:pPr>
+            <w:r>
+              <w:rPr>
+                <w:rFonts w:ascii="Calibri" w:cs="Calibri" w:eastAsia="Calibri" w:hAnsi="Calibri"/>
+                <w:b/>
+                <w:bCs/>
+                <w:i w:val="false"/>
+                <w:iCs w:val="false"/>
+                <w:color w:val="1A939B"/>
+                <w:sz w:val="21"/>
+                <w:szCs w:val="21"/>
+              </w:rPr>
+              <w:t xml:space="preserve">$ / Event</w:t>
+            </w:r>
+          </w:p>
+          <w:p>
+            <w:pPr>
+              <w:spacing w:after="30" w:before="0" w:line="240"/>
+              <w:jc w:val="left"/>
+            </w:pPr>
+            <w:r>
+              <w:rPr>
+                <w:rFonts w:ascii="Calibri" w:cs="Calibri" w:eastAsia="Calibri" w:hAnsi="Calibri"/>
+                <w:b w:val="false"/>
+                <w:bCs w:val="false"/>
+                <w:i w:val="false"/>
+                <w:iCs w:val="false"/>
+                <w:color w:val="52514E"/>
+                <w:sz w:val="18"/>
+                <w:szCs w:val="18"/>
+              </w:rPr>
+              <w:t xml:space="preserve">Spend per event on each vendor service</w:t>
+            </w:r>
+          </w:p>
+        </w:tc>
+      </w:tr>
+    </w:tbl>
     <w:p>
       <w:pPr>
-        <w:spacing w:after="40" w:before="60" w:line="264"/>
-        <w:jc w:val="left"/>
-      </w:pPr>
-      <w:r>
-        <w:rPr>
-          <w:rFonts w:ascii="Calibri" w:cs="Calibri" w:eastAsia="Calibri" w:hAnsi="Calibri"/>
-          <w:b/>
-          <w:bCs/>
-          <w:i w:val="false"/>
-          <w:iCs w:val="false"/>
-          <w:color w:val="1A939B"/>
-          <w:sz w:val="23"/>
-          <w:szCs w:val="23"/>
-        </w:rPr>
-        <w:t xml:space="preserve">Events</w:t>
-      </w:r>
+        <w:spacing w:after="60" w:before="0"/>
+      </w:pPr>
     </w:p>
-    <w:p>
-      <w:pPr>
-        <w:pStyle w:val="ListParagraph"/>
-        <w:numPr>
-          <w:ilvl w:val="0"/>
-          <w:numId w:val="2"/>
-        </w:numPr>
-        <w:spacing w:after="30" w:before="0" w:line="248"/>
-      </w:pPr>
-      <w:r>
-        <w:rPr>
-          <w:rFonts w:ascii="Calibri" w:cs="Calibri" w:eastAsia="Calibri" w:hAnsi="Calibri"/>
-          <w:b w:val="false"/>
-          <w:bCs w:val="false"/>
-          <w:i w:val="false"/>
-          <w:iCs w:val="false"/>
-          <w:color w:val="0B0B0B"/>
-          <w:sz w:val="19"/>
-          <w:szCs w:val="19"/>
-        </w:rPr>
-        <w:t xml:space="preserve">Historical average per year</w:t>
-      </w:r>
-    </w:p>
-    <w:p>
-      <w:pPr>
-        <w:pStyle w:val="ListParagraph"/>
-        <w:numPr>
-          <w:ilvl w:val="0"/>
-          <w:numId w:val="2"/>
-        </w:numPr>
-        <w:spacing w:after="30" w:before="0" w:line="248"/>
-      </w:pPr>
-      <w:r>
-        <w:rPr>
-          <w:rFonts w:ascii="Calibri" w:cs="Calibri" w:eastAsia="Calibri" w:hAnsi="Calibri"/>
-          <w:b w:val="false"/>
-          <w:bCs w:val="false"/>
-          <w:i w:val="false"/>
-          <w:iCs w:val="false"/>
-          <w:color w:val="0B0B0B"/>
-          <w:sz w:val="19"/>
-          <w:szCs w:val="19"/>
-        </w:rPr>
-        <w:t xml:space="preserve">Last 12 months</w:t>
-      </w:r>
-    </w:p>
-    <w:p>
-      <w:pPr>
-        <w:pStyle w:val="ListParagraph"/>
-        <w:numPr>
-          <w:ilvl w:val="0"/>
-          <w:numId w:val="2"/>
-        </w:numPr>
-        <w:spacing w:after="30" w:before="0" w:line="248"/>
-      </w:pPr>
-      <w:r>
-        <w:rPr>
-          <w:rFonts w:ascii="Calibri" w:cs="Calibri" w:eastAsia="Calibri" w:hAnsi="Calibri"/>
-          <w:b w:val="false"/>
-          <w:bCs w:val="false"/>
-          <w:i w:val="false"/>
-          <w:iCs w:val="false"/>
-          <w:color w:val="0B0B0B"/>
-          <w:sz w:val="19"/>
-          <w:szCs w:val="19"/>
-        </w:rPr>
-        <w:t xml:space="preserve">Booked for the next 12 months</w:t>
-      </w:r>
-    </w:p>
-    <w:p>
-      <w:pPr>
-        <w:pBdr>
-          <w:bottom w:val="single" w:color="B7DCDF" w:sz="4" w:space="1"/>
-        </w:pBdr>
-        <w:spacing w:after="40" w:before="30"/>
-      </w:pPr>
-    </w:p>
-    <w:p>
-      <w:pPr>
-        <w:spacing w:after="40" w:before="60" w:line="264"/>
-        <w:jc w:val="left"/>
-      </w:pPr>
-      <w:r>
-        <w:rPr>
-          <w:rFonts w:ascii="Calibri" w:cs="Calibri" w:eastAsia="Calibri" w:hAnsi="Calibri"/>
-          <w:b/>
-          <w:bCs/>
-          <w:i w:val="false"/>
-          <w:iCs w:val="false"/>
-          <w:color w:val="1A939B"/>
-          <w:sz w:val="23"/>
-          <w:szCs w:val="23"/>
-        </w:rPr>
-        <w:t xml:space="preserve">Revenue / Vendor Services</w:t>
-      </w:r>
-    </w:p>
-    <w:p>
-      <w:pPr>
-        <w:pStyle w:val="ListParagraph"/>
-        <w:numPr>
-          <w:ilvl w:val="0"/>
-          <w:numId w:val="2"/>
-        </w:numPr>
-        <w:spacing w:after="30" w:before="0" w:line="248"/>
-      </w:pPr>
-      <w:r>
-        <w:rPr>
-          <w:rFonts w:ascii="Calibri" w:cs="Calibri" w:eastAsia="Calibri" w:hAnsi="Calibri"/>
-          <w:b w:val="false"/>
-          <w:bCs w:val="false"/>
-          <w:i w:val="false"/>
-          <w:iCs w:val="false"/>
-          <w:color w:val="0B0B0B"/>
-          <w:sz w:val="19"/>
-          <w:szCs w:val="19"/>
-        </w:rPr>
-        <w:t xml:space="preserve">Photography / DJ / Stationery: quick to implement</w:t>
-      </w:r>
-    </w:p>
-    <w:p>
-      <w:pPr>
-        <w:pStyle w:val="ListParagraph"/>
-        <w:numPr>
-          <w:ilvl w:val="0"/>
-          <w:numId w:val="2"/>
-        </w:numPr>
-        <w:spacing w:after="30" w:before="0" w:line="248"/>
-      </w:pPr>
-      <w:r>
-        <w:rPr>
-          <w:rFonts w:ascii="Calibri" w:cs="Calibri" w:eastAsia="Calibri" w:hAnsi="Calibri"/>
-          <w:b w:val="false"/>
-          <w:bCs w:val="false"/>
-          <w:i w:val="false"/>
-          <w:iCs w:val="false"/>
-          <w:color w:val="0B0B0B"/>
-          <w:sz w:val="19"/>
-          <w:szCs w:val="19"/>
-        </w:rPr>
-        <w:t xml:space="preserve">Bar: on/off switch once we hold the liquor license</w:t>
-      </w:r>
-    </w:p>
-    <w:p>
-      <w:pPr>
-        <w:pStyle w:val="ListParagraph"/>
-        <w:numPr>
-          <w:ilvl w:val="0"/>
-          <w:numId w:val="2"/>
-        </w:numPr>
-        <w:spacing w:after="30" w:before="0" w:line="248"/>
-      </w:pPr>
-      <w:r>
-        <w:rPr>
-          <w:rFonts w:ascii="Calibri" w:cs="Calibri" w:eastAsia="Calibri" w:hAnsi="Calibri"/>
-          <w:b w:val="false"/>
-          <w:bCs w:val="false"/>
-          <w:i w:val="false"/>
-          <w:iCs w:val="false"/>
-          <w:color w:val="0B0B0B"/>
-          <w:sz w:val="19"/>
-          <w:szCs w:val="19"/>
-        </w:rPr>
-        <w:t xml:space="preserve">Catering: attach gradually; test it</w:t>
-      </w:r>
-    </w:p>
-    <w:p>
-      <w:pPr>
-        <w:pStyle w:val="ListParagraph"/>
-        <w:numPr>
-          <w:ilvl w:val="0"/>
-          <w:numId w:val="2"/>
-        </w:numPr>
-        <w:spacing w:after="30" w:before="0" w:line="248"/>
-      </w:pPr>
-      <w:r>
-        <w:rPr>
-          <w:rFonts w:ascii="Calibri" w:cs="Calibri" w:eastAsia="Calibri" w:hAnsi="Calibri"/>
-          <w:b w:val="false"/>
-          <w:bCs w:val="false"/>
-          <w:i w:val="false"/>
-          <w:iCs w:val="false"/>
-          <w:color w:val="0B0B0B"/>
-          <w:sz w:val="19"/>
-          <w:szCs w:val="19"/>
-        </w:rPr>
-        <w:t xml:space="preserve">Floral / Bakery: depends on hub distance</w:t>
-      </w:r>
-    </w:p>
+    <w:tbl>
+      <w:tblPr>
+        <w:tblW w:type="dxa" w:w="10512"/>
+        <w:tblBorders>
+          <w:top w:val="none" w:color="FFFFFF" w:sz="0"/>
+          <w:left w:val="none" w:color="FFFFFF" w:sz="0"/>
+          <w:bottom w:val="none" w:color="FFFFFF" w:sz="0"/>
+          <w:right w:val="none" w:color="FFFFFF" w:sz="0"/>
+          <w:insideH w:val="single" w:color="auto" w:sz="4"/>
+          <w:insideV w:val="single" w:color="auto" w:sz="4"/>
+        </w:tblBorders>
+      </w:tblPr>
+      <w:tblGrid>
+        <w:gridCol w:w="3300"/>
+        <w:gridCol w:w="7212"/>
+      </w:tblGrid>
+      <w:tr>
+        <w:tc>
+          <w:tcPr>
+            <w:tcW w:type="dxa" w:w="3300"/>
+            <w:tcBorders>
+              <w:top w:val="single" w:color="FFFFFF" w:sz="24"/>
+              <w:left w:val="single" w:color="FFFFFF" w:sz="24"/>
+              <w:bottom w:val="single" w:color="FFFFFF" w:sz="24"/>
+              <w:right w:val="single" w:color="FFFFFF" w:sz="24"/>
+            </w:tcBorders>
+            <w:shd w:fill="EFF6F9" w:color="auto" w:val="clear"/>
+            <w:tcMar>
+              <w:top w:type="dxa" w:w="60"/>
+              <w:left w:type="dxa" w:w="140"/>
+              <w:bottom w:type="dxa" w:w="60"/>
+              <w:right w:type="dxa" w:w="140"/>
+            </w:tcMar>
+          </w:tcPr>
+          <w:p>
+            <w:pPr>
+              <w:spacing w:after="0" w:before="0" w:line="264"/>
+              <w:jc w:val="left"/>
+            </w:pPr>
+            <w:r>
+              <w:rPr>
+                <w:rFonts w:ascii="Calibri" w:cs="Calibri" w:eastAsia="Calibri" w:hAnsi="Calibri"/>
+                <w:b/>
+                <w:bCs/>
+                <w:i w:val="false"/>
+                <w:iCs w:val="false"/>
+                <w:color w:val="1A939B"/>
+                <w:sz w:val="20"/>
+                <w:szCs w:val="20"/>
+              </w:rPr>
+              <w:t xml:space="preserve">Bar</w:t>
+            </w:r>
+          </w:p>
+        </w:tc>
+        <w:tc>
+          <w:tcPr>
+            <w:tcW w:type="dxa" w:w="7212"/>
+            <w:tcBorders>
+              <w:top w:val="single" w:color="FFFFFF" w:sz="24"/>
+              <w:left w:val="single" w:color="FFFFFF" w:sz="24"/>
+              <w:bottom w:val="single" w:color="FFFFFF" w:sz="24"/>
+              <w:right w:val="single" w:color="FFFFFF" w:sz="24"/>
+            </w:tcBorders>
+            <w:shd w:fill="F7F7F5" w:color="auto" w:val="clear"/>
+            <w:tcMar>
+              <w:top w:type="dxa" w:w="60"/>
+              <w:left w:type="dxa" w:w="140"/>
+              <w:bottom w:type="dxa" w:w="60"/>
+              <w:right w:type="dxa" w:w="140"/>
+            </w:tcMar>
+          </w:tcPr>
+          <w:p>
+            <w:pPr>
+              <w:spacing w:after="0" w:before="0" w:line="264"/>
+              <w:jc w:val="left"/>
+            </w:pPr>
+            <w:r>
+              <w:rPr>
+                <w:rFonts w:ascii="Calibri" w:cs="Calibri" w:eastAsia="Calibri" w:hAnsi="Calibri"/>
+                <w:b w:val="false"/>
+                <w:bCs w:val="false"/>
+                <w:i w:val="false"/>
+                <w:iCs w:val="false"/>
+                <w:color w:val="0B0B0B"/>
+                <w:sz w:val="20"/>
+                <w:szCs w:val="20"/>
+              </w:rPr>
+              <w:t xml:space="preserve">On/off switch once we hold the liquor license.</w:t>
+            </w:r>
+          </w:p>
+        </w:tc>
+      </w:tr>
+      <w:tr>
+        <w:tc>
+          <w:tcPr>
+            <w:tcW w:type="dxa" w:w="3300"/>
+            <w:tcBorders>
+              <w:top w:val="single" w:color="FFFFFF" w:sz="24"/>
+              <w:left w:val="single" w:color="FFFFFF" w:sz="24"/>
+              <w:bottom w:val="single" w:color="FFFFFF" w:sz="24"/>
+              <w:right w:val="single" w:color="FFFFFF" w:sz="24"/>
+            </w:tcBorders>
+            <w:shd w:fill="EFF6F9" w:color="auto" w:val="clear"/>
+            <w:tcMar>
+              <w:top w:type="dxa" w:w="60"/>
+              <w:left w:type="dxa" w:w="140"/>
+              <w:bottom w:type="dxa" w:w="60"/>
+              <w:right w:type="dxa" w:w="140"/>
+            </w:tcMar>
+          </w:tcPr>
+          <w:p>
+            <w:pPr>
+              <w:spacing w:after="0" w:before="0" w:line="264"/>
+              <w:jc w:val="left"/>
+            </w:pPr>
+            <w:r>
+              <w:rPr>
+                <w:rFonts w:ascii="Calibri" w:cs="Calibri" w:eastAsia="Calibri" w:hAnsi="Calibri"/>
+                <w:b/>
+                <w:bCs/>
+                <w:i w:val="false"/>
+                <w:iCs w:val="false"/>
+                <w:color w:val="1A939B"/>
+                <w:sz w:val="20"/>
+                <w:szCs w:val="20"/>
+              </w:rPr>
+              <w:t xml:space="preserve">Catering</w:t>
+            </w:r>
+          </w:p>
+        </w:tc>
+        <w:tc>
+          <w:tcPr>
+            <w:tcW w:type="dxa" w:w="7212"/>
+            <w:tcBorders>
+              <w:top w:val="single" w:color="FFFFFF" w:sz="24"/>
+              <w:left w:val="single" w:color="FFFFFF" w:sz="24"/>
+              <w:bottom w:val="single" w:color="FFFFFF" w:sz="24"/>
+              <w:right w:val="single" w:color="FFFFFF" w:sz="24"/>
+            </w:tcBorders>
+            <w:shd w:fill="F7F7F5" w:color="auto" w:val="clear"/>
+            <w:tcMar>
+              <w:top w:type="dxa" w:w="60"/>
+              <w:left w:type="dxa" w:w="140"/>
+              <w:bottom w:type="dxa" w:w="60"/>
+              <w:right w:type="dxa" w:w="140"/>
+            </w:tcMar>
+          </w:tcPr>
+          <w:p>
+            <w:pPr>
+              <w:spacing w:after="0" w:before="0" w:line="264"/>
+              <w:jc w:val="left"/>
+            </w:pPr>
+            <w:r>
+              <w:rPr>
+                <w:rFonts w:ascii="Calibri" w:cs="Calibri" w:eastAsia="Calibri" w:hAnsi="Calibri"/>
+                <w:b w:val="false"/>
+                <w:bCs w:val="false"/>
+                <w:i w:val="false"/>
+                <w:iCs w:val="false"/>
+                <w:color w:val="0B0B0B"/>
+                <w:sz w:val="20"/>
+                <w:szCs w:val="20"/>
+              </w:rPr>
+              <w:t xml:space="preserve">Attach gradually; test it.</w:t>
+            </w:r>
+          </w:p>
+        </w:tc>
+      </w:tr>
+      <w:tr>
+        <w:tc>
+          <w:tcPr>
+            <w:tcW w:type="dxa" w:w="3300"/>
+            <w:tcBorders>
+              <w:top w:val="single" w:color="FFFFFF" w:sz="24"/>
+              <w:left w:val="single" w:color="FFFFFF" w:sz="24"/>
+              <w:bottom w:val="single" w:color="FFFFFF" w:sz="24"/>
+              <w:right w:val="single" w:color="FFFFFF" w:sz="24"/>
+            </w:tcBorders>
+            <w:shd w:fill="EFF6F9" w:color="auto" w:val="clear"/>
+            <w:tcMar>
+              <w:top w:type="dxa" w:w="60"/>
+              <w:left w:type="dxa" w:w="140"/>
+              <w:bottom w:type="dxa" w:w="60"/>
+              <w:right w:type="dxa" w:w="140"/>
+            </w:tcMar>
+          </w:tcPr>
+          <w:p>
+            <w:pPr>
+              <w:spacing w:after="0" w:before="0" w:line="264"/>
+              <w:jc w:val="left"/>
+            </w:pPr>
+            <w:r>
+              <w:rPr>
+                <w:rFonts w:ascii="Calibri" w:cs="Calibri" w:eastAsia="Calibri" w:hAnsi="Calibri"/>
+                <w:b/>
+                <w:bCs/>
+                <w:i w:val="false"/>
+                <w:iCs w:val="false"/>
+                <w:color w:val="1A939B"/>
+                <w:sz w:val="20"/>
+                <w:szCs w:val="20"/>
+              </w:rPr>
+              <w:t xml:space="preserve">Floral / Bakery</w:t>
+            </w:r>
+          </w:p>
+        </w:tc>
+        <w:tc>
+          <w:tcPr>
+            <w:tcW w:type="dxa" w:w="7212"/>
+            <w:tcBorders>
+              <w:top w:val="single" w:color="FFFFFF" w:sz="24"/>
+              <w:left w:val="single" w:color="FFFFFF" w:sz="24"/>
+              <w:bottom w:val="single" w:color="FFFFFF" w:sz="24"/>
+              <w:right w:val="single" w:color="FFFFFF" w:sz="24"/>
+            </w:tcBorders>
+            <w:shd w:fill="F7F7F5" w:color="auto" w:val="clear"/>
+            <w:tcMar>
+              <w:top w:type="dxa" w:w="60"/>
+              <w:left w:type="dxa" w:w="140"/>
+              <w:bottom w:type="dxa" w:w="60"/>
+              <w:right w:type="dxa" w:w="140"/>
+            </w:tcMar>
+          </w:tcPr>
+          <w:p>
+            <w:pPr>
+              <w:spacing w:after="0" w:before="0" w:line="264"/>
+              <w:jc w:val="left"/>
+            </w:pPr>
+            <w:r>
+              <w:rPr>
+                <w:rFonts w:ascii="Calibri" w:cs="Calibri" w:eastAsia="Calibri" w:hAnsi="Calibri"/>
+                <w:b w:val="false"/>
+                <w:bCs w:val="false"/>
+                <w:i w:val="false"/>
+                <w:iCs w:val="false"/>
+                <w:color w:val="0B0B0B"/>
+                <w:sz w:val="20"/>
+                <w:szCs w:val="20"/>
+              </w:rPr>
+              <w:t xml:space="preserve">Depends on hub distance.</w:t>
+            </w:r>
+          </w:p>
+        </w:tc>
+      </w:tr>
+      <w:tr>
+        <w:tc>
+          <w:tcPr>
+            <w:tcW w:type="dxa" w:w="3300"/>
+            <w:tcBorders>
+              <w:top w:val="single" w:color="FFFFFF" w:sz="24"/>
+              <w:left w:val="single" w:color="FFFFFF" w:sz="24"/>
+              <w:bottom w:val="single" w:color="FFFFFF" w:sz="24"/>
+              <w:right w:val="single" w:color="FFFFFF" w:sz="24"/>
+            </w:tcBorders>
+            <w:shd w:fill="EFF6F9" w:color="auto" w:val="clear"/>
+            <w:tcMar>
+              <w:top w:type="dxa" w:w="60"/>
+              <w:left w:type="dxa" w:w="140"/>
+              <w:bottom w:type="dxa" w:w="60"/>
+              <w:right w:type="dxa" w:w="140"/>
+            </w:tcMar>
+          </w:tcPr>
+          <w:p>
+            <w:pPr>
+              <w:spacing w:after="0" w:before="0" w:line="264"/>
+              <w:jc w:val="left"/>
+            </w:pPr>
+            <w:r>
+              <w:rPr>
+                <w:rFonts w:ascii="Calibri" w:cs="Calibri" w:eastAsia="Calibri" w:hAnsi="Calibri"/>
+                <w:b/>
+                <w:bCs/>
+                <w:i w:val="false"/>
+                <w:iCs w:val="false"/>
+                <w:color w:val="1A939B"/>
+                <w:sz w:val="20"/>
+                <w:szCs w:val="20"/>
+              </w:rPr>
+              <w:t xml:space="preserve">Photography / DJ / Stationery</w:t>
+            </w:r>
+          </w:p>
+        </w:tc>
+        <w:tc>
+          <w:tcPr>
+            <w:tcW w:type="dxa" w:w="7212"/>
+            <w:tcBorders>
+              <w:top w:val="single" w:color="FFFFFF" w:sz="24"/>
+              <w:left w:val="single" w:color="FFFFFF" w:sz="24"/>
+              <w:bottom w:val="single" w:color="FFFFFF" w:sz="24"/>
+              <w:right w:val="single" w:color="FFFFFF" w:sz="24"/>
+            </w:tcBorders>
+            <w:shd w:fill="F7F7F5" w:color="auto" w:val="clear"/>
+            <w:tcMar>
+              <w:top w:type="dxa" w:w="60"/>
+              <w:left w:type="dxa" w:w="140"/>
+              <w:bottom w:type="dxa" w:w="60"/>
+              <w:right w:type="dxa" w:w="140"/>
+            </w:tcMar>
+          </w:tcPr>
+          <w:p>
+            <w:pPr>
+              <w:spacing w:after="0" w:before="0" w:line="264"/>
+              <w:jc w:val="left"/>
+            </w:pPr>
+            <w:r>
+              <w:rPr>
+                <w:rFonts w:ascii="Calibri" w:cs="Calibri" w:eastAsia="Calibri" w:hAnsi="Calibri"/>
+                <w:b w:val="false"/>
+                <w:bCs w:val="false"/>
+                <w:i w:val="false"/>
+                <w:iCs w:val="false"/>
+                <w:color w:val="0B0B0B"/>
+                <w:sz w:val="20"/>
+                <w:szCs w:val="20"/>
+              </w:rPr>
+              <w:t xml:space="preserve">Quick to implement.</w:t>
+            </w:r>
+          </w:p>
+        </w:tc>
+      </w:tr>
+    </w:tbl>
     <w:p>
       <w:pPr>
         <w:pBdr>
@@ -1513,56 +1858,6 @@
           <w:szCs w:val="19"/>
         </w:rPr>
         <w:t xml:space="preserve">Sanity-check against what couples at that venue actually spend</w:t>
-      </w:r>
-    </w:p>
-    <w:p>
-      <w:pPr>
-        <w:pBdr>
-          <w:bottom w:val="single" w:color="B7DCDF" w:sz="4" w:space="1"/>
-        </w:pBdr>
-        <w:spacing w:after="40" w:before="30"/>
-      </w:pPr>
-    </w:p>
-    <w:p>
-      <w:pPr>
-        <w:spacing w:after="30" w:before="80" w:line="264"/>
-        <w:jc w:val="left"/>
-      </w:pPr>
-      <w:r>
-        <w:rPr>
-          <w:rFonts w:ascii="Calibri" w:cs="Calibri" w:eastAsia="Calibri" w:hAnsi="Calibri"/>
-          <w:b/>
-          <w:bCs/>
-          <w:i w:val="false"/>
-          <w:iCs w:val="false"/>
-          <w:color w:val="0B0B0B"/>
-          <w:sz w:val="20"/>
-          <w:szCs w:val="20"/>
-        </w:rPr>
-        <w:t xml:space="preserve">Don't "Walterize" too fast</w:t>
-      </w:r>
-    </w:p>
-    <w:p>
-      <w:pPr>
-        <w:pStyle w:val="ListParagraph"/>
-        <w:numPr>
-          <w:ilvl w:val="0"/>
-          <w:numId w:val="2"/>
-        </w:numPr>
-        <w:spacing w:after="30" w:before="0" w:line="248"/>
-      </w:pPr>
-      <w:r>
-        <w:rPr>
-          <w:rFonts w:ascii="Calibri" w:cs="Calibri" w:eastAsia="Calibri" w:hAnsi="Calibri"/>
-          <w:b w:val="false"/>
-          <w:bCs w:val="false"/>
-          <w:i w:val="false"/>
-          <w:iCs w:val="false"/>
-          <w:color w:val="0B0B0B"/>
-          <w:sz w:val="19"/>
-          <w:szCs w:val="19"/>
-        </w:rPr>
-        <w:t xml:space="preserve">Test and attach gradually; catering is not 100% on day one</w:t>
       </w:r>
     </w:p>
     <w:p>

</xml_diff>

<commit_message>
Pro forma sheet: apply second round of CEO edits
Co-Authored-By: Claude Fable 5.1 <noreply@anthropic.com>
Claude-Session: https://claude.ai/code/session_01H1o2hAHLKnaHhCBRW9ndXv
</commit_message>
<xml_diff>
--- a/docs/proforma-cheatsheet/Pro Forma Sheet.docx
+++ b/docs/proforma-cheatsheet/Pro Forma Sheet.docx
@@ -18,7 +18,7 @@
           <w:sz w:val="40"/>
           <w:szCs w:val="40"/>
         </w:rPr>
-        <w:t xml:space="preserve">Pro Forma Sheet</w:t>
+        <w:t xml:space="preserve">Pro Forma Cheat Sheet</w:t>
       </w:r>
     </w:p>
     <w:p>
@@ -684,7 +684,7 @@
                 <w:sz w:val="20"/>
                 <w:szCs w:val="20"/>
               </w:rPr>
-              <w:t xml:space="preserve">“Original Contract” events; booked prior to close by the sellers to occur post-close. We honor OC events as booked, even if not our model or packaging.</w:t>
+              <w:t xml:space="preserve">“Original Contract” events; booked prior to close by the sellers to occur post-close. We honor OC events as-is.</w:t>
             </w:r>
           </w:p>
         </w:tc>
@@ -746,7 +746,7 @@
           </w:tcPr>
           <w:p>
             <w:pPr>
-              <w:spacing w:after="0" w:before="0" w:line="264"/>
+              <w:spacing w:after="20" w:before="0" w:line="240"/>
               <w:jc w:val="left"/>
             </w:pPr>
             <w:r>
@@ -760,7 +760,45 @@
                 <w:sz w:val="20"/>
                 <w:szCs w:val="20"/>
               </w:rPr>
-              <w:t xml:space="preserve">“Events” in Year 1 occur in Year 1, regardless of when booked. “Contracts” in Year 1 are booked in Year 1, regardless of when they occur. Pre-LOI we only project Events.</w:t>
+              <w:t xml:space="preserve">“Events” in Year 1 occur in Year 1.</w:t>
+            </w:r>
+          </w:p>
+          <w:p>
+            <w:pPr>
+              <w:spacing w:after="20" w:before="0" w:line="240"/>
+              <w:jc w:val="left"/>
+            </w:pPr>
+            <w:r>
+              <w:rPr>
+                <w:rFonts w:ascii="Calibri" w:cs="Calibri" w:eastAsia="Calibri" w:hAnsi="Calibri"/>
+                <w:b w:val="false"/>
+                <w:bCs w:val="false"/>
+                <w:i w:val="false"/>
+                <w:iCs w:val="false"/>
+                <w:color w:val="0B0B0B"/>
+                <w:sz w:val="20"/>
+                <w:szCs w:val="20"/>
+              </w:rPr>
+              <w:t xml:space="preserve">“Contracts” in Year 1 are events booked in Year 1.</w:t>
+            </w:r>
+          </w:p>
+          <w:p>
+            <w:pPr>
+              <w:spacing w:after="0" w:before="0" w:line="240"/>
+              <w:jc w:val="left"/>
+            </w:pPr>
+            <w:r>
+              <w:rPr>
+                <w:rFonts w:ascii="Calibri" w:cs="Calibri" w:eastAsia="Calibri" w:hAnsi="Calibri"/>
+                <w:b w:val="false"/>
+                <w:bCs w:val="false"/>
+                <w:i w:val="false"/>
+                <w:iCs w:val="false"/>
+                <w:color w:val="0B0B0B"/>
+                <w:sz w:val="20"/>
+                <w:szCs w:val="20"/>
+              </w:rPr>
+              <w:t xml:space="preserve">We only project Events pre-LOI.</w:t>
             </w:r>
           </w:p>
         </w:tc>
@@ -921,7 +959,7 @@
                 <w:sz w:val="20"/>
                 <w:szCs w:val="20"/>
               </w:rPr>
-              <w:t xml:space="preserve">Under a 90-minute drive from each hub (Catering / Floral / Bakery).</w:t>
+              <w:t xml:space="preserve">&lt;90-minute drive from each hub (Catering / Floral / Bakery).</w:t>
             </w:r>
           </w:p>
         </w:tc>
@@ -1016,7 +1054,7 @@
                 <w:sz w:val="20"/>
                 <w:szCs w:val="20"/>
               </w:rPr>
-              <w:t xml:space="preserve">Too far to use our hubs.</w:t>
+              <w:t xml:space="preserve">Too far to utilize existing hubs.</w:t>
             </w:r>
           </w:p>
         </w:tc>
@@ -1092,7 +1130,7 @@
                 <w:sz w:val="20"/>
                 <w:szCs w:val="20"/>
               </w:rPr>
-              <w:t xml:space="preserve">A full new market for Walters.</w:t>
+              <w:t xml:space="preserve">A new region for Walters.</w:t>
             </w:r>
           </w:p>
         </w:tc>
@@ -1190,7 +1228,7 @@
                 <w:sz w:val="18"/>
                 <w:szCs w:val="18"/>
               </w:rPr>
-              <w:t xml:space="preserve">Historical average</w:t>
+              <w:t xml:space="preserve">Historical average?</w:t>
             </w:r>
           </w:p>
           <w:p>
@@ -1209,26 +1247,7 @@
                 <w:sz w:val="18"/>
                 <w:szCs w:val="18"/>
               </w:rPr>
-              <w:t xml:space="preserve">Last 12 months</w:t>
-            </w:r>
-          </w:p>
-          <w:p>
-            <w:pPr>
-              <w:spacing w:after="30" w:before="0" w:line="240"/>
-              <w:jc w:val="left"/>
-            </w:pPr>
-            <w:r>
-              <w:rPr>
-                <w:rFonts w:ascii="Calibri" w:cs="Calibri" w:eastAsia="Calibri" w:hAnsi="Calibri"/>
-                <w:b w:val="false"/>
-                <w:bCs w:val="false"/>
-                <w:i w:val="false"/>
-                <w:iCs w:val="false"/>
-                <w:color w:val="52514E"/>
-                <w:sz w:val="18"/>
-                <w:szCs w:val="18"/>
-              </w:rPr>
-              <w:t xml:space="preserve">Booked next 12 months</w:t>
+              <w:t xml:space="preserve">LTM vs. NTM?</w:t>
             </w:r>
           </w:p>
         </w:tc>
@@ -1284,7 +1303,7 @@
                 <w:sz w:val="18"/>
                 <w:szCs w:val="18"/>
               </w:rPr>
-              <w:t xml:space="preserve">Share of events that add each vendor service</w:t>
+              <w:t xml:space="preserve">Share of events that attach to each vendor service; based on Walters regional averages</w:t>
             </w:r>
           </w:p>
         </w:tc>
@@ -1340,7 +1359,7 @@
                 <w:sz w:val="18"/>
                 <w:szCs w:val="18"/>
               </w:rPr>
-              <w:t xml:space="preserve">Spend per event on each vendor service</w:t>
+              <w:t xml:space="preserve">Spend per event on each vendor service; based on Walters averages</w:t>
             </w:r>
           </w:p>
         </w:tc>
@@ -1348,8 +1367,22 @@
     </w:tbl>
     <w:p>
       <w:pPr>
-        <w:spacing w:after="60" w:before="0"/>
-      </w:pPr>
+        <w:spacing w:after="40" w:before="60" w:line="264"/>
+        <w:jc w:val="left"/>
+      </w:pPr>
+      <w:r>
+        <w:rPr>
+          <w:rFonts w:ascii="Calibri" w:cs="Calibri" w:eastAsia="Calibri" w:hAnsi="Calibri"/>
+          <w:b/>
+          <w:bCs/>
+          <w:i w:val="false"/>
+          <w:iCs w:val="false"/>
+          <w:color w:val="1A939B"/>
+          <w:sz w:val="23"/>
+          <w:szCs w:val="23"/>
+        </w:rPr>
+        <w:t xml:space="preserve">Vendor Services</w:t>
+      </w:r>
     </w:p>
     <w:tbl>
       <w:tblPr>
@@ -1438,7 +1471,7 @@
                 <w:sz w:val="20"/>
                 <w:szCs w:val="20"/>
               </w:rPr>
-              <w:t xml:space="preserve">On/off switch once we hold the liquor license.</w:t>
+              <w:t xml:space="preserve">Any market; on/off switch once we hold the liquor license.</w:t>
             </w:r>
           </w:p>
         </w:tc>
@@ -1477,7 +1510,7 @@
                 <w:sz w:val="20"/>
                 <w:szCs w:val="20"/>
               </w:rPr>
-              <w:t xml:space="preserve">Catering</w:t>
+              <w:t xml:space="preserve">Catering / Floral / Bakery</w:t>
             </w:r>
           </w:p>
         </w:tc>
@@ -1514,7 +1547,7 @@
                 <w:sz w:val="20"/>
                 <w:szCs w:val="20"/>
               </w:rPr>
-              <w:t xml:space="preserve">Attach gradually; test it.</w:t>
+              <w:t xml:space="preserve">Existing markets; depends on hub distance.</w:t>
             </w:r>
           </w:p>
         </w:tc>
@@ -1553,7 +1586,7 @@
                 <w:sz w:val="20"/>
                 <w:szCs w:val="20"/>
               </w:rPr>
-              <w:t xml:space="preserve">Floral / Bakery</w:t>
+              <w:t xml:space="preserve">Photography / DJ / Stationery</w:t>
             </w:r>
           </w:p>
         </w:tc>
@@ -1590,83 +1623,7 @@
                 <w:sz w:val="20"/>
                 <w:szCs w:val="20"/>
               </w:rPr>
-              <w:t xml:space="preserve">Depends on hub distance.</w:t>
-            </w:r>
-          </w:p>
-        </w:tc>
-      </w:tr>
-      <w:tr>
-        <w:tc>
-          <w:tcPr>
-            <w:tcW w:type="dxa" w:w="3300"/>
-            <w:tcBorders>
-              <w:top w:val="single" w:color="FFFFFF" w:sz="24"/>
-              <w:left w:val="single" w:color="FFFFFF" w:sz="24"/>
-              <w:bottom w:val="single" w:color="FFFFFF" w:sz="24"/>
-              <w:right w:val="single" w:color="FFFFFF" w:sz="24"/>
-            </w:tcBorders>
-            <w:shd w:fill="EFF6F9" w:color="auto" w:val="clear"/>
-            <w:tcMar>
-              <w:top w:type="dxa" w:w="60"/>
-              <w:left w:type="dxa" w:w="140"/>
-              <w:bottom w:type="dxa" w:w="60"/>
-              <w:right w:type="dxa" w:w="140"/>
-            </w:tcMar>
-          </w:tcPr>
-          <w:p>
-            <w:pPr>
-              <w:spacing w:after="0" w:before="0" w:line="264"/>
-              <w:jc w:val="left"/>
-            </w:pPr>
-            <w:r>
-              <w:rPr>
-                <w:rFonts w:ascii="Calibri" w:cs="Calibri" w:eastAsia="Calibri" w:hAnsi="Calibri"/>
-                <w:b/>
-                <w:bCs/>
-                <w:i w:val="false"/>
-                <w:iCs w:val="false"/>
-                <w:color w:val="1A939B"/>
-                <w:sz w:val="20"/>
-                <w:szCs w:val="20"/>
-              </w:rPr>
-              <w:t xml:space="preserve">Photography / DJ / Stationery</w:t>
-            </w:r>
-          </w:p>
-        </w:tc>
-        <w:tc>
-          <w:tcPr>
-            <w:tcW w:type="dxa" w:w="7212"/>
-            <w:tcBorders>
-              <w:top w:val="single" w:color="FFFFFF" w:sz="24"/>
-              <w:left w:val="single" w:color="FFFFFF" w:sz="24"/>
-              <w:bottom w:val="single" w:color="FFFFFF" w:sz="24"/>
-              <w:right w:val="single" w:color="FFFFFF" w:sz="24"/>
-            </w:tcBorders>
-            <w:shd w:fill="F7F7F5" w:color="auto" w:val="clear"/>
-            <w:tcMar>
-              <w:top w:type="dxa" w:w="60"/>
-              <w:left w:type="dxa" w:w="140"/>
-              <w:bottom w:type="dxa" w:w="60"/>
-              <w:right w:type="dxa" w:w="140"/>
-            </w:tcMar>
-          </w:tcPr>
-          <w:p>
-            <w:pPr>
-              <w:spacing w:after="0" w:before="0" w:line="264"/>
-              <w:jc w:val="left"/>
-            </w:pPr>
-            <w:r>
-              <w:rPr>
-                <w:rFonts w:ascii="Calibri" w:cs="Calibri" w:eastAsia="Calibri" w:hAnsi="Calibri"/>
-                <w:b w:val="false"/>
-                <w:bCs w:val="false"/>
-                <w:i w:val="false"/>
-                <w:iCs w:val="false"/>
-                <w:color w:val="0B0B0B"/>
-                <w:sz w:val="20"/>
-                <w:szCs w:val="20"/>
-              </w:rPr>
-              <w:t xml:space="preserve">Quick to implement.</w:t>
+              <w:t xml:space="preserve">Any market; only need to hire and implement packages.</w:t>
             </w:r>
           </w:p>
         </w:tc>
@@ -1766,102 +1723,6 @@
     </w:p>
     <w:p>
       <w:pPr>
-        <w:pBdr>
-          <w:bottom w:val="single" w:color="B7DCDF" w:sz="4" w:space="1"/>
-        </w:pBdr>
-        <w:spacing w:after="40" w:before="30"/>
-      </w:pPr>
-    </w:p>
-    <w:p>
-      <w:pPr>
-        <w:spacing w:after="30" w:before="80" w:line="264"/>
-        <w:jc w:val="left"/>
-      </w:pPr>
-      <w:r>
-        <w:rPr>
-          <w:rFonts w:ascii="Calibri" w:cs="Calibri" w:eastAsia="Calibri" w:hAnsi="Calibri"/>
-          <w:b/>
-          <w:bCs/>
-          <w:i w:val="false"/>
-          <w:iCs w:val="false"/>
-          <w:color w:val="0B0B0B"/>
-          <w:sz w:val="20"/>
-          <w:szCs w:val="20"/>
-        </w:rPr>
-        <w:t xml:space="preserve">$ per vendor service</w:t>
-      </w:r>
-    </w:p>
-    <w:p>
-      <w:pPr>
-        <w:pStyle w:val="ListParagraph"/>
-        <w:numPr>
-          <w:ilvl w:val="0"/>
-          <w:numId w:val="2"/>
-        </w:numPr>
-        <w:spacing w:after="30" w:before="0" w:line="248"/>
-      </w:pPr>
-      <w:r>
-        <w:rPr>
-          <w:rFonts w:ascii="Calibri" w:cs="Calibri" w:eastAsia="Calibri" w:hAnsi="Calibri"/>
-          <w:b w:val="false"/>
-          <w:bCs w:val="false"/>
-          <w:i w:val="false"/>
-          <w:iCs w:val="false"/>
-          <w:color w:val="0B0B0B"/>
-          <w:sz w:val="19"/>
-          <w:szCs w:val="19"/>
-        </w:rPr>
-        <w:t xml:space="preserve">Walters average $ per event for that service</w:t>
-      </w:r>
-    </w:p>
-    <w:p>
-      <w:pPr>
-        <w:pStyle w:val="ListParagraph"/>
-        <w:numPr>
-          <w:ilvl w:val="0"/>
-          <w:numId w:val="2"/>
-        </w:numPr>
-        <w:spacing w:after="30" w:before="0" w:line="248"/>
-      </w:pPr>
-      <w:r>
-        <w:rPr>
-          <w:rFonts w:ascii="Calibri" w:cs="Calibri" w:eastAsia="Calibri" w:hAnsi="Calibri"/>
-          <w:b w:val="false"/>
-          <w:bCs w:val="false"/>
-          <w:i w:val="false"/>
-          <w:iCs w:val="false"/>
-          <w:color w:val="0B0B0B"/>
-          <w:sz w:val="19"/>
-          <w:szCs w:val="19"/>
-        </w:rPr>
-        <w:t xml:space="preserve">Smaller venue: adjust down; almost never adjust up</w:t>
-      </w:r>
-    </w:p>
-    <w:p>
-      <w:pPr>
-        <w:pStyle w:val="ListParagraph"/>
-        <w:numPr>
-          <w:ilvl w:val="0"/>
-          <w:numId w:val="2"/>
-        </w:numPr>
-        <w:spacing w:after="30" w:before="0" w:line="248"/>
-      </w:pPr>
-      <w:r>
-        <w:rPr>
-          <w:rFonts w:ascii="Calibri" w:cs="Calibri" w:eastAsia="Calibri" w:hAnsi="Calibri"/>
-          <w:b w:val="false"/>
-          <w:bCs w:val="false"/>
-          <w:i w:val="false"/>
-          <w:iCs w:val="false"/>
-          <w:color w:val="0B0B0B"/>
-          <w:sz w:val="19"/>
-          <w:szCs w:val="19"/>
-        </w:rPr>
-        <w:t xml:space="preserve">Sanity-check against what couples at that venue actually spend</w:t>
-      </w:r>
-    </w:p>
-    <w:p>
-      <w:pPr>
         <w:pStyle w:val="Heading1"/>
         <w:pBdr>
           <w:bottom w:val="single" w:color="1A939B" w:sz="12" w:space="4"/>
@@ -1956,33 +1817,46 @@
                 <w:sz w:val="18"/>
                 <w:szCs w:val="18"/>
               </w:rPr>
-              <w:t xml:space="preserve">Driven by their </w:t>
-            </w:r>
-            <w:r>
-              <w:rPr>
-                <w:rFonts w:ascii="Calibri" w:cs="Calibri" w:eastAsia="Calibri" w:hAnsi="Calibri"/>
-                <w:b/>
-                <w:bCs/>
-                <w:i w:val="false"/>
-                <w:iCs w:val="false"/>
-                <w:color w:val="0B0B0B"/>
-                <w:sz w:val="18"/>
-                <w:szCs w:val="18"/>
-              </w:rPr>
-              <w:t xml:space="preserve">vendor services</w:t>
-            </w:r>
-            <w:r>
-              <w:rPr>
-                <w:rFonts w:ascii="Calibri" w:cs="Calibri" w:eastAsia="Calibri" w:hAnsi="Calibri"/>
-                <w:b w:val="false"/>
-                <w:bCs w:val="false"/>
-                <w:i w:val="false"/>
-                <w:iCs w:val="false"/>
-                <w:color w:val="0B0B0B"/>
-                <w:sz w:val="18"/>
-                <w:szCs w:val="18"/>
-              </w:rPr>
-              <w:t xml:space="preserve"> and other offerings</w:t>
+              <w:t xml:space="preserve">Historically driven by their </w:t>
+            </w:r>
+            <w:r>
+              <w:rPr>
+                <w:rFonts w:ascii="Calibri" w:cs="Calibri" w:eastAsia="Calibri" w:hAnsi="Calibri"/>
+                <w:b/>
+                <w:bCs/>
+                <w:i w:val="false"/>
+                <w:iCs w:val="false"/>
+                <w:color w:val="0B0B0B"/>
+                <w:sz w:val="18"/>
+                <w:szCs w:val="18"/>
+              </w:rPr>
+              <w:t xml:space="preserve">existing vendor services</w:t>
+            </w:r>
+            <w:r>
+              <w:rPr>
+                <w:rFonts w:ascii="Calibri" w:cs="Calibri" w:eastAsia="Calibri" w:hAnsi="Calibri"/>
+                <w:b w:val="false"/>
+                <w:bCs w:val="false"/>
+                <w:i w:val="false"/>
+                <w:iCs w:val="false"/>
+                <w:color w:val="0B0B0B"/>
+                <w:sz w:val="18"/>
+                <w:szCs w:val="18"/>
+              </w:rPr>
+              <w:t xml:space="preserve"> (if any); go-forward defers towards </w:t>
+            </w:r>
+            <w:r>
+              <w:rPr>
+                <w:rFonts w:ascii="Calibri" w:cs="Calibri" w:eastAsia="Calibri" w:hAnsi="Calibri"/>
+                <w:b/>
+                <w:bCs/>
+                <w:i w:val="false"/>
+                <w:iCs w:val="false"/>
+                <w:color w:val="0B0B0B"/>
+                <w:sz w:val="18"/>
+                <w:szCs w:val="18"/>
+              </w:rPr>
+              <w:t xml:space="preserve">our offerings and margins</w:t>
             </w:r>
           </w:p>
           <w:p>
@@ -2005,20 +1879,20 @@
                 <w:sz w:val="18"/>
                 <w:szCs w:val="18"/>
               </w:rPr>
-              <w:t xml:space="preserve">Keep </w:t>
-            </w:r>
-            <w:r>
-              <w:rPr>
-                <w:rFonts w:ascii="Calibri" w:cs="Calibri" w:eastAsia="Calibri" w:hAnsi="Calibri"/>
-                <w:b/>
-                <w:bCs/>
-                <w:i w:val="false"/>
-                <w:iCs w:val="false"/>
-                <w:color w:val="0B0B0B"/>
-                <w:sz w:val="18"/>
-                <w:szCs w:val="18"/>
-              </w:rPr>
-              <w:t xml:space="preserve">their existing costs</w:t>
+              <w:t xml:space="preserve">Keep their </w:t>
+            </w:r>
+            <w:r>
+              <w:rPr>
+                <w:rFonts w:ascii="Calibri" w:cs="Calibri" w:eastAsia="Calibri" w:hAnsi="Calibri"/>
+                <w:b/>
+                <w:bCs/>
+                <w:i w:val="false"/>
+                <w:iCs w:val="false"/>
+                <w:color w:val="0B0B0B"/>
+                <w:sz w:val="18"/>
+                <w:szCs w:val="18"/>
+              </w:rPr>
+              <w:t xml:space="preserve">go-forward OC costs</w:t>
             </w:r>
             <w:r>
               <w:rPr>
@@ -2032,6 +1906,43 @@
                 <w:szCs w:val="18"/>
               </w:rPr>
               <w:t xml:space="preserve"> in mind (e.g. a required caterer's per-head cost on OC events)</w:t>
+            </w:r>
+          </w:p>
+        </w:tc>
+        <w:tc>
+          <w:tcPr>
+            <w:tcW w:type="dxa" w:w="3504"/>
+            <w:tcBorders>
+              <w:top w:val="single" w:color="FFFFFF" w:sz="24"/>
+              <w:left w:val="single" w:color="FFFFFF" w:sz="24"/>
+              <w:bottom w:val="single" w:color="FFFFFF" w:sz="24"/>
+              <w:right w:val="single" w:color="FFFFFF" w:sz="24"/>
+            </w:tcBorders>
+            <w:shd w:fill="EFF6F9" w:color="auto" w:val="clear"/>
+            <w:tcMar>
+              <w:top w:type="dxa" w:w="100"/>
+              <w:left w:type="dxa" w:w="140"/>
+              <w:bottom w:type="dxa" w:w="100"/>
+              <w:right w:type="dxa" w:w="140"/>
+            </w:tcMar>
+          </w:tcPr>
+          <w:p>
+            <w:pPr>
+              <w:spacing w:after="60" w:before="0" w:line="264"/>
+              <w:jc w:val="left"/>
+            </w:pPr>
+            <w:r>
+              <w:rPr>
+                <w:rFonts w:ascii="Calibri" w:cs="Calibri" w:eastAsia="Calibri" w:hAnsi="Calibri"/>
+                <w:b/>
+                <w:bCs/>
+                <w:i w:val="false"/>
+                <w:iCs w:val="false"/>
+                <w:color w:val="1A939B"/>
+                <w:sz w:val="22"/>
+                <w:szCs w:val="22"/>
+              </w:rPr>
+              <w:t xml:space="preserve">Payroll</w:t>
             </w:r>
           </w:p>
           <w:p>
@@ -2046,91 +1957,15 @@
             <w:r>
               <w:rPr>
                 <w:rFonts w:ascii="Calibri" w:cs="Calibri" w:eastAsia="Calibri" w:hAnsi="Calibri"/>
-                <w:b w:val="false"/>
-                <w:bCs w:val="false"/>
-                <w:i w:val="false"/>
-                <w:iCs w:val="false"/>
-                <w:color w:val="0B0B0B"/>
-                <w:sz w:val="18"/>
-                <w:szCs w:val="18"/>
-              </w:rPr>
-              <w:t xml:space="preserve">Often </w:t>
-            </w:r>
-            <w:r>
-              <w:rPr>
-                <w:rFonts w:ascii="Calibri" w:cs="Calibri" w:eastAsia="Calibri" w:hAnsi="Calibri"/>
-                <w:b/>
-                <w:bCs/>
-                <w:i w:val="false"/>
-                <w:iCs w:val="false"/>
-                <w:color w:val="0B0B0B"/>
-                <w:sz w:val="18"/>
-                <w:szCs w:val="18"/>
-              </w:rPr>
-              <w:t xml:space="preserve">little or no COGS today</w:t>
-            </w:r>
-            <w:r>
-              <w:rPr>
-                <w:rFonts w:ascii="Calibri" w:cs="Calibri" w:eastAsia="Calibri" w:hAnsi="Calibri"/>
-                <w:b w:val="false"/>
-                <w:bCs w:val="false"/>
-                <w:i w:val="false"/>
-                <w:iCs w:val="false"/>
-                <w:color w:val="0B0B0B"/>
-                <w:sz w:val="18"/>
-                <w:szCs w:val="18"/>
-              </w:rPr>
-              <w:t xml:space="preserve">; we build on </w:t>
-            </w:r>
-            <w:r>
-              <w:rPr>
-                <w:rFonts w:ascii="Calibri" w:cs="Calibri" w:eastAsia="Calibri" w:hAnsi="Calibri"/>
-                <w:b/>
-                <w:bCs/>
-                <w:i w:val="false"/>
-                <w:iCs w:val="false"/>
-                <w:color w:val="0B0B0B"/>
-                <w:sz w:val="18"/>
-                <w:szCs w:val="18"/>
-              </w:rPr>
-              <w:t xml:space="preserve">our ramp and margins</w:t>
-            </w:r>
-          </w:p>
-        </w:tc>
-        <w:tc>
-          <w:tcPr>
-            <w:tcW w:type="dxa" w:w="3504"/>
-            <w:tcBorders>
-              <w:top w:val="single" w:color="FFFFFF" w:sz="24"/>
-              <w:left w:val="single" w:color="FFFFFF" w:sz="24"/>
-              <w:bottom w:val="single" w:color="FFFFFF" w:sz="24"/>
-              <w:right w:val="single" w:color="FFFFFF" w:sz="24"/>
-            </w:tcBorders>
-            <w:shd w:fill="EFF6F9" w:color="auto" w:val="clear"/>
-            <w:tcMar>
-              <w:top w:type="dxa" w:w="100"/>
-              <w:left w:type="dxa" w:w="140"/>
-              <w:bottom w:type="dxa" w:w="100"/>
-              <w:right w:type="dxa" w:w="140"/>
-            </w:tcMar>
-          </w:tcPr>
-          <w:p>
-            <w:pPr>
-              <w:spacing w:after="60" w:before="0" w:line="264"/>
-              <w:jc w:val="left"/>
-            </w:pPr>
-            <w:r>
-              <w:rPr>
-                <w:rFonts w:ascii="Calibri" w:cs="Calibri" w:eastAsia="Calibri" w:hAnsi="Calibri"/>
-                <w:b/>
-                <w:bCs/>
-                <w:i w:val="false"/>
-                <w:iCs w:val="false"/>
-                <w:color w:val="1A939B"/>
-                <w:sz w:val="22"/>
-                <w:szCs w:val="22"/>
-              </w:rPr>
-              <w:t xml:space="preserve">Payroll</w:t>
+                <w:b/>
+                <w:bCs/>
+                <w:i w:val="false"/>
+                <w:iCs w:val="false"/>
+                <w:color w:val="0B0B0B"/>
+                <w:sz w:val="18"/>
+                <w:szCs w:val="18"/>
+              </w:rPr>
+              <w:t xml:space="preserve">Current staff</w:t>
             </w:r>
           </w:p>
           <w:p>
@@ -2153,20 +1988,7 @@
                 <w:sz w:val="18"/>
                 <w:szCs w:val="18"/>
               </w:rPr>
-              <w:t xml:space="preserve">Current staff</w:t>
-            </w:r>
-            <w:r>
-              <w:rPr>
-                <w:rFonts w:ascii="Calibri" w:cs="Calibri" w:eastAsia="Calibri" w:hAnsi="Calibri"/>
-                <w:b w:val="false"/>
-                <w:bCs w:val="false"/>
-                <w:i w:val="false"/>
-                <w:iCs w:val="false"/>
-                <w:color w:val="0B0B0B"/>
-                <w:sz w:val="18"/>
-                <w:szCs w:val="18"/>
-              </w:rPr>
-              <w:t xml:space="preserve"> and roles</w:t>
+              <w:t xml:space="preserve">Current or new market</w:t>
             </w:r>
           </w:p>
           <w:p>
@@ -2189,7 +2011,70 @@
                 <w:sz w:val="18"/>
                 <w:szCs w:val="18"/>
               </w:rPr>
-              <w:t xml:space="preserve">Current or new market</w:t>
+              <w:t xml:space="preserve">Owner involvement</w:t>
+            </w:r>
+            <w:r>
+              <w:rPr>
+                <w:rFonts w:ascii="Calibri" w:cs="Calibri" w:eastAsia="Calibri" w:hAnsi="Calibri"/>
+                <w:b w:val="false"/>
+                <w:bCs w:val="false"/>
+                <w:i w:val="false"/>
+                <w:iCs w:val="false"/>
+                <w:color w:val="0B0B0B"/>
+                <w:sz w:val="18"/>
+                <w:szCs w:val="18"/>
+              </w:rPr>
+              <w:t xml:space="preserve">: what they pay themselves; </w:t>
+            </w:r>
+            <w:r>
+              <w:rPr>
+                <w:rFonts w:ascii="Calibri" w:cs="Calibri" w:eastAsia="Calibri" w:hAnsi="Calibri"/>
+                <w:b/>
+                <w:bCs/>
+                <w:i w:val="false"/>
+                <w:iCs w:val="false"/>
+                <w:color w:val="0B0B0B"/>
+                <w:sz w:val="18"/>
+                <w:szCs w:val="18"/>
+              </w:rPr>
+              <w:t xml:space="preserve">replacement cost</w:t>
+            </w:r>
+          </w:p>
+        </w:tc>
+        <w:tc>
+          <w:tcPr>
+            <w:tcW w:type="dxa" w:w="3504"/>
+            <w:tcBorders>
+              <w:top w:val="single" w:color="FFFFFF" w:sz="24"/>
+              <w:left w:val="single" w:color="FFFFFF" w:sz="24"/>
+              <w:bottom w:val="single" w:color="FFFFFF" w:sz="24"/>
+              <w:right w:val="single" w:color="FFFFFF" w:sz="24"/>
+            </w:tcBorders>
+            <w:shd w:fill="EFF6F9" w:color="auto" w:val="clear"/>
+            <w:tcMar>
+              <w:top w:type="dxa" w:w="100"/>
+              <w:left w:type="dxa" w:w="140"/>
+              <w:bottom w:type="dxa" w:w="100"/>
+              <w:right w:type="dxa" w:w="140"/>
+            </w:tcMar>
+          </w:tcPr>
+          <w:p>
+            <w:pPr>
+              <w:spacing w:after="60" w:before="0" w:line="264"/>
+              <w:jc w:val="left"/>
+            </w:pPr>
+            <w:r>
+              <w:rPr>
+                <w:rFonts w:ascii="Calibri" w:cs="Calibri" w:eastAsia="Calibri" w:hAnsi="Calibri"/>
+                <w:b/>
+                <w:bCs/>
+                <w:i w:val="false"/>
+                <w:iCs w:val="false"/>
+                <w:color w:val="1A939B"/>
+                <w:sz w:val="22"/>
+                <w:szCs w:val="22"/>
+              </w:rPr>
+              <w:t xml:space="preserve">Operating expenses</w:t>
             </w:r>
           </w:p>
           <w:p>
@@ -2212,70 +2097,20 @@
                 <w:sz w:val="18"/>
                 <w:szCs w:val="18"/>
               </w:rPr>
-              <w:t xml:space="preserve">Owner involvement</w:t>
-            </w:r>
-            <w:r>
-              <w:rPr>
-                <w:rFonts w:ascii="Calibri" w:cs="Calibri" w:eastAsia="Calibri" w:hAnsi="Calibri"/>
-                <w:b w:val="false"/>
-                <w:bCs w:val="false"/>
-                <w:i w:val="false"/>
-                <w:iCs w:val="false"/>
-                <w:color w:val="0B0B0B"/>
-                <w:sz w:val="18"/>
-                <w:szCs w:val="18"/>
-              </w:rPr>
-              <w:t xml:space="preserve">: what they pay themselves; </w:t>
-            </w:r>
-            <w:r>
-              <w:rPr>
-                <w:rFonts w:ascii="Calibri" w:cs="Calibri" w:eastAsia="Calibri" w:hAnsi="Calibri"/>
-                <w:b/>
-                <w:bCs/>
-                <w:i w:val="false"/>
-                <w:iCs w:val="false"/>
-                <w:color w:val="0B0B0B"/>
-                <w:sz w:val="18"/>
-                <w:szCs w:val="18"/>
-              </w:rPr>
-              <w:t xml:space="preserve">replacement cost</w:t>
-            </w:r>
-          </w:p>
-        </w:tc>
-        <w:tc>
-          <w:tcPr>
-            <w:tcW w:type="dxa" w:w="3504"/>
-            <w:tcBorders>
-              <w:top w:val="single" w:color="FFFFFF" w:sz="24"/>
-              <w:left w:val="single" w:color="FFFFFF" w:sz="24"/>
-              <w:bottom w:val="single" w:color="FFFFFF" w:sz="24"/>
-              <w:right w:val="single" w:color="FFFFFF" w:sz="24"/>
-            </w:tcBorders>
-            <w:shd w:fill="EFF6F9" w:color="auto" w:val="clear"/>
-            <w:tcMar>
-              <w:top w:type="dxa" w:w="100"/>
-              <w:left w:type="dxa" w:w="140"/>
-              <w:bottom w:type="dxa" w:w="100"/>
-              <w:right w:type="dxa" w:w="140"/>
-            </w:tcMar>
-          </w:tcPr>
-          <w:p>
-            <w:pPr>
-              <w:spacing w:after="60" w:before="0" w:line="264"/>
-              <w:jc w:val="left"/>
-            </w:pPr>
-            <w:r>
-              <w:rPr>
-                <w:rFonts w:ascii="Calibri" w:cs="Calibri" w:eastAsia="Calibri" w:hAnsi="Calibri"/>
-                <w:b/>
-                <w:bCs/>
-                <w:i w:val="false"/>
-                <w:iCs w:val="false"/>
-                <w:color w:val="1A939B"/>
-                <w:sz w:val="22"/>
-                <w:szCs w:val="22"/>
-              </w:rPr>
-              <w:t xml:space="preserve">Operating expenses</w:t>
+              <w:t xml:space="preserve">Venue specific</w:t>
+            </w:r>
+            <w:r>
+              <w:rPr>
+                <w:rFonts w:ascii="Calibri" w:cs="Calibri" w:eastAsia="Calibri" w:hAnsi="Calibri"/>
+                <w:b w:val="false"/>
+                <w:bCs w:val="false"/>
+                <w:i w:val="false"/>
+                <w:iCs w:val="false"/>
+                <w:color w:val="0B0B0B"/>
+                <w:sz w:val="18"/>
+                <w:szCs w:val="18"/>
+              </w:rPr>
+              <w:t xml:space="preserve"> (utilities, maintenance)</w:t>
             </w:r>
           </w:p>
           <w:p>
@@ -2290,126 +2125,28 @@
             <w:r>
               <w:rPr>
                 <w:rFonts w:ascii="Calibri" w:cs="Calibri" w:eastAsia="Calibri" w:hAnsi="Calibri"/>
-                <w:b w:val="false"/>
-                <w:bCs w:val="false"/>
-                <w:i w:val="false"/>
-                <w:iCs w:val="false"/>
-                <w:color w:val="0B0B0B"/>
-                <w:sz w:val="18"/>
-                <w:szCs w:val="18"/>
-              </w:rPr>
-              <w:t xml:space="preserve">Switch to </w:t>
-            </w:r>
-            <w:r>
-              <w:rPr>
-                <w:rFonts w:ascii="Calibri" w:cs="Calibri" w:eastAsia="Calibri" w:hAnsi="Calibri"/>
-                <w:b/>
-                <w:bCs/>
-                <w:i w:val="false"/>
-                <w:iCs w:val="false"/>
-                <w:color w:val="0B0B0B"/>
-                <w:sz w:val="18"/>
-                <w:szCs w:val="18"/>
-              </w:rPr>
-              <w:t xml:space="preserve">our marketing</w:t>
-            </w:r>
-            <w:r>
-              <w:rPr>
-                <w:rFonts w:ascii="Calibri" w:cs="Calibri" w:eastAsia="Calibri" w:hAnsi="Calibri"/>
-                <w:b w:val="false"/>
-                <w:bCs w:val="false"/>
-                <w:i w:val="false"/>
-                <w:iCs w:val="false"/>
-                <w:color w:val="0B0B0B"/>
-                <w:sz w:val="18"/>
-                <w:szCs w:val="18"/>
-              </w:rPr>
-              <w:t xml:space="preserve">; almost always higher</w:t>
-            </w:r>
-          </w:p>
-          <w:p>
-            <w:pPr>
-              <w:pStyle w:val="ListParagraph"/>
-              <w:numPr>
-                <w:ilvl w:val="0"/>
-                <w:numId w:val="2"/>
-              </w:numPr>
-              <w:spacing w:after="20" w:before="0" w:line="248"/>
-            </w:pPr>
-            <w:r>
-              <w:rPr>
-                <w:rFonts w:ascii="Calibri" w:cs="Calibri" w:eastAsia="Calibri" w:hAnsi="Calibri"/>
-                <w:b w:val="false"/>
-                <w:bCs w:val="false"/>
-                <w:i w:val="false"/>
-                <w:iCs w:val="false"/>
-                <w:color w:val="0B0B0B"/>
-                <w:sz w:val="18"/>
-                <w:szCs w:val="18"/>
-              </w:rPr>
-              <w:t xml:space="preserve">Their </w:t>
-            </w:r>
-            <w:r>
-              <w:rPr>
-                <w:rFonts w:ascii="Calibri" w:cs="Calibri" w:eastAsia="Calibri" w:hAnsi="Calibri"/>
-                <w:b/>
-                <w:bCs/>
-                <w:i w:val="false"/>
-                <w:iCs w:val="false"/>
-                <w:color w:val="0B0B0B"/>
-                <w:sz w:val="18"/>
-                <w:szCs w:val="18"/>
-              </w:rPr>
-              <w:t xml:space="preserve">utilities and maintenance</w:t>
-            </w:r>
-            <w:r>
-              <w:rPr>
-                <w:rFonts w:ascii="Calibri" w:cs="Calibri" w:eastAsia="Calibri" w:hAnsi="Calibri"/>
-                <w:b w:val="false"/>
-                <w:bCs w:val="false"/>
-                <w:i w:val="false"/>
-                <w:iCs w:val="false"/>
-                <w:color w:val="0B0B0B"/>
-                <w:sz w:val="18"/>
-                <w:szCs w:val="18"/>
-              </w:rPr>
-              <w:t xml:space="preserve"> per event</w:t>
-            </w:r>
-          </w:p>
-          <w:p>
-            <w:pPr>
-              <w:pStyle w:val="ListParagraph"/>
-              <w:numPr>
-                <w:ilvl w:val="0"/>
-                <w:numId w:val="2"/>
-              </w:numPr>
-              <w:spacing w:after="20" w:before="0" w:line="248"/>
-            </w:pPr>
-            <w:r>
-              <w:rPr>
-                <w:rFonts w:ascii="Calibri" w:cs="Calibri" w:eastAsia="Calibri" w:hAnsi="Calibri"/>
-                <w:b w:val="false"/>
-                <w:bCs w:val="false"/>
-                <w:i w:val="false"/>
-                <w:iCs w:val="false"/>
-                <w:color w:val="0B0B0B"/>
-                <w:sz w:val="18"/>
-                <w:szCs w:val="18"/>
-              </w:rPr>
-              <w:t xml:space="preserve">Our </w:t>
-            </w:r>
-            <w:r>
-              <w:rPr>
-                <w:rFonts w:ascii="Calibri" w:cs="Calibri" w:eastAsia="Calibri" w:hAnsi="Calibri"/>
-                <w:b/>
-                <w:bCs/>
-                <w:i w:val="false"/>
-                <w:iCs w:val="false"/>
-                <w:color w:val="0B0B0B"/>
-                <w:sz w:val="18"/>
-                <w:szCs w:val="18"/>
-              </w:rPr>
-              <w:t xml:space="preserve">insurance, finance expenses, professional services</w:t>
+                <w:b/>
+                <w:bCs/>
+                <w:i w:val="false"/>
+                <w:iCs w:val="false"/>
+                <w:color w:val="0B0B0B"/>
+                <w:sz w:val="18"/>
+                <w:szCs w:val="18"/>
+              </w:rPr>
+              <w:t xml:space="preserve">Walters operational changes</w:t>
+            </w:r>
+            <w:r>
+              <w:rPr>
+                <w:rFonts w:ascii="Calibri" w:cs="Calibri" w:eastAsia="Calibri" w:hAnsi="Calibri"/>
+                <w:b w:val="false"/>
+                <w:bCs w:val="false"/>
+                <w:i w:val="false"/>
+                <w:iCs w:val="false"/>
+                <w:color w:val="0B0B0B"/>
+                <w:sz w:val="18"/>
+                <w:szCs w:val="18"/>
+              </w:rPr>
+              <w:t xml:space="preserve"> (marketing, insurance, finance expenses, professional services, etc.)</w:t>
             </w:r>
           </w:p>
         </w:tc>

</xml_diff>

<commit_message>
Pro forma sheet: add Part 2 post-LOI section and talking points
Co-Authored-By: Claude Fable 5.1 <noreply@anthropic.com>

Claude-Session: https://claude.ai/code/session_01H1o2hAHLKnaHhCBRW9ndXv
</commit_message>
<xml_diff>
--- a/docs/proforma-cheatsheet/Pro Forma Sheet.docx
+++ b/docs/proforma-cheatsheet/Pro Forma Sheet.docx
@@ -2147,6 +2147,1019 @@
                 <w:szCs w:val="18"/>
               </w:rPr>
               <w:t xml:space="preserve"> (marketing, insurance, finance expenses, professional services, etc.)</w:t>
+            </w:r>
+          </w:p>
+        </w:tc>
+      </w:tr>
+    </w:tbl>
+    <w:p>
+      <w:r>
+        <w:br w:type="page"/>
+      </w:r>
+    </w:p>
+    <w:p>
+      <w:pPr>
+        <w:spacing w:after="60" w:before="0" w:line="264"/>
+        <w:jc w:val="left"/>
+      </w:pPr>
+      <w:r>
+        <w:rPr>
+          <w:rFonts w:ascii="Calibri" w:cs="Calibri" w:eastAsia="Calibri" w:hAnsi="Calibri"/>
+          <w:b/>
+          <w:bCs/>
+          <w:i w:val="false"/>
+          <w:iCs w:val="false"/>
+          <w:color w:val="1A939B"/>
+          <w:sz w:val="22"/>
+          <w:szCs w:val="22"/>
+        </w:rPr>
+        <w:t xml:space="preserve">Walters Hospitality</w:t>
+      </w:r>
+      <w:r>
+        <w:rPr>
+          <w:rFonts w:ascii="Calibri" w:cs="Calibri" w:eastAsia="Calibri" w:hAnsi="Calibri"/>
+          <w:b/>
+          <w:bCs/>
+          <w:i w:val="false"/>
+          <w:iCs w:val="false"/>
+          <w:color w:val="52514E"/>
+          <w:sz w:val="22"/>
+          <w:szCs w:val="22"/>
+        </w:rPr>
+        <w:t xml:space="preserve">   |   Part 2: Post-LOI</w:t>
+      </w:r>
+    </w:p>
+    <w:p>
+      <w:pPr>
+        <w:pStyle w:val="Heading1"/>
+        <w:pBdr>
+          <w:bottom w:val="single" w:color="1A939B" w:sz="12" w:space="4"/>
+        </w:pBdr>
+        <w:spacing w:after="70" w:before="140"/>
+      </w:pPr>
+      <w:r>
+        <w:rPr>
+          <w:rFonts w:ascii="Calibri" w:cs="Calibri" w:eastAsia="Calibri" w:hAnsi="Calibri"/>
+          <w:b/>
+          <w:bCs/>
+          <w:i w:val="false"/>
+          <w:iCs w:val="false"/>
+          <w:color w:val="1A939B"/>
+          <w:sz w:val="30"/>
+          <w:szCs w:val="30"/>
+        </w:rPr>
+        <w:t xml:space="preserve">6. Same process, more detail</w:t>
+      </w:r>
+    </w:p>
+    <w:p>
+      <w:pPr>
+        <w:spacing w:after="60" w:before="0" w:line="264"/>
+        <w:jc w:val="left"/>
+      </w:pPr>
+      <w:r>
+        <w:rPr>
+          <w:rFonts w:ascii="Calibri" w:cs="Calibri" w:eastAsia="Calibri" w:hAnsi="Calibri"/>
+          <w:b w:val="false"/>
+          <w:bCs w:val="false"/>
+          <w:i w:val="false"/>
+          <w:iCs w:val="false"/>
+          <w:color w:val="52514E"/>
+          <w:sz w:val="19"/>
+          <w:szCs w:val="19"/>
+        </w:rPr>
+        <w:t xml:space="preserve">Everything in Part 1 again, with updated event counts, financials and what we learned in diligence. Then we get in the weeds:</w:t>
+      </w:r>
+    </w:p>
+    <w:tbl>
+      <w:tblPr>
+        <w:tblW w:type="dxa" w:w="10512"/>
+        <w:tblBorders>
+          <w:top w:val="none" w:color="FFFFFF" w:sz="0"/>
+          <w:left w:val="none" w:color="FFFFFF" w:sz="0"/>
+          <w:bottom w:val="none" w:color="FFFFFF" w:sz="0"/>
+          <w:right w:val="none" w:color="FFFFFF" w:sz="0"/>
+          <w:insideH w:val="single" w:color="auto" w:sz="4"/>
+          <w:insideV w:val="single" w:color="auto" w:sz="4"/>
+        </w:tblBorders>
+      </w:tblPr>
+      <w:tblGrid>
+        <w:gridCol w:w="3504"/>
+        <w:gridCol w:w="3504"/>
+        <w:gridCol w:w="3504"/>
+      </w:tblGrid>
+      <w:tr>
+        <w:tc>
+          <w:tcPr>
+            <w:tcW w:type="dxa" w:w="3504"/>
+            <w:tcBorders>
+              <w:top w:val="single" w:color="FFFFFF" w:sz="24"/>
+              <w:left w:val="single" w:color="FFFFFF" w:sz="24"/>
+              <w:bottom w:val="single" w:color="FFFFFF" w:sz="24"/>
+              <w:right w:val="single" w:color="FFFFFF" w:sz="24"/>
+            </w:tcBorders>
+            <w:shd w:fill="EFF6F9" w:color="auto" w:val="clear"/>
+            <w:tcMar>
+              <w:top w:type="dxa" w:w="100"/>
+              <w:left w:type="dxa" w:w="140"/>
+              <w:bottom w:type="dxa" w:w="100"/>
+              <w:right w:type="dxa" w:w="140"/>
+            </w:tcMar>
+          </w:tcPr>
+          <w:p>
+            <w:pPr>
+              <w:spacing w:after="60" w:before="0" w:line="264"/>
+              <w:jc w:val="left"/>
+            </w:pPr>
+            <w:r>
+              <w:rPr>
+                <w:rFonts w:ascii="Calibri" w:cs="Calibri" w:eastAsia="Calibri" w:hAnsi="Calibri"/>
+                <w:b/>
+                <w:bCs/>
+                <w:i w:val="false"/>
+                <w:iCs w:val="false"/>
+                <w:color w:val="1A939B"/>
+                <w:sz w:val="21"/>
+                <w:szCs w:val="21"/>
+              </w:rPr>
+              <w:t xml:space="preserve">Employees</w:t>
+            </w:r>
+          </w:p>
+          <w:p>
+            <w:pPr>
+              <w:pStyle w:val="ListParagraph"/>
+              <w:numPr>
+                <w:ilvl w:val="0"/>
+                <w:numId w:val="2"/>
+              </w:numPr>
+              <w:spacing w:after="20" w:before="0" w:line="248"/>
+            </w:pPr>
+            <w:r>
+              <w:rPr>
+                <w:rFonts w:ascii="Calibri" w:cs="Calibri" w:eastAsia="Calibri" w:hAnsi="Calibri"/>
+                <w:b/>
+                <w:bCs/>
+                <w:i w:val="false"/>
+                <w:iCs w:val="false"/>
+                <w:color w:val="0B0B0B"/>
+                <w:sz w:val="18"/>
+                <w:szCs w:val="18"/>
+              </w:rPr>
+              <w:t xml:space="preserve">Role by role</w:t>
+            </w:r>
+            <w:r>
+              <w:rPr>
+                <w:rFonts w:ascii="Calibri" w:cs="Calibri" w:eastAsia="Calibri" w:hAnsi="Calibri"/>
+                <w:b w:val="false"/>
+                <w:bCs w:val="false"/>
+                <w:i w:val="false"/>
+                <w:iCs w:val="false"/>
+                <w:color w:val="0B0B0B"/>
+                <w:sz w:val="18"/>
+                <w:szCs w:val="18"/>
+              </w:rPr>
+              <w:t xml:space="preserve">: who stays, who we add, what each costs</w:t>
+            </w:r>
+          </w:p>
+          <w:p>
+            <w:pPr>
+              <w:pStyle w:val="ListParagraph"/>
+              <w:numPr>
+                <w:ilvl w:val="0"/>
+                <w:numId w:val="2"/>
+              </w:numPr>
+              <w:spacing w:after="20" w:before="0" w:line="248"/>
+            </w:pPr>
+            <w:r>
+              <w:rPr>
+                <w:rFonts w:ascii="Calibri" w:cs="Calibri" w:eastAsia="Calibri" w:hAnsi="Calibri"/>
+                <w:b/>
+                <w:bCs/>
+                <w:i w:val="false"/>
+                <w:iCs w:val="false"/>
+                <w:color w:val="0B0B0B"/>
+                <w:sz w:val="18"/>
+                <w:szCs w:val="18"/>
+              </w:rPr>
+              <w:t xml:space="preserve">Owner replacement</w:t>
+            </w:r>
+            <w:r>
+              <w:rPr>
+                <w:rFonts w:ascii="Calibri" w:cs="Calibri" w:eastAsia="Calibri" w:hAnsi="Calibri"/>
+                <w:b w:val="false"/>
+                <w:bCs w:val="false"/>
+                <w:i w:val="false"/>
+                <w:iCs w:val="false"/>
+                <w:color w:val="0B0B0B"/>
+                <w:sz w:val="18"/>
+                <w:szCs w:val="18"/>
+              </w:rPr>
+              <w:t xml:space="preserve"> if they step away</w:t>
+            </w:r>
+          </w:p>
+        </w:tc>
+        <w:tc>
+          <w:tcPr>
+            <w:tcW w:type="dxa" w:w="3504"/>
+            <w:tcBorders>
+              <w:top w:val="single" w:color="FFFFFF" w:sz="24"/>
+              <w:left w:val="single" w:color="FFFFFF" w:sz="24"/>
+              <w:bottom w:val="single" w:color="FFFFFF" w:sz="24"/>
+              <w:right w:val="single" w:color="FFFFFF" w:sz="24"/>
+            </w:tcBorders>
+            <w:shd w:fill="EFF6F9" w:color="auto" w:val="clear"/>
+            <w:tcMar>
+              <w:top w:type="dxa" w:w="100"/>
+              <w:left w:type="dxa" w:w="140"/>
+              <w:bottom w:type="dxa" w:w="100"/>
+              <w:right w:type="dxa" w:w="140"/>
+            </w:tcMar>
+          </w:tcPr>
+          <w:p>
+            <w:pPr>
+              <w:spacing w:after="60" w:before="0" w:line="264"/>
+              <w:jc w:val="left"/>
+            </w:pPr>
+            <w:r>
+              <w:rPr>
+                <w:rFonts w:ascii="Calibri" w:cs="Calibri" w:eastAsia="Calibri" w:hAnsi="Calibri"/>
+                <w:b/>
+                <w:bCs/>
+                <w:i w:val="false"/>
+                <w:iCs w:val="false"/>
+                <w:color w:val="1A939B"/>
+                <w:sz w:val="21"/>
+                <w:szCs w:val="21"/>
+              </w:rPr>
+              <w:t xml:space="preserve">COGS and pricing</w:t>
+            </w:r>
+          </w:p>
+          <w:p>
+            <w:pPr>
+              <w:pStyle w:val="ListParagraph"/>
+              <w:numPr>
+                <w:ilvl w:val="0"/>
+                <w:numId w:val="2"/>
+              </w:numPr>
+              <w:spacing w:after="20" w:before="0" w:line="248"/>
+            </w:pPr>
+            <w:r>
+              <w:rPr>
+                <w:rFonts w:ascii="Calibri" w:cs="Calibri" w:eastAsia="Calibri" w:hAnsi="Calibri"/>
+                <w:b/>
+                <w:bCs/>
+                <w:i w:val="false"/>
+                <w:iCs w:val="false"/>
+                <w:color w:val="0B0B0B"/>
+                <w:sz w:val="18"/>
+                <w:szCs w:val="18"/>
+              </w:rPr>
+              <w:t xml:space="preserve">Lingering OC costs</w:t>
+            </w:r>
+            <w:r>
+              <w:rPr>
+                <w:rFonts w:ascii="Calibri" w:cs="Calibri" w:eastAsia="Calibri" w:hAnsi="Calibri"/>
+                <w:b w:val="false"/>
+                <w:bCs w:val="false"/>
+                <w:i w:val="false"/>
+                <w:iCs w:val="false"/>
+                <w:color w:val="0B0B0B"/>
+                <w:sz w:val="18"/>
+                <w:szCs w:val="18"/>
+              </w:rPr>
+              <w:t xml:space="preserve"> (e.g. a required caterer on booked events)</w:t>
+            </w:r>
+          </w:p>
+          <w:p>
+            <w:pPr>
+              <w:pStyle w:val="ListParagraph"/>
+              <w:numPr>
+                <w:ilvl w:val="0"/>
+                <w:numId w:val="2"/>
+              </w:numPr>
+              <w:spacing w:after="20" w:before="0" w:line="248"/>
+            </w:pPr>
+            <w:r>
+              <w:rPr>
+                <w:rFonts w:ascii="Calibri" w:cs="Calibri" w:eastAsia="Calibri" w:hAnsi="Calibri"/>
+                <w:b/>
+                <w:bCs/>
+                <w:i w:val="false"/>
+                <w:iCs w:val="false"/>
+                <w:color w:val="0B0B0B"/>
+                <w:sz w:val="18"/>
+                <w:szCs w:val="18"/>
+              </w:rPr>
+              <w:t xml:space="preserve">Go-forward pricing</w:t>
+            </w:r>
+            <w:r>
+              <w:rPr>
+                <w:rFonts w:ascii="Calibri" w:cs="Calibri" w:eastAsia="Calibri" w:hAnsi="Calibri"/>
+                <w:b w:val="false"/>
+                <w:bCs w:val="false"/>
+                <w:i w:val="false"/>
+                <w:iCs w:val="false"/>
+                <w:color w:val="0B0B0B"/>
+                <w:sz w:val="18"/>
+                <w:szCs w:val="18"/>
+              </w:rPr>
+              <w:t xml:space="preserve"> for the venue and each vendor service</w:t>
+            </w:r>
+          </w:p>
+        </w:tc>
+        <w:tc>
+          <w:tcPr>
+            <w:tcW w:type="dxa" w:w="3504"/>
+            <w:tcBorders>
+              <w:top w:val="single" w:color="FFFFFF" w:sz="24"/>
+              <w:left w:val="single" w:color="FFFFFF" w:sz="24"/>
+              <w:bottom w:val="single" w:color="FFFFFF" w:sz="24"/>
+              <w:right w:val="single" w:color="FFFFFF" w:sz="24"/>
+            </w:tcBorders>
+            <w:shd w:fill="EFF6F9" w:color="auto" w:val="clear"/>
+            <w:tcMar>
+              <w:top w:type="dxa" w:w="100"/>
+              <w:left w:type="dxa" w:w="140"/>
+              <w:bottom w:type="dxa" w:w="100"/>
+              <w:right w:type="dxa" w:w="140"/>
+            </w:tcMar>
+          </w:tcPr>
+          <w:p>
+            <w:pPr>
+              <w:spacing w:after="60" w:before="0" w:line="264"/>
+              <w:jc w:val="left"/>
+            </w:pPr>
+            <w:r>
+              <w:rPr>
+                <w:rFonts w:ascii="Calibri" w:cs="Calibri" w:eastAsia="Calibri" w:hAnsi="Calibri"/>
+                <w:b/>
+                <w:bCs/>
+                <w:i w:val="false"/>
+                <w:iCs w:val="false"/>
+                <w:color w:val="1A939B"/>
+                <w:sz w:val="21"/>
+                <w:szCs w:val="21"/>
+              </w:rPr>
+              <w:t xml:space="preserve">Vendor service timing</w:t>
+            </w:r>
+          </w:p>
+          <w:p>
+            <w:pPr>
+              <w:pStyle w:val="ListParagraph"/>
+              <w:numPr>
+                <w:ilvl w:val="0"/>
+                <w:numId w:val="2"/>
+              </w:numPr>
+              <w:spacing w:after="20" w:before="0" w:line="248"/>
+            </w:pPr>
+            <w:r>
+              <w:rPr>
+                <w:rFonts w:ascii="Calibri" w:cs="Calibri" w:eastAsia="Calibri" w:hAnsi="Calibri"/>
+                <w:b/>
+                <w:bCs/>
+                <w:i w:val="false"/>
+                <w:iCs w:val="false"/>
+                <w:color w:val="0B0B0B"/>
+                <w:sz w:val="18"/>
+                <w:szCs w:val="18"/>
+              </w:rPr>
+              <w:t xml:space="preserve">Attach timeline</w:t>
+            </w:r>
+            <w:r>
+              <w:rPr>
+                <w:rFonts w:ascii="Calibri" w:cs="Calibri" w:eastAsia="Calibri" w:hAnsi="Calibri"/>
+                <w:b w:val="false"/>
+                <w:bCs w:val="false"/>
+                <w:i w:val="false"/>
+                <w:iCs w:val="false"/>
+                <w:color w:val="0B0B0B"/>
+                <w:sz w:val="18"/>
+                <w:szCs w:val="18"/>
+              </w:rPr>
+              <w:t xml:space="preserve"> by service: license, hubs, hiring</w:t>
+            </w:r>
+          </w:p>
+          <w:p>
+            <w:pPr>
+              <w:pStyle w:val="ListParagraph"/>
+              <w:numPr>
+                <w:ilvl w:val="0"/>
+                <w:numId w:val="2"/>
+              </w:numPr>
+              <w:spacing w:after="20" w:before="0" w:line="248"/>
+            </w:pPr>
+            <w:r>
+              <w:rPr>
+                <w:rFonts w:ascii="Calibri" w:cs="Calibri" w:eastAsia="Calibri" w:hAnsi="Calibri"/>
+                <w:b/>
+                <w:bCs/>
+                <w:i w:val="false"/>
+                <w:iCs w:val="false"/>
+                <w:color w:val="0B0B0B"/>
+                <w:sz w:val="18"/>
+                <w:szCs w:val="18"/>
+              </w:rPr>
+              <w:t xml:space="preserve">Ramp by month</w:t>
+            </w:r>
+            <w:r>
+              <w:rPr>
+                <w:rFonts w:ascii="Calibri" w:cs="Calibri" w:eastAsia="Calibri" w:hAnsi="Calibri"/>
+                <w:b w:val="false"/>
+                <w:bCs w:val="false"/>
+                <w:i w:val="false"/>
+                <w:iCs w:val="false"/>
+                <w:color w:val="0B0B0B"/>
+                <w:sz w:val="18"/>
+                <w:szCs w:val="18"/>
+              </w:rPr>
+              <w:t xml:space="preserve"> instead of by year</w:t>
+            </w:r>
+          </w:p>
+        </w:tc>
+      </w:tr>
+    </w:tbl>
+    <w:p>
+      <w:pPr>
+        <w:pStyle w:val="Heading1"/>
+        <w:pBdr>
+          <w:bottom w:val="single" w:color="1A939B" w:sz="12" w:space="4"/>
+        </w:pBdr>
+        <w:spacing w:after="70" w:before="140"/>
+      </w:pPr>
+      <w:r>
+        <w:rPr>
+          <w:rFonts w:ascii="Calibri" w:cs="Calibri" w:eastAsia="Calibri" w:hAnsi="Calibri"/>
+          <w:b/>
+          <w:bCs/>
+          <w:i w:val="false"/>
+          <w:iCs w:val="false"/>
+          <w:color w:val="1A939B"/>
+          <w:sz w:val="30"/>
+          <w:szCs w:val="30"/>
+        </w:rPr>
+        <w:t xml:space="preserve">7. New step: Leads / Tours / Contracts</w:t>
+      </w:r>
+    </w:p>
+    <w:p>
+      <w:pPr>
+        <w:spacing w:after="30" w:before="30"/>
+        <w:jc w:val="center"/>
+      </w:pPr>
+      <w:r>
+        <w:drawing>
+          <wp:inline distT="0" distB="0" distL="0" distR="0">
+            <wp:extent cx="4752975" cy="1304925"/>
+            <wp:effectExtent t="0" r="0" b="0" l="0"/>
+            <wp:docPr id="1" name="" descr="" title=""/>
+            <wp:cNvGraphicFramePr>
+              <a:graphicFrameLocks xmlns:a="http://schemas.openxmlformats.org/drawingml/2006/main" noChangeAspect="1"/>
+            </wp:cNvGraphicFramePr>
+            <a:graphic xmlns:a="http://schemas.openxmlformats.org/drawingml/2006/main">
+              <a:graphicData uri="http://schemas.openxmlformats.org/drawingml/2006/picture">
+                <pic:pic xmlns:pic="http://schemas.openxmlformats.org/drawingml/2006/picture">
+                  <pic:nvPicPr>
+                    <pic:cNvPr id="0" name="" descr=""/>
+                    <pic:cNvPicPr>
+                      <a:picLocks noChangeAspect="1" noChangeArrowheads="1"/>
+                    </pic:cNvPicPr>
+                  </pic:nvPicPr>
+                  <pic:blipFill>
+                    <a:blip r:embed="rId10" cstate="none"/>
+                    <a:srcRect/>
+                    <a:stretch>
+                      <a:fillRect/>
+                    </a:stretch>
+                  </pic:blipFill>
+                  <pic:spPr bwMode="auto">
+                    <a:xfrm>
+                      <a:off x="0" y="0"/>
+                      <a:ext cx="4752975" cy="1304925"/>
+                    </a:xfrm>
+                    <a:prstGeom prst="rect">
+                      <a:avLst/>
+                    </a:prstGeom>
+                  </pic:spPr>
+                </pic:pic>
+              </a:graphicData>
+            </a:graphic>
+          </wp:inline>
+        </w:drawing>
+      </w:r>
+    </w:p>
+    <w:tbl>
+      <w:tblPr>
+        <w:tblW w:type="dxa" w:w="10512"/>
+        <w:tblBorders>
+          <w:top w:val="none" w:color="FFFFFF" w:sz="0"/>
+          <w:left w:val="none" w:color="FFFFFF" w:sz="0"/>
+          <w:bottom w:val="none" w:color="FFFFFF" w:sz="0"/>
+          <w:right w:val="none" w:color="FFFFFF" w:sz="0"/>
+          <w:insideH w:val="single" w:color="auto" w:sz="4"/>
+          <w:insideV w:val="single" w:color="auto" w:sz="4"/>
+        </w:tblBorders>
+      </w:tblPr>
+      <w:tblGrid>
+        <w:gridCol w:w="3000"/>
+        <w:gridCol w:w="7512"/>
+      </w:tblGrid>
+      <w:tr>
+        <w:tc>
+          <w:tcPr>
+            <w:tcW w:type="dxa" w:w="3000"/>
+            <w:tcBorders>
+              <w:top w:val="single" w:color="FFFFFF" w:sz="24"/>
+              <w:left w:val="single" w:color="FFFFFF" w:sz="24"/>
+              <w:bottom w:val="single" w:color="FFFFFF" w:sz="24"/>
+              <w:right w:val="single" w:color="FFFFFF" w:sz="24"/>
+            </w:tcBorders>
+            <w:shd w:fill="EFF6F9" w:color="auto" w:val="clear"/>
+            <w:tcMar>
+              <w:top w:type="dxa" w:w="60"/>
+              <w:left w:type="dxa" w:w="140"/>
+              <w:bottom w:type="dxa" w:w="60"/>
+              <w:right w:type="dxa" w:w="140"/>
+            </w:tcMar>
+          </w:tcPr>
+          <w:p>
+            <w:pPr>
+              <w:spacing w:after="0" w:before="0" w:line="264"/>
+              <w:jc w:val="left"/>
+            </w:pPr>
+            <w:r>
+              <w:rPr>
+                <w:rFonts w:ascii="Calibri" w:cs="Calibri" w:eastAsia="Calibri" w:hAnsi="Calibri"/>
+                <w:b/>
+                <w:bCs/>
+                <w:i w:val="false"/>
+                <w:iCs w:val="false"/>
+                <w:color w:val="1A939B"/>
+                <w:sz w:val="20"/>
+                <w:szCs w:val="20"/>
+              </w:rPr>
+              <w:t xml:space="preserve">Annual first</w:t>
+            </w:r>
+          </w:p>
+        </w:tc>
+        <w:tc>
+          <w:tcPr>
+            <w:tcW w:type="dxa" w:w="7512"/>
+            <w:tcBorders>
+              <w:top w:val="single" w:color="FFFFFF" w:sz="24"/>
+              <w:left w:val="single" w:color="FFFFFF" w:sz="24"/>
+              <w:bottom w:val="single" w:color="FFFFFF" w:sz="24"/>
+              <w:right w:val="single" w:color="FFFFFF" w:sz="24"/>
+            </w:tcBorders>
+            <w:shd w:fill="F7F7F5" w:color="auto" w:val="clear"/>
+            <w:tcMar>
+              <w:top w:type="dxa" w:w="60"/>
+              <w:left w:type="dxa" w:w="140"/>
+              <w:bottom w:type="dxa" w:w="60"/>
+              <w:right w:type="dxa" w:w="140"/>
+            </w:tcMar>
+          </w:tcPr>
+          <w:p>
+            <w:pPr>
+              <w:spacing w:after="0" w:before="0" w:line="264"/>
+              <w:jc w:val="left"/>
+            </w:pPr>
+            <w:r>
+              <w:rPr>
+                <w:rFonts w:ascii="Calibri" w:cs="Calibri" w:eastAsia="Calibri" w:hAnsi="Calibri"/>
+                <w:b w:val="false"/>
+                <w:bCs w:val="false"/>
+                <w:i w:val="false"/>
+                <w:iCs w:val="false"/>
+                <w:color w:val="0B0B0B"/>
+                <w:sz w:val="20"/>
+                <w:szCs w:val="20"/>
+              </w:rPr>
+              <w:t xml:space="preserve">Events for Years 1 to 3 set the contracts we need; conversion rates set the tours and leads behind them.</w:t>
+            </w:r>
+          </w:p>
+        </w:tc>
+      </w:tr>
+      <w:tr>
+        <w:tc>
+          <w:tcPr>
+            <w:tcW w:type="dxa" w:w="3000"/>
+            <w:tcBorders>
+              <w:top w:val="single" w:color="FFFFFF" w:sz="24"/>
+              <w:left w:val="single" w:color="FFFFFF" w:sz="24"/>
+              <w:bottom w:val="single" w:color="FFFFFF" w:sz="24"/>
+              <w:right w:val="single" w:color="FFFFFF" w:sz="24"/>
+            </w:tcBorders>
+            <w:shd w:fill="EFF6F9" w:color="auto" w:val="clear"/>
+            <w:tcMar>
+              <w:top w:type="dxa" w:w="60"/>
+              <w:left w:type="dxa" w:w="140"/>
+              <w:bottom w:type="dxa" w:w="60"/>
+              <w:right w:type="dxa" w:w="140"/>
+            </w:tcMar>
+          </w:tcPr>
+          <w:p>
+            <w:pPr>
+              <w:spacing w:after="0" w:before="0" w:line="264"/>
+              <w:jc w:val="left"/>
+            </w:pPr>
+            <w:r>
+              <w:rPr>
+                <w:rFonts w:ascii="Calibri" w:cs="Calibri" w:eastAsia="Calibri" w:hAnsi="Calibri"/>
+                <w:b/>
+                <w:bCs/>
+                <w:i w:val="false"/>
+                <w:iCs w:val="false"/>
+                <w:color w:val="1A939B"/>
+                <w:sz w:val="20"/>
+                <w:szCs w:val="20"/>
+              </w:rPr>
+              <w:t xml:space="preserve">Conversion rates</w:t>
+            </w:r>
+          </w:p>
+        </w:tc>
+        <w:tc>
+          <w:tcPr>
+            <w:tcW w:type="dxa" w:w="7512"/>
+            <w:tcBorders>
+              <w:top w:val="single" w:color="FFFFFF" w:sz="24"/>
+              <w:left w:val="single" w:color="FFFFFF" w:sz="24"/>
+              <w:bottom w:val="single" w:color="FFFFFF" w:sz="24"/>
+              <w:right w:val="single" w:color="FFFFFF" w:sz="24"/>
+            </w:tcBorders>
+            <w:shd w:fill="F7F7F5" w:color="auto" w:val="clear"/>
+            <w:tcMar>
+              <w:top w:type="dxa" w:w="60"/>
+              <w:left w:type="dxa" w:w="140"/>
+              <w:bottom w:type="dxa" w:w="60"/>
+              <w:right w:type="dxa" w:w="140"/>
+            </w:tcMar>
+          </w:tcPr>
+          <w:p>
+            <w:pPr>
+              <w:spacing w:after="20" w:before="0" w:line="240"/>
+              <w:jc w:val="left"/>
+            </w:pPr>
+            <w:r>
+              <w:rPr>
+                <w:rFonts w:ascii="Calibri" w:cs="Calibri" w:eastAsia="Calibri" w:hAnsi="Calibri"/>
+                <w:b w:val="false"/>
+                <w:bCs w:val="false"/>
+                <w:i w:val="false"/>
+                <w:iCs w:val="false"/>
+                <w:color w:val="0B0B0B"/>
+                <w:sz w:val="20"/>
+                <w:szCs w:val="20"/>
+              </w:rPr>
+              <w:t xml:space="preserve">L→T: leads that become tours. T→C: tours that become contracts.</w:t>
+            </w:r>
+          </w:p>
+          <w:p>
+            <w:pPr>
+              <w:spacing w:after="0" w:before="0" w:line="240"/>
+              <w:jc w:val="left"/>
+            </w:pPr>
+            <w:r>
+              <w:rPr>
+                <w:rFonts w:ascii="Calibri" w:cs="Calibri" w:eastAsia="Calibri" w:hAnsi="Calibri"/>
+                <w:b w:val="false"/>
+                <w:bCs w:val="false"/>
+                <w:i w:val="false"/>
+                <w:iCs w:val="false"/>
+                <w:color w:val="0B0B0B"/>
+                <w:sz w:val="20"/>
+                <w:szCs w:val="20"/>
+              </w:rPr>
+              <w:t xml:space="preserve">Venue history if they have it (they often don't); otherwise Walters averages.</w:t>
+            </w:r>
+          </w:p>
+        </w:tc>
+      </w:tr>
+    </w:tbl>
+    <w:p>
+      <w:pPr>
+        <w:pStyle w:val="Heading1"/>
+        <w:pBdr>
+          <w:bottom w:val="single" w:color="1A939B" w:sz="12" w:space="4"/>
+        </w:pBdr>
+        <w:spacing w:after="70" w:before="140"/>
+      </w:pPr>
+      <w:r>
+        <w:rPr>
+          <w:rFonts w:ascii="Calibri" w:cs="Calibri" w:eastAsia="Calibri" w:hAnsi="Calibri"/>
+          <w:b/>
+          <w:bCs/>
+          <w:i w:val="false"/>
+          <w:iCs w:val="false"/>
+          <w:color w:val="1A939B"/>
+          <w:sz w:val="30"/>
+          <w:szCs w:val="30"/>
+        </w:rPr>
+        <w:t xml:space="preserve">8. Monthly build</w:t>
+      </w:r>
+    </w:p>
+    <w:p>
+      <w:pPr>
+        <w:spacing w:after="30" w:before="30"/>
+        <w:jc w:val="center"/>
+      </w:pPr>
+      <w:r>
+        <w:drawing>
+          <wp:inline distT="0" distB="0" distL="0" distR="0">
+            <wp:extent cx="4391025" cy="1828800"/>
+            <wp:effectExtent t="0" r="0" b="0" l="0"/>
+            <wp:docPr id="1" name="" descr="" title=""/>
+            <wp:cNvGraphicFramePr>
+              <a:graphicFrameLocks xmlns:a="http://schemas.openxmlformats.org/drawingml/2006/main" noChangeAspect="1"/>
+            </wp:cNvGraphicFramePr>
+            <a:graphic xmlns:a="http://schemas.openxmlformats.org/drawingml/2006/main">
+              <a:graphicData uri="http://schemas.openxmlformats.org/drawingml/2006/picture">
+                <pic:pic xmlns:pic="http://schemas.openxmlformats.org/drawingml/2006/picture">
+                  <pic:nvPicPr>
+                    <pic:cNvPr id="0" name="" descr=""/>
+                    <pic:cNvPicPr>
+                      <a:picLocks noChangeAspect="1" noChangeArrowheads="1"/>
+                    </pic:cNvPicPr>
+                  </pic:nvPicPr>
+                  <pic:blipFill>
+                    <a:blip r:embed="rId11" cstate="none"/>
+                    <a:srcRect/>
+                    <a:stretch>
+                      <a:fillRect/>
+                    </a:stretch>
+                  </pic:blipFill>
+                  <pic:spPr bwMode="auto">
+                    <a:xfrm>
+                      <a:off x="0" y="0"/>
+                      <a:ext cx="4391025" cy="1828800"/>
+                    </a:xfrm>
+                    <a:prstGeom prst="rect">
+                      <a:avLst/>
+                    </a:prstGeom>
+                  </pic:spPr>
+                </pic:pic>
+              </a:graphicData>
+            </a:graphic>
+          </wp:inline>
+        </w:drawing>
+      </w:r>
+    </w:p>
+    <w:tbl>
+      <w:tblPr>
+        <w:tblW w:type="dxa" w:w="10512"/>
+        <w:tblBorders>
+          <w:top w:val="none" w:color="FFFFFF" w:sz="0"/>
+          <w:left w:val="none" w:color="FFFFFF" w:sz="0"/>
+          <w:bottom w:val="none" w:color="FFFFFF" w:sz="0"/>
+          <w:right w:val="none" w:color="FFFFFF" w:sz="0"/>
+          <w:insideH w:val="single" w:color="auto" w:sz="4"/>
+          <w:insideV w:val="single" w:color="auto" w:sz="4"/>
+        </w:tblBorders>
+      </w:tblPr>
+      <w:tblGrid>
+        <w:gridCol w:w="2600"/>
+        <w:gridCol w:w="7912"/>
+      </w:tblGrid>
+      <w:tr>
+        <w:tc>
+          <w:tcPr>
+            <w:tcW w:type="dxa" w:w="2600"/>
+            <w:tcBorders>
+              <w:top w:val="single" w:color="FFFFFF" w:sz="24"/>
+              <w:left w:val="single" w:color="FFFFFF" w:sz="24"/>
+              <w:bottom w:val="single" w:color="FFFFFF" w:sz="24"/>
+              <w:right w:val="single" w:color="FFFFFF" w:sz="24"/>
+            </w:tcBorders>
+            <w:shd w:fill="EFF6F9" w:color="auto" w:val="clear"/>
+            <w:tcMar>
+              <w:top w:type="dxa" w:w="60"/>
+              <w:left w:type="dxa" w:w="140"/>
+              <w:bottom w:type="dxa" w:w="60"/>
+              <w:right w:type="dxa" w:w="140"/>
+            </w:tcMar>
+          </w:tcPr>
+          <w:p>
+            <w:pPr>
+              <w:spacing w:after="0" w:before="0" w:line="264"/>
+              <w:jc w:val="left"/>
+            </w:pPr>
+            <w:r>
+              <w:rPr>
+                <w:rFonts w:ascii="Calibri" w:cs="Calibri" w:eastAsia="Calibri" w:hAnsi="Calibri"/>
+                <w:b/>
+                <w:bCs/>
+                <w:i w:val="false"/>
+                <w:iCs w:val="false"/>
+                <w:color w:val="1A939B"/>
+                <w:sz w:val="20"/>
+                <w:szCs w:val="20"/>
+              </w:rPr>
+              <w:t xml:space="preserve">Annual to monthly</w:t>
+            </w:r>
+          </w:p>
+        </w:tc>
+        <w:tc>
+          <w:tcPr>
+            <w:tcW w:type="dxa" w:w="7912"/>
+            <w:tcBorders>
+              <w:top w:val="single" w:color="FFFFFF" w:sz="24"/>
+              <w:left w:val="single" w:color="FFFFFF" w:sz="24"/>
+              <w:bottom w:val="single" w:color="FFFFFF" w:sz="24"/>
+              <w:right w:val="single" w:color="FFFFFF" w:sz="24"/>
+            </w:tcBorders>
+            <w:shd w:fill="F7F7F5" w:color="auto" w:val="clear"/>
+            <w:tcMar>
+              <w:top w:type="dxa" w:w="60"/>
+              <w:left w:type="dxa" w:w="140"/>
+              <w:bottom w:type="dxa" w:w="60"/>
+              <w:right w:type="dxa" w:w="140"/>
+            </w:tcMar>
+          </w:tcPr>
+          <w:p>
+            <w:pPr>
+              <w:spacing w:after="20" w:before="0" w:line="240"/>
+              <w:jc w:val="left"/>
+            </w:pPr>
+            <w:r>
+              <w:rPr>
+                <w:rFonts w:ascii="Calibri" w:cs="Calibri" w:eastAsia="Calibri" w:hAnsi="Calibri"/>
+                <w:b w:val="false"/>
+                <w:bCs w:val="false"/>
+                <w:i w:val="false"/>
+                <w:iCs w:val="false"/>
+                <w:color w:val="0B0B0B"/>
+                <w:sz w:val="20"/>
+                <w:szCs w:val="20"/>
+              </w:rPr>
+              <w:t xml:space="preserve">Leads, tours, contracts, events and financials are split by month on seasonality (a Walters comparable venue if no history).</w:t>
+            </w:r>
+          </w:p>
+          <w:p>
+            <w:pPr>
+              <w:spacing w:after="0" w:before="0" w:line="240"/>
+              <w:jc w:val="left"/>
+            </w:pPr>
+            <w:r>
+              <w:rPr>
+                <w:rFonts w:ascii="Calibri" w:cs="Calibri" w:eastAsia="Calibri" w:hAnsi="Calibri"/>
+                <w:b w:val="false"/>
+                <w:bCs w:val="false"/>
+                <w:i w:val="false"/>
+                <w:iCs w:val="false"/>
+                <w:color w:val="0B0B0B"/>
+                <w:sz w:val="20"/>
+                <w:szCs w:val="20"/>
+              </w:rPr>
+              <w:t xml:space="preserve">Early months ramp up to a stable lead and tour count; contracts follow.</w:t>
+            </w:r>
+          </w:p>
+        </w:tc>
+      </w:tr>
+      <w:tr>
+        <w:tc>
+          <w:tcPr>
+            <w:tcW w:type="dxa" w:w="2600"/>
+            <w:tcBorders>
+              <w:top w:val="single" w:color="FFFFFF" w:sz="24"/>
+              <w:left w:val="single" w:color="FFFFFF" w:sz="24"/>
+              <w:bottom w:val="single" w:color="FFFFFF" w:sz="24"/>
+              <w:right w:val="single" w:color="FFFFFF" w:sz="24"/>
+            </w:tcBorders>
+            <w:shd w:fill="EFF6F9" w:color="auto" w:val="clear"/>
+            <w:tcMar>
+              <w:top w:type="dxa" w:w="60"/>
+              <w:left w:type="dxa" w:w="140"/>
+              <w:bottom w:type="dxa" w:w="60"/>
+              <w:right w:type="dxa" w:w="140"/>
+            </w:tcMar>
+          </w:tcPr>
+          <w:p>
+            <w:pPr>
+              <w:spacing w:after="0" w:before="0" w:line="264"/>
+              <w:jc w:val="left"/>
+            </w:pPr>
+            <w:r>
+              <w:rPr>
+                <w:rFonts w:ascii="Calibri" w:cs="Calibri" w:eastAsia="Calibri" w:hAnsi="Calibri"/>
+                <w:b/>
+                <w:bCs/>
+                <w:i w:val="false"/>
+                <w:iCs w:val="false"/>
+                <w:color w:val="1A939B"/>
+                <w:sz w:val="20"/>
+                <w:szCs w:val="20"/>
+              </w:rPr>
+              <w:t xml:space="preserve">Events by month</w:t>
+            </w:r>
+          </w:p>
+        </w:tc>
+        <w:tc>
+          <w:tcPr>
+            <w:tcW w:type="dxa" w:w="7912"/>
+            <w:tcBorders>
+              <w:top w:val="single" w:color="FFFFFF" w:sz="24"/>
+              <w:left w:val="single" w:color="FFFFFF" w:sz="24"/>
+              <w:bottom w:val="single" w:color="FFFFFF" w:sz="24"/>
+              <w:right w:val="single" w:color="FFFFFF" w:sz="24"/>
+            </w:tcBorders>
+            <w:shd w:fill="F7F7F5" w:color="auto" w:val="clear"/>
+            <w:tcMar>
+              <w:top w:type="dxa" w:w="60"/>
+              <w:left w:type="dxa" w:w="140"/>
+              <w:bottom w:type="dxa" w:w="60"/>
+              <w:right w:type="dxa" w:w="140"/>
+            </w:tcMar>
+          </w:tcPr>
+          <w:p>
+            <w:pPr>
+              <w:spacing w:after="0" w:before="0" w:line="264"/>
+              <w:jc w:val="left"/>
+            </w:pPr>
+            <w:r>
+              <w:rPr>
+                <w:rFonts w:ascii="Calibri" w:cs="Calibri" w:eastAsia="Calibri" w:hAnsi="Calibri"/>
+                <w:b w:val="false"/>
+                <w:bCs w:val="false"/>
+                <w:i w:val="false"/>
+                <w:iCs w:val="false"/>
+                <w:color w:val="0B0B0B"/>
+                <w:sz w:val="20"/>
+                <w:szCs w:val="20"/>
+              </w:rPr>
+              <w:t xml:space="preserve">OC events land in their booked month; new events fill the rest of the annual total.</w:t>
+            </w:r>
+          </w:p>
+        </w:tc>
+      </w:tr>
+      <w:tr>
+        <w:tc>
+          <w:tcPr>
+            <w:tcW w:type="dxa" w:w="2600"/>
+            <w:tcBorders>
+              <w:top w:val="single" w:color="FFFFFF" w:sz="24"/>
+              <w:left w:val="single" w:color="FFFFFF" w:sz="24"/>
+              <w:bottom w:val="single" w:color="FFFFFF" w:sz="24"/>
+              <w:right w:val="single" w:color="FFFFFF" w:sz="24"/>
+            </w:tcBorders>
+            <w:shd w:fill="EFF6F9" w:color="auto" w:val="clear"/>
+            <w:tcMar>
+              <w:top w:type="dxa" w:w="60"/>
+              <w:left w:type="dxa" w:w="140"/>
+              <w:bottom w:type="dxa" w:w="60"/>
+              <w:right w:type="dxa" w:w="140"/>
+            </w:tcMar>
+          </w:tcPr>
+          <w:p>
+            <w:pPr>
+              <w:spacing w:after="0" w:before="0" w:line="264"/>
+              <w:jc w:val="left"/>
+            </w:pPr>
+            <w:r>
+              <w:rPr>
+                <w:rFonts w:ascii="Calibri" w:cs="Calibri" w:eastAsia="Calibri" w:hAnsi="Calibri"/>
+                <w:b/>
+                <w:bCs/>
+                <w:i w:val="false"/>
+                <w:iCs w:val="false"/>
+                <w:color w:val="1A939B"/>
+                <w:sz w:val="20"/>
+                <w:szCs w:val="20"/>
+              </w:rPr>
+              <w:t xml:space="preserve">Attachment and $ / Event</w:t>
+            </w:r>
+          </w:p>
+        </w:tc>
+        <w:tc>
+          <w:tcPr>
+            <w:tcW w:type="dxa" w:w="7912"/>
+            <w:tcBorders>
+              <w:top w:val="single" w:color="FFFFFF" w:sz="24"/>
+              <w:left w:val="single" w:color="FFFFFF" w:sz="24"/>
+              <w:bottom w:val="single" w:color="FFFFFF" w:sz="24"/>
+              <w:right w:val="single" w:color="FFFFFF" w:sz="24"/>
+            </w:tcBorders>
+            <w:shd w:fill="F7F7F5" w:color="auto" w:val="clear"/>
+            <w:tcMar>
+              <w:top w:type="dxa" w:w="60"/>
+              <w:left w:type="dxa" w:w="140"/>
+              <w:bottom w:type="dxa" w:w="60"/>
+              <w:right w:type="dxa" w:w="140"/>
+            </w:tcMar>
+          </w:tcPr>
+          <w:p>
+            <w:pPr>
+              <w:spacing w:after="0" w:before="0" w:line="264"/>
+              <w:jc w:val="left"/>
+            </w:pPr>
+            <w:r>
+              <w:rPr>
+                <w:rFonts w:ascii="Calibri" w:cs="Calibri" w:eastAsia="Calibri" w:hAnsi="Calibri"/>
+                <w:b w:val="false"/>
+                <w:bCs w:val="false"/>
+                <w:i w:val="false"/>
+                <w:iCs w:val="false"/>
+                <w:color w:val="0B0B0B"/>
+                <w:sz w:val="20"/>
+                <w:szCs w:val="20"/>
+              </w:rPr>
+              <w:t xml:space="preserve">Applied directly by month; not split out from an annual total.</w:t>
             </w:r>
           </w:p>
         </w:tc>

</xml_diff>

<commit_message>
Pro forma sheet: flip funnel order, annotate monthly charts, drop Part 2 tables
Co-Authored-By: Claude Fable 5.1 <noreply@anthropic.com>

Claude-Session: https://claude.ai/code/session_01H1o2hAHLKnaHhCBRW9ndXv
</commit_message>
<xml_diff>
--- a/docs/proforma-cheatsheet/Pro Forma Sheet.docx
+++ b/docs/proforma-cheatsheet/Pro Forma Sheet.docx
@@ -2607,7 +2607,7 @@
       <w:r>
         <w:drawing>
           <wp:inline distT="0" distB="0" distL="0" distR="0">
-            <wp:extent cx="4752975" cy="1304925"/>
+            <wp:extent cx="6038850" cy="1333500"/>
             <wp:effectExtent t="0" r="0" b="0" l="0"/>
             <wp:docPr id="1" name="" descr="" title=""/>
             <wp:cNvGraphicFramePr>
@@ -2632,7 +2632,7 @@
                   <pic:spPr bwMode="auto">
                     <a:xfrm>
                       <a:off x="0" y="0"/>
-                      <a:ext cx="4752975" cy="1304925"/>
+                      <a:ext cx="6038850" cy="1333500"/>
                     </a:xfrm>
                     <a:prstGeom prst="rect">
                       <a:avLst/>
@@ -2645,194 +2645,6 @@
         </w:drawing>
       </w:r>
     </w:p>
-    <w:tbl>
-      <w:tblPr>
-        <w:tblW w:type="dxa" w:w="10512"/>
-        <w:tblBorders>
-          <w:top w:val="none" w:color="FFFFFF" w:sz="0"/>
-          <w:left w:val="none" w:color="FFFFFF" w:sz="0"/>
-          <w:bottom w:val="none" w:color="FFFFFF" w:sz="0"/>
-          <w:right w:val="none" w:color="FFFFFF" w:sz="0"/>
-          <w:insideH w:val="single" w:color="auto" w:sz="4"/>
-          <w:insideV w:val="single" w:color="auto" w:sz="4"/>
-        </w:tblBorders>
-      </w:tblPr>
-      <w:tblGrid>
-        <w:gridCol w:w="3000"/>
-        <w:gridCol w:w="7512"/>
-      </w:tblGrid>
-      <w:tr>
-        <w:tc>
-          <w:tcPr>
-            <w:tcW w:type="dxa" w:w="3000"/>
-            <w:tcBorders>
-              <w:top w:val="single" w:color="FFFFFF" w:sz="24"/>
-              <w:left w:val="single" w:color="FFFFFF" w:sz="24"/>
-              <w:bottom w:val="single" w:color="FFFFFF" w:sz="24"/>
-              <w:right w:val="single" w:color="FFFFFF" w:sz="24"/>
-            </w:tcBorders>
-            <w:shd w:fill="EFF6F9" w:color="auto" w:val="clear"/>
-            <w:tcMar>
-              <w:top w:type="dxa" w:w="60"/>
-              <w:left w:type="dxa" w:w="140"/>
-              <w:bottom w:type="dxa" w:w="60"/>
-              <w:right w:type="dxa" w:w="140"/>
-            </w:tcMar>
-          </w:tcPr>
-          <w:p>
-            <w:pPr>
-              <w:spacing w:after="0" w:before="0" w:line="264"/>
-              <w:jc w:val="left"/>
-            </w:pPr>
-            <w:r>
-              <w:rPr>
-                <w:rFonts w:ascii="Calibri" w:cs="Calibri" w:eastAsia="Calibri" w:hAnsi="Calibri"/>
-                <w:b/>
-                <w:bCs/>
-                <w:i w:val="false"/>
-                <w:iCs w:val="false"/>
-                <w:color w:val="1A939B"/>
-                <w:sz w:val="20"/>
-                <w:szCs w:val="20"/>
-              </w:rPr>
-              <w:t xml:space="preserve">Annual first</w:t>
-            </w:r>
-          </w:p>
-        </w:tc>
-        <w:tc>
-          <w:tcPr>
-            <w:tcW w:type="dxa" w:w="7512"/>
-            <w:tcBorders>
-              <w:top w:val="single" w:color="FFFFFF" w:sz="24"/>
-              <w:left w:val="single" w:color="FFFFFF" w:sz="24"/>
-              <w:bottom w:val="single" w:color="FFFFFF" w:sz="24"/>
-              <w:right w:val="single" w:color="FFFFFF" w:sz="24"/>
-            </w:tcBorders>
-            <w:shd w:fill="F7F7F5" w:color="auto" w:val="clear"/>
-            <w:tcMar>
-              <w:top w:type="dxa" w:w="60"/>
-              <w:left w:type="dxa" w:w="140"/>
-              <w:bottom w:type="dxa" w:w="60"/>
-              <w:right w:type="dxa" w:w="140"/>
-            </w:tcMar>
-          </w:tcPr>
-          <w:p>
-            <w:pPr>
-              <w:spacing w:after="0" w:before="0" w:line="264"/>
-              <w:jc w:val="left"/>
-            </w:pPr>
-            <w:r>
-              <w:rPr>
-                <w:rFonts w:ascii="Calibri" w:cs="Calibri" w:eastAsia="Calibri" w:hAnsi="Calibri"/>
-                <w:b w:val="false"/>
-                <w:bCs w:val="false"/>
-                <w:i w:val="false"/>
-                <w:iCs w:val="false"/>
-                <w:color w:val="0B0B0B"/>
-                <w:sz w:val="20"/>
-                <w:szCs w:val="20"/>
-              </w:rPr>
-              <w:t xml:space="preserve">Events for Years 1 to 3 set the contracts we need; conversion rates set the tours and leads behind them.</w:t>
-            </w:r>
-          </w:p>
-        </w:tc>
-      </w:tr>
-      <w:tr>
-        <w:tc>
-          <w:tcPr>
-            <w:tcW w:type="dxa" w:w="3000"/>
-            <w:tcBorders>
-              <w:top w:val="single" w:color="FFFFFF" w:sz="24"/>
-              <w:left w:val="single" w:color="FFFFFF" w:sz="24"/>
-              <w:bottom w:val="single" w:color="FFFFFF" w:sz="24"/>
-              <w:right w:val="single" w:color="FFFFFF" w:sz="24"/>
-            </w:tcBorders>
-            <w:shd w:fill="EFF6F9" w:color="auto" w:val="clear"/>
-            <w:tcMar>
-              <w:top w:type="dxa" w:w="60"/>
-              <w:left w:type="dxa" w:w="140"/>
-              <w:bottom w:type="dxa" w:w="60"/>
-              <w:right w:type="dxa" w:w="140"/>
-            </w:tcMar>
-          </w:tcPr>
-          <w:p>
-            <w:pPr>
-              <w:spacing w:after="0" w:before="0" w:line="264"/>
-              <w:jc w:val="left"/>
-            </w:pPr>
-            <w:r>
-              <w:rPr>
-                <w:rFonts w:ascii="Calibri" w:cs="Calibri" w:eastAsia="Calibri" w:hAnsi="Calibri"/>
-                <w:b/>
-                <w:bCs/>
-                <w:i w:val="false"/>
-                <w:iCs w:val="false"/>
-                <w:color w:val="1A939B"/>
-                <w:sz w:val="20"/>
-                <w:szCs w:val="20"/>
-              </w:rPr>
-              <w:t xml:space="preserve">Conversion rates</w:t>
-            </w:r>
-          </w:p>
-        </w:tc>
-        <w:tc>
-          <w:tcPr>
-            <w:tcW w:type="dxa" w:w="7512"/>
-            <w:tcBorders>
-              <w:top w:val="single" w:color="FFFFFF" w:sz="24"/>
-              <w:left w:val="single" w:color="FFFFFF" w:sz="24"/>
-              <w:bottom w:val="single" w:color="FFFFFF" w:sz="24"/>
-              <w:right w:val="single" w:color="FFFFFF" w:sz="24"/>
-            </w:tcBorders>
-            <w:shd w:fill="F7F7F5" w:color="auto" w:val="clear"/>
-            <w:tcMar>
-              <w:top w:type="dxa" w:w="60"/>
-              <w:left w:type="dxa" w:w="140"/>
-              <w:bottom w:type="dxa" w:w="60"/>
-              <w:right w:type="dxa" w:w="140"/>
-            </w:tcMar>
-          </w:tcPr>
-          <w:p>
-            <w:pPr>
-              <w:spacing w:after="20" w:before="0" w:line="240"/>
-              <w:jc w:val="left"/>
-            </w:pPr>
-            <w:r>
-              <w:rPr>
-                <w:rFonts w:ascii="Calibri" w:cs="Calibri" w:eastAsia="Calibri" w:hAnsi="Calibri"/>
-                <w:b w:val="false"/>
-                <w:bCs w:val="false"/>
-                <w:i w:val="false"/>
-                <w:iCs w:val="false"/>
-                <w:color w:val="0B0B0B"/>
-                <w:sz w:val="20"/>
-                <w:szCs w:val="20"/>
-              </w:rPr>
-              <w:t xml:space="preserve">L→T: leads that become tours. T→C: tours that become contracts.</w:t>
-            </w:r>
-          </w:p>
-          <w:p>
-            <w:pPr>
-              <w:spacing w:after="0" w:before="0" w:line="240"/>
-              <w:jc w:val="left"/>
-            </w:pPr>
-            <w:r>
-              <w:rPr>
-                <w:rFonts w:ascii="Calibri" w:cs="Calibri" w:eastAsia="Calibri" w:hAnsi="Calibri"/>
-                <w:b w:val="false"/>
-                <w:bCs w:val="false"/>
-                <w:i w:val="false"/>
-                <w:iCs w:val="false"/>
-                <w:color w:val="0B0B0B"/>
-                <w:sz w:val="20"/>
-                <w:szCs w:val="20"/>
-              </w:rPr>
-              <w:t xml:space="preserve">Venue history if they have it (they often don't); otherwise Walters averages.</w:t>
-            </w:r>
-          </w:p>
-        </w:tc>
-      </w:tr>
-    </w:tbl>
     <w:p>
       <w:pPr>
         <w:pStyle w:val="Heading1"/>
@@ -2863,7 +2675,7 @@
       <w:r>
         <w:drawing>
           <wp:inline distT="0" distB="0" distL="0" distR="0">
-            <wp:extent cx="4391025" cy="1828800"/>
+            <wp:extent cx="6219825" cy="2762250"/>
             <wp:effectExtent t="0" r="0" b="0" l="0"/>
             <wp:docPr id="1" name="" descr="" title=""/>
             <wp:cNvGraphicFramePr>
@@ -2888,7 +2700,7 @@
                   <pic:spPr bwMode="auto">
                     <a:xfrm>
                       <a:off x="0" y="0"/>
-                      <a:ext cx="4391025" cy="1828800"/>
+                      <a:ext cx="6219825" cy="2762250"/>
                     </a:xfrm>
                     <a:prstGeom prst="rect">
                       <a:avLst/>
@@ -2901,270 +2713,6 @@
         </w:drawing>
       </w:r>
     </w:p>
-    <w:tbl>
-      <w:tblPr>
-        <w:tblW w:type="dxa" w:w="10512"/>
-        <w:tblBorders>
-          <w:top w:val="none" w:color="FFFFFF" w:sz="0"/>
-          <w:left w:val="none" w:color="FFFFFF" w:sz="0"/>
-          <w:bottom w:val="none" w:color="FFFFFF" w:sz="0"/>
-          <w:right w:val="none" w:color="FFFFFF" w:sz="0"/>
-          <w:insideH w:val="single" w:color="auto" w:sz="4"/>
-          <w:insideV w:val="single" w:color="auto" w:sz="4"/>
-        </w:tblBorders>
-      </w:tblPr>
-      <w:tblGrid>
-        <w:gridCol w:w="2600"/>
-        <w:gridCol w:w="7912"/>
-      </w:tblGrid>
-      <w:tr>
-        <w:tc>
-          <w:tcPr>
-            <w:tcW w:type="dxa" w:w="2600"/>
-            <w:tcBorders>
-              <w:top w:val="single" w:color="FFFFFF" w:sz="24"/>
-              <w:left w:val="single" w:color="FFFFFF" w:sz="24"/>
-              <w:bottom w:val="single" w:color="FFFFFF" w:sz="24"/>
-              <w:right w:val="single" w:color="FFFFFF" w:sz="24"/>
-            </w:tcBorders>
-            <w:shd w:fill="EFF6F9" w:color="auto" w:val="clear"/>
-            <w:tcMar>
-              <w:top w:type="dxa" w:w="60"/>
-              <w:left w:type="dxa" w:w="140"/>
-              <w:bottom w:type="dxa" w:w="60"/>
-              <w:right w:type="dxa" w:w="140"/>
-            </w:tcMar>
-          </w:tcPr>
-          <w:p>
-            <w:pPr>
-              <w:spacing w:after="0" w:before="0" w:line="264"/>
-              <w:jc w:val="left"/>
-            </w:pPr>
-            <w:r>
-              <w:rPr>
-                <w:rFonts w:ascii="Calibri" w:cs="Calibri" w:eastAsia="Calibri" w:hAnsi="Calibri"/>
-                <w:b/>
-                <w:bCs/>
-                <w:i w:val="false"/>
-                <w:iCs w:val="false"/>
-                <w:color w:val="1A939B"/>
-                <w:sz w:val="20"/>
-                <w:szCs w:val="20"/>
-              </w:rPr>
-              <w:t xml:space="preserve">Annual to monthly</w:t>
-            </w:r>
-          </w:p>
-        </w:tc>
-        <w:tc>
-          <w:tcPr>
-            <w:tcW w:type="dxa" w:w="7912"/>
-            <w:tcBorders>
-              <w:top w:val="single" w:color="FFFFFF" w:sz="24"/>
-              <w:left w:val="single" w:color="FFFFFF" w:sz="24"/>
-              <w:bottom w:val="single" w:color="FFFFFF" w:sz="24"/>
-              <w:right w:val="single" w:color="FFFFFF" w:sz="24"/>
-            </w:tcBorders>
-            <w:shd w:fill="F7F7F5" w:color="auto" w:val="clear"/>
-            <w:tcMar>
-              <w:top w:type="dxa" w:w="60"/>
-              <w:left w:type="dxa" w:w="140"/>
-              <w:bottom w:type="dxa" w:w="60"/>
-              <w:right w:type="dxa" w:w="140"/>
-            </w:tcMar>
-          </w:tcPr>
-          <w:p>
-            <w:pPr>
-              <w:spacing w:after="20" w:before="0" w:line="240"/>
-              <w:jc w:val="left"/>
-            </w:pPr>
-            <w:r>
-              <w:rPr>
-                <w:rFonts w:ascii="Calibri" w:cs="Calibri" w:eastAsia="Calibri" w:hAnsi="Calibri"/>
-                <w:b w:val="false"/>
-                <w:bCs w:val="false"/>
-                <w:i w:val="false"/>
-                <w:iCs w:val="false"/>
-                <w:color w:val="0B0B0B"/>
-                <w:sz w:val="20"/>
-                <w:szCs w:val="20"/>
-              </w:rPr>
-              <w:t xml:space="preserve">Leads, tours, contracts, events and financials are split by month on seasonality (a Walters comparable venue if no history).</w:t>
-            </w:r>
-          </w:p>
-          <w:p>
-            <w:pPr>
-              <w:spacing w:after="0" w:before="0" w:line="240"/>
-              <w:jc w:val="left"/>
-            </w:pPr>
-            <w:r>
-              <w:rPr>
-                <w:rFonts w:ascii="Calibri" w:cs="Calibri" w:eastAsia="Calibri" w:hAnsi="Calibri"/>
-                <w:b w:val="false"/>
-                <w:bCs w:val="false"/>
-                <w:i w:val="false"/>
-                <w:iCs w:val="false"/>
-                <w:color w:val="0B0B0B"/>
-                <w:sz w:val="20"/>
-                <w:szCs w:val="20"/>
-              </w:rPr>
-              <w:t xml:space="preserve">Early months ramp up to a stable lead and tour count; contracts follow.</w:t>
-            </w:r>
-          </w:p>
-        </w:tc>
-      </w:tr>
-      <w:tr>
-        <w:tc>
-          <w:tcPr>
-            <w:tcW w:type="dxa" w:w="2600"/>
-            <w:tcBorders>
-              <w:top w:val="single" w:color="FFFFFF" w:sz="24"/>
-              <w:left w:val="single" w:color="FFFFFF" w:sz="24"/>
-              <w:bottom w:val="single" w:color="FFFFFF" w:sz="24"/>
-              <w:right w:val="single" w:color="FFFFFF" w:sz="24"/>
-            </w:tcBorders>
-            <w:shd w:fill="EFF6F9" w:color="auto" w:val="clear"/>
-            <w:tcMar>
-              <w:top w:type="dxa" w:w="60"/>
-              <w:left w:type="dxa" w:w="140"/>
-              <w:bottom w:type="dxa" w:w="60"/>
-              <w:right w:type="dxa" w:w="140"/>
-            </w:tcMar>
-          </w:tcPr>
-          <w:p>
-            <w:pPr>
-              <w:spacing w:after="0" w:before="0" w:line="264"/>
-              <w:jc w:val="left"/>
-            </w:pPr>
-            <w:r>
-              <w:rPr>
-                <w:rFonts w:ascii="Calibri" w:cs="Calibri" w:eastAsia="Calibri" w:hAnsi="Calibri"/>
-                <w:b/>
-                <w:bCs/>
-                <w:i w:val="false"/>
-                <w:iCs w:val="false"/>
-                <w:color w:val="1A939B"/>
-                <w:sz w:val="20"/>
-                <w:szCs w:val="20"/>
-              </w:rPr>
-              <w:t xml:space="preserve">Events by month</w:t>
-            </w:r>
-          </w:p>
-        </w:tc>
-        <w:tc>
-          <w:tcPr>
-            <w:tcW w:type="dxa" w:w="7912"/>
-            <w:tcBorders>
-              <w:top w:val="single" w:color="FFFFFF" w:sz="24"/>
-              <w:left w:val="single" w:color="FFFFFF" w:sz="24"/>
-              <w:bottom w:val="single" w:color="FFFFFF" w:sz="24"/>
-              <w:right w:val="single" w:color="FFFFFF" w:sz="24"/>
-            </w:tcBorders>
-            <w:shd w:fill="F7F7F5" w:color="auto" w:val="clear"/>
-            <w:tcMar>
-              <w:top w:type="dxa" w:w="60"/>
-              <w:left w:type="dxa" w:w="140"/>
-              <w:bottom w:type="dxa" w:w="60"/>
-              <w:right w:type="dxa" w:w="140"/>
-            </w:tcMar>
-          </w:tcPr>
-          <w:p>
-            <w:pPr>
-              <w:spacing w:after="0" w:before="0" w:line="264"/>
-              <w:jc w:val="left"/>
-            </w:pPr>
-            <w:r>
-              <w:rPr>
-                <w:rFonts w:ascii="Calibri" w:cs="Calibri" w:eastAsia="Calibri" w:hAnsi="Calibri"/>
-                <w:b w:val="false"/>
-                <w:bCs w:val="false"/>
-                <w:i w:val="false"/>
-                <w:iCs w:val="false"/>
-                <w:color w:val="0B0B0B"/>
-                <w:sz w:val="20"/>
-                <w:szCs w:val="20"/>
-              </w:rPr>
-              <w:t xml:space="preserve">OC events land in their booked month; new events fill the rest of the annual total.</w:t>
-            </w:r>
-          </w:p>
-        </w:tc>
-      </w:tr>
-      <w:tr>
-        <w:tc>
-          <w:tcPr>
-            <w:tcW w:type="dxa" w:w="2600"/>
-            <w:tcBorders>
-              <w:top w:val="single" w:color="FFFFFF" w:sz="24"/>
-              <w:left w:val="single" w:color="FFFFFF" w:sz="24"/>
-              <w:bottom w:val="single" w:color="FFFFFF" w:sz="24"/>
-              <w:right w:val="single" w:color="FFFFFF" w:sz="24"/>
-            </w:tcBorders>
-            <w:shd w:fill="EFF6F9" w:color="auto" w:val="clear"/>
-            <w:tcMar>
-              <w:top w:type="dxa" w:w="60"/>
-              <w:left w:type="dxa" w:w="140"/>
-              <w:bottom w:type="dxa" w:w="60"/>
-              <w:right w:type="dxa" w:w="140"/>
-            </w:tcMar>
-          </w:tcPr>
-          <w:p>
-            <w:pPr>
-              <w:spacing w:after="0" w:before="0" w:line="264"/>
-              <w:jc w:val="left"/>
-            </w:pPr>
-            <w:r>
-              <w:rPr>
-                <w:rFonts w:ascii="Calibri" w:cs="Calibri" w:eastAsia="Calibri" w:hAnsi="Calibri"/>
-                <w:b/>
-                <w:bCs/>
-                <w:i w:val="false"/>
-                <w:iCs w:val="false"/>
-                <w:color w:val="1A939B"/>
-                <w:sz w:val="20"/>
-                <w:szCs w:val="20"/>
-              </w:rPr>
-              <w:t xml:space="preserve">Attachment and $ / Event</w:t>
-            </w:r>
-          </w:p>
-        </w:tc>
-        <w:tc>
-          <w:tcPr>
-            <w:tcW w:type="dxa" w:w="7912"/>
-            <w:tcBorders>
-              <w:top w:val="single" w:color="FFFFFF" w:sz="24"/>
-              <w:left w:val="single" w:color="FFFFFF" w:sz="24"/>
-              <w:bottom w:val="single" w:color="FFFFFF" w:sz="24"/>
-              <w:right w:val="single" w:color="FFFFFF" w:sz="24"/>
-            </w:tcBorders>
-            <w:shd w:fill="F7F7F5" w:color="auto" w:val="clear"/>
-            <w:tcMar>
-              <w:top w:type="dxa" w:w="60"/>
-              <w:left w:type="dxa" w:w="140"/>
-              <w:bottom w:type="dxa" w:w="60"/>
-              <w:right w:type="dxa" w:w="140"/>
-            </w:tcMar>
-          </w:tcPr>
-          <w:p>
-            <w:pPr>
-              <w:spacing w:after="0" w:before="0" w:line="264"/>
-              <w:jc w:val="left"/>
-            </w:pPr>
-            <w:r>
-              <w:rPr>
-                <w:rFonts w:ascii="Calibri" w:cs="Calibri" w:eastAsia="Calibri" w:hAnsi="Calibri"/>
-                <w:b w:val="false"/>
-                <w:bCs w:val="false"/>
-                <w:i w:val="false"/>
-                <w:iCs w:val="false"/>
-                <w:color w:val="0B0B0B"/>
-                <w:sz w:val="20"/>
-                <w:szCs w:val="20"/>
-              </w:rPr>
-              <w:t xml:space="preserve">Applied directly by month; not split out from an annual total.</w:t>
-            </w:r>
-          </w:p>
-        </w:tc>
-      </w:tr>
-    </w:tbl>
     <w:sectPr>
       <w:pgSz w:w="12240" w:h="15840" w:orient="portrait"/>
       <w:pgMar w:top="864" w:right="864" w:bottom="864" w:left="864" w:header="708" w:footer="708" w:gutter="0"/>

</xml_diff>

<commit_message>
Pro forma sheet: smaller text in Part 2 graphics
Co-Authored-By: Claude Fable 5.1 <noreply@anthropic.com>

Claude-Session: https://claude.ai/code/session_01H1o2hAHLKnaHhCBRW9ndXv
</commit_message>
<xml_diff>
--- a/docs/proforma-cheatsheet/Pro Forma Sheet.docx
+++ b/docs/proforma-cheatsheet/Pro Forma Sheet.docx
@@ -2607,7 +2607,7 @@
       <w:r>
         <w:drawing>
           <wp:inline distT="0" distB="0" distL="0" distR="0">
-            <wp:extent cx="6038850" cy="1333500"/>
+            <wp:extent cx="5486400" cy="1209675"/>
             <wp:effectExtent t="0" r="0" b="0" l="0"/>
             <wp:docPr id="1" name="" descr="" title=""/>
             <wp:cNvGraphicFramePr>
@@ -2632,7 +2632,7 @@
                   <pic:spPr bwMode="auto">
                     <a:xfrm>
                       <a:off x="0" y="0"/>
-                      <a:ext cx="6038850" cy="1333500"/>
+                      <a:ext cx="5486400" cy="1209675"/>
                     </a:xfrm>
                     <a:prstGeom prst="rect">
                       <a:avLst/>
@@ -2675,7 +2675,7 @@
       <w:r>
         <w:drawing>
           <wp:inline distT="0" distB="0" distL="0" distR="0">
-            <wp:extent cx="6219825" cy="2762250"/>
+            <wp:extent cx="5667375" cy="2505075"/>
             <wp:effectExtent t="0" r="0" b="0" l="0"/>
             <wp:docPr id="1" name="" descr="" title=""/>
             <wp:cNvGraphicFramePr>
@@ -2700,7 +2700,7 @@
                   <pic:spPr bwMode="auto">
                     <a:xfrm>
                       <a:off x="0" y="0"/>
-                      <a:ext cx="6219825" cy="2762250"/>
+                      <a:ext cx="5667375" cy="2505075"/>
                     </a:xfrm>
                     <a:prstGeom prst="rect">
                       <a:avLst/>

</xml_diff>

<commit_message>
Pro forma sheet: section 6 down to Revenue and Expenses tiles
Co-Authored-By: Claude Fable 5.1 <noreply@anthropic.com>

Claude-Session: https://claude.ai/code/session_01H1o2hAHLKnaHhCBRW9ndXv
</commit_message>
<xml_diff>
--- a/docs/proforma-cheatsheet/Pro Forma Sheet.docx
+++ b/docs/proforma-cheatsheet/Pro Forma Sheet.docx
@@ -2243,14 +2243,13 @@
         </w:tblBorders>
       </w:tblPr>
       <w:tblGrid>
-        <w:gridCol w:w="3504"/>
-        <w:gridCol w:w="3504"/>
-        <w:gridCol w:w="3504"/>
+        <w:gridCol w:w="5256"/>
+        <w:gridCol w:w="5256"/>
       </w:tblGrid>
       <w:tr>
         <w:tc>
           <w:tcPr>
-            <w:tcW w:type="dxa" w:w="3504"/>
+            <w:tcW w:type="dxa" w:w="5256"/>
             <w:tcBorders>
               <w:top w:val="single" w:color="FFFFFF" w:sz="24"/>
               <w:left w:val="single" w:color="FFFFFF" w:sz="24"/>
@@ -2281,7 +2280,7 @@
                 <w:sz w:val="21"/>
                 <w:szCs w:val="21"/>
               </w:rPr>
-              <w:t xml:space="preserve">Employees</w:t>
+              <w:t xml:space="preserve">Revenue</w:t>
             </w:r>
           </w:p>
           <w:p>
@@ -2304,20 +2303,20 @@
                 <w:sz w:val="18"/>
                 <w:szCs w:val="18"/>
               </w:rPr>
-              <w:t xml:space="preserve">Role by role</w:t>
-            </w:r>
-            <w:r>
-              <w:rPr>
-                <w:rFonts w:ascii="Calibri" w:cs="Calibri" w:eastAsia="Calibri" w:hAnsi="Calibri"/>
-                <w:b w:val="false"/>
-                <w:bCs w:val="false"/>
-                <w:i w:val="false"/>
-                <w:iCs w:val="false"/>
-                <w:color w:val="0B0B0B"/>
-                <w:sz w:val="18"/>
-                <w:szCs w:val="18"/>
-              </w:rPr>
-              <w:t xml:space="preserve">: who stays, who we add, what each costs</w:t>
+              <w:t xml:space="preserve">Go-forward pricing</w:t>
+            </w:r>
+            <w:r>
+              <w:rPr>
+                <w:rFonts w:ascii="Calibri" w:cs="Calibri" w:eastAsia="Calibri" w:hAnsi="Calibri"/>
+                <w:b w:val="false"/>
+                <w:bCs w:val="false"/>
+                <w:i w:val="false"/>
+                <w:iCs w:val="false"/>
+                <w:color w:val="0B0B0B"/>
+                <w:sz w:val="18"/>
+                <w:szCs w:val="18"/>
+              </w:rPr>
+              <w:t xml:space="preserve"> for the venue and each vendor service</w:t>
             </w:r>
           </w:p>
           <w:p>
@@ -2340,26 +2339,26 @@
                 <w:sz w:val="18"/>
                 <w:szCs w:val="18"/>
               </w:rPr>
-              <w:t xml:space="preserve">Owner replacement</w:t>
-            </w:r>
-            <w:r>
-              <w:rPr>
-                <w:rFonts w:ascii="Calibri" w:cs="Calibri" w:eastAsia="Calibri" w:hAnsi="Calibri"/>
-                <w:b w:val="false"/>
-                <w:bCs w:val="false"/>
-                <w:i w:val="false"/>
-                <w:iCs w:val="false"/>
-                <w:color w:val="0B0B0B"/>
-                <w:sz w:val="18"/>
-                <w:szCs w:val="18"/>
-              </w:rPr>
-              <w:t xml:space="preserve"> if they step away</w:t>
+              <w:t xml:space="preserve">Go-live plans</w:t>
+            </w:r>
+            <w:r>
+              <w:rPr>
+                <w:rFonts w:ascii="Calibri" w:cs="Calibri" w:eastAsia="Calibri" w:hAnsi="Calibri"/>
+                <w:b w:val="false"/>
+                <w:bCs w:val="false"/>
+                <w:i w:val="false"/>
+                <w:iCs w:val="false"/>
+                <w:color w:val="0B0B0B"/>
+                <w:sz w:val="18"/>
+                <w:szCs w:val="18"/>
+              </w:rPr>
+              <w:t xml:space="preserve"> for each vendor service</w:t>
             </w:r>
           </w:p>
         </w:tc>
         <w:tc>
           <w:tcPr>
-            <w:tcW w:type="dxa" w:w="3504"/>
+            <w:tcW w:type="dxa" w:w="5256"/>
             <w:tcBorders>
               <w:top w:val="single" w:color="FFFFFF" w:sz="24"/>
               <w:left w:val="single" w:color="FFFFFF" w:sz="24"/>
@@ -2390,7 +2389,7 @@
                 <w:sz w:val="21"/>
                 <w:szCs w:val="21"/>
               </w:rPr>
-              <w:t xml:space="preserve">COGS and pricing</w:t>
+              <w:t xml:space="preserve">Expenses</w:t>
             </w:r>
           </w:p>
           <w:p>
@@ -2413,20 +2412,20 @@
                 <w:sz w:val="18"/>
                 <w:szCs w:val="18"/>
               </w:rPr>
-              <w:t xml:space="preserve">Lingering OC costs</w:t>
-            </w:r>
-            <w:r>
-              <w:rPr>
-                <w:rFonts w:ascii="Calibri" w:cs="Calibri" w:eastAsia="Calibri" w:hAnsi="Calibri"/>
-                <w:b w:val="false"/>
-                <w:bCs w:val="false"/>
-                <w:i w:val="false"/>
-                <w:iCs w:val="false"/>
-                <w:color w:val="0B0B0B"/>
-                <w:sz w:val="18"/>
-                <w:szCs w:val="18"/>
-              </w:rPr>
-              <w:t xml:space="preserve"> (e.g. a required caterer on booked events)</w:t>
+              <w:t xml:space="preserve">Payroll</w:t>
+            </w:r>
+            <w:r>
+              <w:rPr>
+                <w:rFonts w:ascii="Calibri" w:cs="Calibri" w:eastAsia="Calibri" w:hAnsi="Calibri"/>
+                <w:b w:val="false"/>
+                <w:bCs w:val="false"/>
+                <w:i w:val="false"/>
+                <w:iCs w:val="false"/>
+                <w:color w:val="0B0B0B"/>
+                <w:sz w:val="18"/>
+                <w:szCs w:val="18"/>
+              </w:rPr>
+              <w:t xml:space="preserve">: estimate costs by employee</w:t>
             </w:r>
           </w:p>
           <w:p>
@@ -2449,129 +2448,20 @@
                 <w:sz w:val="18"/>
                 <w:szCs w:val="18"/>
               </w:rPr>
-              <w:t xml:space="preserve">Go-forward pricing</w:t>
-            </w:r>
-            <w:r>
-              <w:rPr>
-                <w:rFonts w:ascii="Calibri" w:cs="Calibri" w:eastAsia="Calibri" w:hAnsi="Calibri"/>
-                <w:b w:val="false"/>
-                <w:bCs w:val="false"/>
-                <w:i w:val="false"/>
-                <w:iCs w:val="false"/>
-                <w:color w:val="0B0B0B"/>
-                <w:sz w:val="18"/>
-                <w:szCs w:val="18"/>
-              </w:rPr>
-              <w:t xml:space="preserve"> for the venue and each vendor service</w:t>
-            </w:r>
-          </w:p>
-        </w:tc>
-        <w:tc>
-          <w:tcPr>
-            <w:tcW w:type="dxa" w:w="3504"/>
-            <w:tcBorders>
-              <w:top w:val="single" w:color="FFFFFF" w:sz="24"/>
-              <w:left w:val="single" w:color="FFFFFF" w:sz="24"/>
-              <w:bottom w:val="single" w:color="FFFFFF" w:sz="24"/>
-              <w:right w:val="single" w:color="FFFFFF" w:sz="24"/>
-            </w:tcBorders>
-            <w:shd w:fill="EFF6F9" w:color="auto" w:val="clear"/>
-            <w:tcMar>
-              <w:top w:type="dxa" w:w="100"/>
-              <w:left w:type="dxa" w:w="140"/>
-              <w:bottom w:type="dxa" w:w="100"/>
-              <w:right w:type="dxa" w:w="140"/>
-            </w:tcMar>
-          </w:tcPr>
-          <w:p>
-            <w:pPr>
-              <w:spacing w:after="60" w:before="0" w:line="264"/>
-              <w:jc w:val="left"/>
-            </w:pPr>
-            <w:r>
-              <w:rPr>
-                <w:rFonts w:ascii="Calibri" w:cs="Calibri" w:eastAsia="Calibri" w:hAnsi="Calibri"/>
-                <w:b/>
-                <w:bCs/>
-                <w:i w:val="false"/>
-                <w:iCs w:val="false"/>
-                <w:color w:val="1A939B"/>
-                <w:sz w:val="21"/>
-                <w:szCs w:val="21"/>
-              </w:rPr>
-              <w:t xml:space="preserve">Vendor service timing</w:t>
-            </w:r>
-          </w:p>
-          <w:p>
-            <w:pPr>
-              <w:pStyle w:val="ListParagraph"/>
-              <w:numPr>
-                <w:ilvl w:val="0"/>
-                <w:numId w:val="2"/>
-              </w:numPr>
-              <w:spacing w:after="20" w:before="0" w:line="248"/>
-            </w:pPr>
-            <w:r>
-              <w:rPr>
-                <w:rFonts w:ascii="Calibri" w:cs="Calibri" w:eastAsia="Calibri" w:hAnsi="Calibri"/>
-                <w:b/>
-                <w:bCs/>
-                <w:i w:val="false"/>
-                <w:iCs w:val="false"/>
-                <w:color w:val="0B0B0B"/>
-                <w:sz w:val="18"/>
-                <w:szCs w:val="18"/>
-              </w:rPr>
-              <w:t xml:space="preserve">Attach timeline</w:t>
-            </w:r>
-            <w:r>
-              <w:rPr>
-                <w:rFonts w:ascii="Calibri" w:cs="Calibri" w:eastAsia="Calibri" w:hAnsi="Calibri"/>
-                <w:b w:val="false"/>
-                <w:bCs w:val="false"/>
-                <w:i w:val="false"/>
-                <w:iCs w:val="false"/>
-                <w:color w:val="0B0B0B"/>
-                <w:sz w:val="18"/>
-                <w:szCs w:val="18"/>
-              </w:rPr>
-              <w:t xml:space="preserve"> by service: license, hubs, hiring</w:t>
-            </w:r>
-          </w:p>
-          <w:p>
-            <w:pPr>
-              <w:pStyle w:val="ListParagraph"/>
-              <w:numPr>
-                <w:ilvl w:val="0"/>
-                <w:numId w:val="2"/>
-              </w:numPr>
-              <w:spacing w:after="20" w:before="0" w:line="248"/>
-            </w:pPr>
-            <w:r>
-              <w:rPr>
-                <w:rFonts w:ascii="Calibri" w:cs="Calibri" w:eastAsia="Calibri" w:hAnsi="Calibri"/>
-                <w:b/>
-                <w:bCs/>
-                <w:i w:val="false"/>
-                <w:iCs w:val="false"/>
-                <w:color w:val="0B0B0B"/>
-                <w:sz w:val="18"/>
-                <w:szCs w:val="18"/>
-              </w:rPr>
-              <w:t xml:space="preserve">Ramp by month</w:t>
-            </w:r>
-            <w:r>
-              <w:rPr>
-                <w:rFonts w:ascii="Calibri" w:cs="Calibri" w:eastAsia="Calibri" w:hAnsi="Calibri"/>
-                <w:b w:val="false"/>
-                <w:bCs w:val="false"/>
-                <w:i w:val="false"/>
-                <w:iCs w:val="false"/>
-                <w:color w:val="0B0B0B"/>
-                <w:sz w:val="18"/>
-                <w:szCs w:val="18"/>
-              </w:rPr>
-              <w:t xml:space="preserve"> instead of by year</w:t>
+              <w:t xml:space="preserve">COGS and OpEx</w:t>
+            </w:r>
+            <w:r>
+              <w:rPr>
+                <w:rFonts w:ascii="Calibri" w:cs="Calibri" w:eastAsia="Calibri" w:hAnsi="Calibri"/>
+                <w:b w:val="false"/>
+                <w:bCs w:val="false"/>
+                <w:i w:val="false"/>
+                <w:iCs w:val="false"/>
+                <w:color w:val="0B0B0B"/>
+                <w:sz w:val="18"/>
+                <w:szCs w:val="18"/>
+              </w:rPr>
+              <w:t xml:space="preserve">: more detail from what diligence collected</w:t>
             </w:r>
           </w:p>
         </w:tc>

</xml_diff>

<commit_message>
Pro forma sheet: point January callout at month 6, add intro sentences to sections 7 and 8
Co-Authored-By: Claude Fable 5.1 <noreply@anthropic.com>

Claude-Session: https://claude.ai/code/session_01H1o2hAHLKnaHhCBRW9ndXv
</commit_message>
<xml_diff>
--- a/docs/proforma-cheatsheet/Pro Forma Sheet.docx
+++ b/docs/proforma-cheatsheet/Pro Forma Sheet.docx
@@ -2491,6 +2491,25 @@
     </w:p>
     <w:p>
       <w:pPr>
+        <w:spacing w:after="40" w:before="0" w:line="264"/>
+        <w:jc w:val="left"/>
+      </w:pPr>
+      <w:r>
+        <w:rPr>
+          <w:rFonts w:ascii="Calibri" w:cs="Calibri" w:eastAsia="Calibri" w:hAnsi="Calibri"/>
+          <w:b w:val="false"/>
+          <w:bCs w:val="false"/>
+          <w:i w:val="false"/>
+          <w:iCs w:val="false"/>
+          <w:color w:val="52514E"/>
+          <w:sz w:val="19"/>
+          <w:szCs w:val="19"/>
+        </w:rPr>
+        <w:t xml:space="preserve">We start from the event counts and work backwards into estimated contracts, tours and leads using historical venue performance and Walters conversion rates, then work with Marketing and Sales to finalize what they feel is realistic.</w:t>
+      </w:r>
+    </w:p>
+    <w:p>
+      <w:pPr>
         <w:spacing w:after="30" w:before="30"/>
         <w:jc w:val="center"/>
       </w:pPr>
@@ -2555,6 +2574,25 @@
           <w:szCs w:val="30"/>
         </w:rPr>
         <w:t xml:space="preserve">8. Monthly build</w:t>
+      </w:r>
+    </w:p>
+    <w:p>
+      <w:pPr>
+        <w:spacing w:after="40" w:before="0" w:line="264"/>
+        <w:jc w:val="left"/>
+      </w:pPr>
+      <w:r>
+        <w:rPr>
+          <w:rFonts w:ascii="Calibri" w:cs="Calibri" w:eastAsia="Calibri" w:hAnsi="Calibri"/>
+          <w:b w:val="false"/>
+          <w:bCs w:val="false"/>
+          <w:i w:val="false"/>
+          <w:iCs w:val="false"/>
+          <w:color w:val="52514E"/>
+          <w:sz w:val="19"/>
+          <w:szCs w:val="19"/>
+        </w:rPr>
+        <w:t xml:space="preserve">We take the annual figures and use seasonality plus a slow ramp-up over the first ~6 months to spread the marketing funnel, events and financials across the months.</w:t>
       </w:r>
     </w:p>
     <w:p>

</xml_diff>